<commit_message>
Punto 1 Informe 2
</commit_message>
<xml_diff>
--- a/Informe P2/P2.docx
+++ b/Informe P2/P2.docx
@@ -1261,7 +1261,7 @@
       </w:r>
       <w:proofErr w:type="spellEnd"/>
       <w:r>
-        <w:t xml:space="preserve">. Como se observa en la captura 1.PNG, el sistema lee la lista de paquetes y nos informa de aquellos que pueden ser actualizados.   </w:t>
+        <w:t xml:space="preserve">. </w:t>
       </w:r>
     </w:p>
     <w:p>
@@ -1323,66 +1323,83 @@
         </w:drawing>
       </w:r>
     </w:p>
+    <w:bookmarkEnd w:id="3"/>
     <w:p>
       <w:pPr>
         <w:spacing w:before="240"/>
         <w:ind w:left="0"/>
-      </w:pPr>
-      <w:r>
-        <w:t xml:space="preserve">A continuación, instalamos </w:t>
+        <w:rPr>
+          <w:lang w:val="es-ES"/>
+        </w:rPr>
+      </w:pPr>
+      <w:r>
+        <w:rPr>
+          <w:lang w:val="es-ES"/>
+        </w:rPr>
+        <w:t xml:space="preserve">A continuación, procedemos a instalar el servidor web ejecutando el comando sudo </w:t>
       </w:r>
       <w:proofErr w:type="spellStart"/>
       <w:r>
-        <w:t>Nginx</w:t>
+        <w:rPr>
+          <w:lang w:val="es-ES"/>
+        </w:rPr>
+        <w:t>apt</w:t>
       </w:r>
       <w:proofErr w:type="spellEnd"/>
       <w:r>
-        <w:t xml:space="preserve"> ejecutando sudo </w:t>
+        <w:rPr>
+          <w:lang w:val="es-ES"/>
+        </w:rPr>
+        <w:t xml:space="preserve"> </w:t>
       </w:r>
       <w:proofErr w:type="spellStart"/>
       <w:r>
-        <w:t>apt</w:t>
+        <w:rPr>
+          <w:lang w:val="es-ES"/>
+        </w:rPr>
+        <w:t>install</w:t>
       </w:r>
       <w:proofErr w:type="spellEnd"/>
       <w:r>
+        <w:rPr>
+          <w:lang w:val="es-ES"/>
+        </w:rPr>
         <w:t xml:space="preserve"> </w:t>
       </w:r>
       <w:proofErr w:type="spellStart"/>
       <w:r>
-        <w:t>install</w:t>
+        <w:rPr>
+          <w:lang w:val="es-ES"/>
+        </w:rPr>
+        <w:t>nginx</w:t>
       </w:r>
       <w:proofErr w:type="spellEnd"/>
       <w:r>
-        <w:t xml:space="preserve"> </w:t>
+        <w:rPr>
+          <w:lang w:val="es-ES"/>
+        </w:rPr>
+        <w:t xml:space="preserve">. Durante este proceso, el gestor de paquetes resuelve las dependencias necesarias (como </w:t>
       </w:r>
       <w:proofErr w:type="spellStart"/>
       <w:r>
-        <w:t>nginx</w:t>
+        <w:rPr>
+          <w:lang w:val="es-ES"/>
+        </w:rPr>
+        <w:t>nginx-common</w:t>
       </w:r>
       <w:proofErr w:type="spellEnd"/>
       <w:r>
-        <w:t xml:space="preserve">. Durante este proceso, el gestor de paquetes nos informa del espacio adicional que se utilizará y procede con la descarga e instalación de </w:t>
-      </w:r>
-      <w:proofErr w:type="spellStart"/>
-      <w:r>
-        <w:t>nginx</w:t>
-      </w:r>
-      <w:proofErr w:type="spellEnd"/>
-      <w:r>
-        <w:t xml:space="preserve"> y sus dependencias (como </w:t>
-      </w:r>
-      <w:proofErr w:type="spellStart"/>
-      <w:r>
-        <w:t>nginx-common</w:t>
-      </w:r>
-      <w:proofErr w:type="spellEnd"/>
-      <w:r>
-        <w:t>), creando los enlaces simbólicos necesarios para que el servicio arranque con el sistema, tal y como se muestra en la captura 2.PNG.</w:t>
-      </w:r>
-      <w:r>
-        <w:t>Paso 2: Creación y configuración de la máquina Server</w:t>
-      </w:r>
-      <w:bookmarkEnd w:id="3"/>
+        <w:rPr>
+          <w:lang w:val="es-ES"/>
+        </w:rPr>
+        <w:t>), descarga los archivos y crea automáticamente los enlaces simbólicos para que el servicio arranque junto con el sistema</w:t>
+      </w:r>
+      <w:r>
+        <w:rPr>
+          <w:lang w:val="es-ES"/>
+        </w:rPr>
+        <w:t>.</w:t>
+      </w:r>
     </w:p>
     <w:p>
       <w:pPr>
@@ -1460,24 +1477,13 @@
         <w:t>2</w:t>
       </w:r>
       <w:r>
-        <w:t>:</w:t>
-      </w:r>
-      <w:r>
-        <w:rPr>
-          <w:rFonts w:ascii="Montserrat" w:eastAsia="Montserrat" w:hAnsi="Montserrat" w:cs="Montserrat"/>
-          <w:kern w:val="0"/>
-          <w:sz w:val="20"/>
-          <w:szCs w:val="20"/>
-          <w:lang w:val="es" w:eastAsia="es-ES"/>
-          <w14:ligatures w14:val="none"/>
-        </w:rPr>
-        <w:t xml:space="preserve"> </w:t>
+        <w:t xml:space="preserve">: </w:t>
       </w:r>
       <w:r>
         <w:rPr>
           <w:lang w:val="es"/>
         </w:rPr>
-        <w:t xml:space="preserve">Comprobación del funcionamiento de </w:t>
+        <w:t xml:space="preserve">Configuración de </w:t>
       </w:r>
       <w:proofErr w:type="spellStart"/>
       <w:r>
@@ -1487,41 +1493,114 @@
         <w:t>Nginx</w:t>
       </w:r>
       <w:proofErr w:type="spellEnd"/>
-    </w:p>
-    <w:p>
-      <w:pPr>
-        <w:spacing w:before="240"/>
-        <w:ind w:left="0"/>
-      </w:pPr>
-      <w:r>
-        <w:t xml:space="preserve">Una vez finalizada la instalación, verificamos que el servidor web está levantado y respondiendo peticiones. Para ello, lanzamos una petición HTTP local a la máquina utilizando el comando </w:t>
-      </w:r>
-      <w:proofErr w:type="spellStart"/>
-      <w:r>
-        <w:t>curl</w:t>
-      </w:r>
-      <w:proofErr w:type="spellEnd"/>
-      <w:r>
-        <w:t xml:space="preserve"> -I 127.0.0.1. La captura 3.png confirma que recibimos un </w:t>
-      </w:r>
-      <w:r>
-        <w:lastRenderedPageBreak/>
-        <w:t xml:space="preserve">código de estado HTTP/1.1 200 OK por parte del servidor </w:t>
-      </w:r>
-      <w:proofErr w:type="spellStart"/>
-      <w:r>
-        <w:t>nginx</w:t>
-      </w:r>
-      <w:proofErr w:type="spellEnd"/>
-      <w:r>
-        <w:t xml:space="preserve">/1.22.1, lo que indica que el servicio está funcionando correctamente. </w:t>
+      <w:r>
+        <w:rPr>
+          <w:lang w:val="es"/>
+        </w:rPr>
+        <w:t xml:space="preserve"> como Proxy Inverso</w:t>
       </w:r>
     </w:p>
     <w:p>
       <w:pPr>
         <w:spacing w:after="160" w:line="259" w:lineRule="auto"/>
         <w:ind w:left="0"/>
-        <w:jc w:val="center"/>
+        <w:rPr>
+          <w:lang w:val="es-ES"/>
+        </w:rPr>
+      </w:pPr>
+      <w:r>
+        <w:rPr>
+          <w:lang w:val="es-ES"/>
+        </w:rPr>
+        <w:t xml:space="preserve">El siguiente paso consiste en modificar la configuración de </w:t>
+      </w:r>
+      <w:proofErr w:type="spellStart"/>
+      <w:r>
+        <w:rPr>
+          <w:lang w:val="es-ES"/>
+        </w:rPr>
+        <w:t>Nginx</w:t>
+      </w:r>
+      <w:proofErr w:type="spellEnd"/>
+      <w:r>
+        <w:rPr>
+          <w:lang w:val="es-ES"/>
+        </w:rPr>
+        <w:t xml:space="preserve"> para que redirija el tráfico entrante hacia nuestro servidor de </w:t>
+      </w:r>
+      <w:proofErr w:type="spellStart"/>
+      <w:r>
+        <w:rPr>
+          <w:lang w:val="es-ES"/>
+        </w:rPr>
+        <w:t>backend</w:t>
+      </w:r>
+      <w:proofErr w:type="spellEnd"/>
+      <w:r>
+        <w:rPr>
+          <w:lang w:val="es-ES"/>
+        </w:rPr>
+        <w:t>. Para ello, utilizamos el editor de texto nano con privilegios de administrador para abrir el archivo de configuración por defecto ejecutando sudo nano /</w:t>
+      </w:r>
+      <w:proofErr w:type="spellStart"/>
+      <w:r>
+        <w:rPr>
+          <w:lang w:val="es-ES"/>
+        </w:rPr>
+        <w:t>etc</w:t>
+      </w:r>
+      <w:proofErr w:type="spellEnd"/>
+      <w:r>
+        <w:rPr>
+          <w:lang w:val="es-ES"/>
+        </w:rPr>
+        <w:t>/</w:t>
+      </w:r>
+      <w:proofErr w:type="spellStart"/>
+      <w:r>
+        <w:rPr>
+          <w:lang w:val="es-ES"/>
+        </w:rPr>
+        <w:t>nginx</w:t>
+      </w:r>
+      <w:proofErr w:type="spellEnd"/>
+      <w:r>
+        <w:rPr>
+          <w:lang w:val="es-ES"/>
+        </w:rPr>
+        <w:t>/sites-</w:t>
+      </w:r>
+      <w:proofErr w:type="spellStart"/>
+      <w:r>
+        <w:rPr>
+          <w:lang w:val="es-ES"/>
+        </w:rPr>
+        <w:t>available</w:t>
+      </w:r>
+      <w:proofErr w:type="spellEnd"/>
+      <w:r>
+        <w:rPr>
+          <w:lang w:val="es-ES"/>
+        </w:rPr>
+        <w:t>/default</w:t>
+      </w:r>
+      <w:r>
+        <w:rPr>
+          <w:lang w:val="es-ES"/>
+        </w:rPr>
+        <w:t>.</w:t>
+      </w:r>
+      <w:r>
+        <w:rPr>
+          <w:lang w:val="es-ES"/>
+        </w:rPr>
+        <w:t xml:space="preserve"> </w:t>
+      </w:r>
+    </w:p>
+    <w:p>
+      <w:pPr>
+        <w:spacing w:after="160" w:line="259" w:lineRule="auto"/>
+        <w:ind w:left="0"/>
         <w:rPr>
           <w:lang w:val="es-ES"/>
         </w:rPr>
@@ -1531,10 +1610,10 @@
           <w:noProof/>
         </w:rPr>
         <w:drawing>
-          <wp:inline distT="0" distB="0" distL="0" distR="0" wp14:anchorId="21DFDAB9" wp14:editId="23D6A641">
-            <wp:extent cx="3513455" cy="1921510"/>
-            <wp:effectExtent l="0" t="0" r="0" b="2540"/>
-            <wp:docPr id="1" name="Imagen 1"/>
+          <wp:inline distT="0" distB="0" distL="0" distR="0" wp14:anchorId="2B7104A3" wp14:editId="073403E3">
+            <wp:extent cx="5394960" cy="144780"/>
+            <wp:effectExtent l="0" t="0" r="0" b="7620"/>
+            <wp:docPr id="10" name="Imagen 10"/>
             <wp:cNvGraphicFramePr>
               <a:graphicFrameLocks xmlns:a="http://schemas.openxmlformats.org/drawingml/2006/main" noChangeAspect="1"/>
             </wp:cNvGraphicFramePr>
@@ -1563,7 +1642,7 @@
                   <pic:spPr bwMode="auto">
                     <a:xfrm>
                       <a:off x="0" y="0"/>
-                      <a:ext cx="3513455" cy="1921510"/>
+                      <a:ext cx="5394960" cy="144780"/>
                     </a:xfrm>
                     <a:prstGeom prst="rect">
                       <a:avLst/>
@@ -1582,93 +1661,6 @@
     </w:p>
     <w:p>
       <w:pPr>
-        <w:pStyle w:val="Ttulo2"/>
-        <w:ind w:left="0"/>
-      </w:pPr>
-      <w:r>
-        <w:t xml:space="preserve">Paso </w:t>
-      </w:r>
-      <w:r>
-        <w:t>3</w:t>
-      </w:r>
-      <w:r>
-        <w:t>:</w:t>
-      </w:r>
-      <w:r>
-        <w:rPr>
-          <w:rFonts w:ascii="Montserrat" w:eastAsia="Montserrat" w:hAnsi="Montserrat" w:cs="Montserrat"/>
-          <w:kern w:val="0"/>
-          <w:sz w:val="20"/>
-          <w:szCs w:val="20"/>
-          <w:lang w:val="es" w:eastAsia="es-ES"/>
-          <w14:ligatures w14:val="none"/>
-        </w:rPr>
-        <w:t xml:space="preserve"> </w:t>
-      </w:r>
-      <w:r>
-        <w:rPr>
-          <w:lang w:val="es"/>
-        </w:rPr>
-        <w:t>Configuración del cortafuegos (</w:t>
-      </w:r>
-      <w:proofErr w:type="spellStart"/>
-      <w:r>
-        <w:rPr>
-          <w:lang w:val="es"/>
-        </w:rPr>
-        <w:t>iptables</w:t>
-      </w:r>
-      <w:proofErr w:type="spellEnd"/>
-      <w:r>
-        <w:rPr>
-          <w:lang w:val="es"/>
-        </w:rPr>
-        <w:t>)</w:t>
-      </w:r>
-    </w:p>
-    <w:p>
-      <w:pPr>
-        <w:spacing w:before="240"/>
-        <w:ind w:left="0"/>
-      </w:pPr>
-      <w:r>
-        <w:t xml:space="preserve">Para permitir que </w:t>
-      </w:r>
-      <w:proofErr w:type="spellStart"/>
-      <w:r>
-        <w:t>Nginx</w:t>
-      </w:r>
-      <w:proofErr w:type="spellEnd"/>
-      <w:r>
-        <w:t xml:space="preserve"> reciba tráfico web desde el exterior, debemos habilitar el puerto HTTP estándar en el cortafuegos. Ejecutamos el comando sudo </w:t>
-      </w:r>
-      <w:proofErr w:type="spellStart"/>
-      <w:r>
-        <w:t>iptables</w:t>
-      </w:r>
-      <w:proofErr w:type="spellEnd"/>
-      <w:r>
-        <w:t xml:space="preserve"> -A INPUT -p </w:t>
-      </w:r>
-      <w:proofErr w:type="spellStart"/>
-      <w:r>
-        <w:t>tcp</w:t>
-      </w:r>
-      <w:proofErr w:type="spellEnd"/>
-      <w:r>
-        <w:t xml:space="preserve"> --</w:t>
-      </w:r>
-      <w:proofErr w:type="spellStart"/>
-      <w:r>
-        <w:t>dport</w:t>
-      </w:r>
-      <w:proofErr w:type="spellEnd"/>
-      <w:r>
-        <w:t xml:space="preserve"> 80 -j ACCEPT para añadir una regla que acepte las conexiones entrantes (INPUT) a través del protocolo TCP en el puerto 80, tal y como se refleja en la captura 4.png.</w:t>
-      </w:r>
-    </w:p>
-    <w:p>
-      <w:pPr>
         <w:spacing w:after="160" w:line="259" w:lineRule="auto"/>
         <w:ind w:left="0"/>
         <w:rPr>
@@ -1677,13 +1669,228 @@
       </w:pPr>
       <w:r>
         <w:rPr>
+          <w:lang w:val="es-ES"/>
+        </w:rPr>
+        <w:t xml:space="preserve">Dentro de este archivo, editamos el bloque server que escucha en el puerto 80. Específicamente, configuramos la directiva </w:t>
+      </w:r>
+      <w:proofErr w:type="spellStart"/>
+      <w:r>
+        <w:rPr>
+          <w:lang w:val="es-ES"/>
+        </w:rPr>
+        <w:t>location</w:t>
+      </w:r>
+      <w:proofErr w:type="spellEnd"/>
+      <w:r>
+        <w:rPr>
+          <w:lang w:val="es-ES"/>
+        </w:rPr>
+        <w:t xml:space="preserve"> / para establecer el proxy inverso con los siguientes parámetros: </w:t>
+      </w:r>
+    </w:p>
+    <w:p>
+      <w:pPr>
+        <w:numPr>
+          <w:ilvl w:val="0"/>
+          <w:numId w:val="18"/>
+        </w:numPr>
+        <w:spacing w:after="160" w:line="259" w:lineRule="auto"/>
+        <w:rPr>
+          <w:lang w:val="es-ES"/>
+        </w:rPr>
+      </w:pPr>
+      <w:proofErr w:type="spellStart"/>
+      <w:r>
+        <w:rPr>
+          <w:lang w:val="es-ES"/>
+        </w:rPr>
+        <w:t>proxy_pass</w:t>
+      </w:r>
+      <w:proofErr w:type="spellEnd"/>
+      <w:r>
+        <w:rPr>
+          <w:lang w:val="es-ES"/>
+        </w:rPr>
+        <w:t xml:space="preserve"> http://172.16.156.1:3000 </w:t>
+      </w:r>
+      <w:r>
+        <w:rPr>
+          <w:lang w:val="es-ES"/>
+        </w:rPr>
+        <w:t xml:space="preserve">-&gt; </w:t>
+      </w:r>
+      <w:r>
+        <w:rPr>
+          <w:lang w:val="es-ES"/>
+        </w:rPr>
+        <w:t xml:space="preserve">Redirige todas las peticiones entrantes a la dirección IP de nuestra máquina </w:t>
+      </w:r>
+      <w:proofErr w:type="spellStart"/>
+      <w:r>
+        <w:rPr>
+          <w:lang w:val="es-ES"/>
+        </w:rPr>
+        <w:t>backend</w:t>
+      </w:r>
+      <w:proofErr w:type="spellEnd"/>
+      <w:r>
+        <w:rPr>
+          <w:lang w:val="es-ES"/>
+        </w:rPr>
+        <w:t xml:space="preserve"> (172.16.156.1) por el puerto 3000. </w:t>
+      </w:r>
+    </w:p>
+    <w:p>
+      <w:pPr>
+        <w:numPr>
+          <w:ilvl w:val="0"/>
+          <w:numId w:val="18"/>
+        </w:numPr>
+        <w:spacing w:after="160" w:line="259" w:lineRule="auto"/>
+        <w:rPr>
+          <w:lang w:val="es-ES"/>
+        </w:rPr>
+      </w:pPr>
+      <w:proofErr w:type="spellStart"/>
+      <w:r>
+        <w:rPr>
+          <w:lang w:val="es-ES"/>
+        </w:rPr>
+        <w:t>proxy_http_version</w:t>
+      </w:r>
+      <w:proofErr w:type="spellEnd"/>
+      <w:r>
+        <w:rPr>
+          <w:lang w:val="es-ES"/>
+        </w:rPr>
+        <w:t xml:space="preserve"> 1.1</w:t>
+      </w:r>
+      <w:r>
+        <w:rPr>
+          <w:lang w:val="es-ES"/>
+        </w:rPr>
+        <w:t xml:space="preserve"> -&gt;</w:t>
+      </w:r>
+      <w:r>
+        <w:rPr>
+          <w:lang w:val="es-ES"/>
+        </w:rPr>
+        <w:t xml:space="preserve"> Define la versión del protocolo HTTP. </w:t>
+      </w:r>
+    </w:p>
+    <w:p>
+      <w:pPr>
+        <w:numPr>
+          <w:ilvl w:val="0"/>
+          <w:numId w:val="18"/>
+        </w:numPr>
+        <w:spacing w:after="160" w:line="259" w:lineRule="auto"/>
+        <w:rPr>
+          <w:lang w:val="es-ES"/>
+        </w:rPr>
+      </w:pPr>
+      <w:r>
+        <w:rPr>
+          <w:lang w:val="es-ES"/>
+        </w:rPr>
+        <w:t xml:space="preserve">Cabeceras </w:t>
+      </w:r>
+      <w:proofErr w:type="spellStart"/>
+      <w:r>
+        <w:rPr>
+          <w:lang w:val="es-ES"/>
+        </w:rPr>
+        <w:t>proxy_set_header</w:t>
+      </w:r>
+      <w:proofErr w:type="spellEnd"/>
+      <w:r>
+        <w:rPr>
+          <w:lang w:val="es-ES"/>
+        </w:rPr>
+        <w:t xml:space="preserve"> -&gt;</w:t>
+      </w:r>
+      <w:r>
+        <w:rPr>
+          <w:lang w:val="es-ES"/>
+        </w:rPr>
+        <w:t xml:space="preserve"> Configuramos cabeceras adicionales como Host, X-Real-IP, X-</w:t>
+      </w:r>
+      <w:proofErr w:type="spellStart"/>
+      <w:r>
+        <w:rPr>
+          <w:lang w:val="es-ES"/>
+        </w:rPr>
+        <w:t>Forwarded</w:t>
+      </w:r>
+      <w:proofErr w:type="spellEnd"/>
+      <w:r>
+        <w:rPr>
+          <w:lang w:val="es-ES"/>
+        </w:rPr>
+        <w:t>-</w:t>
+      </w:r>
+      <w:proofErr w:type="spellStart"/>
+      <w:r>
+        <w:rPr>
+          <w:lang w:val="es-ES"/>
+        </w:rPr>
+        <w:t>For</w:t>
+      </w:r>
+      <w:proofErr w:type="spellEnd"/>
+      <w:r>
+        <w:rPr>
+          <w:lang w:val="es-ES"/>
+        </w:rPr>
+        <w:t xml:space="preserve"> y X-</w:t>
+      </w:r>
+      <w:proofErr w:type="spellStart"/>
+      <w:r>
+        <w:rPr>
+          <w:lang w:val="es-ES"/>
+        </w:rPr>
+        <w:t>Forwarded</w:t>
+      </w:r>
+      <w:proofErr w:type="spellEnd"/>
+      <w:r>
+        <w:rPr>
+          <w:lang w:val="es-ES"/>
+        </w:rPr>
+        <w:t xml:space="preserve">-Proto para transferir correctamente la información de la IP y la petición original del cliente hacia el </w:t>
+      </w:r>
+      <w:proofErr w:type="spellStart"/>
+      <w:r>
+        <w:rPr>
+          <w:lang w:val="es-ES"/>
+        </w:rPr>
+        <w:t>backend</w:t>
+      </w:r>
+      <w:proofErr w:type="spellEnd"/>
+      <w:r>
+        <w:rPr>
+          <w:lang w:val="es-ES"/>
+        </w:rPr>
+        <w:t xml:space="preserve">. </w:t>
+      </w:r>
+    </w:p>
+    <w:p>
+      <w:pPr>
+        <w:spacing w:after="160" w:line="259" w:lineRule="auto"/>
+        <w:ind w:left="0"/>
+        <w:jc w:val="center"/>
+        <w:rPr>
+          <w:lang w:val="es-ES"/>
+        </w:rPr>
+      </w:pPr>
+      <w:r>
+        <w:rPr>
           <w:noProof/>
+          <w:lang w:val="es-ES"/>
         </w:rPr>
         <w:drawing>
-          <wp:inline distT="0" distB="0" distL="0" distR="0" wp14:anchorId="678D2549" wp14:editId="2CDC4EFE">
-            <wp:extent cx="5260340" cy="236220"/>
-            <wp:effectExtent l="0" t="0" r="0" b="0"/>
-            <wp:docPr id="5" name="Imagen 5"/>
+          <wp:inline distT="0" distB="0" distL="0" distR="0" wp14:anchorId="0DF751AF" wp14:editId="4DFDD2B7">
+            <wp:extent cx="4632960" cy="1694826"/>
+            <wp:effectExtent l="0" t="0" r="0" b="635"/>
+            <wp:docPr id="11" name="Imagen 11"/>
             <wp:cNvGraphicFramePr>
               <a:graphicFrameLocks xmlns:a="http://schemas.openxmlformats.org/drawingml/2006/main" noChangeAspect="1"/>
             </wp:cNvGraphicFramePr>
@@ -1712,7 +1919,7 @@
                   <pic:spPr bwMode="auto">
                     <a:xfrm>
                       <a:off x="0" y="0"/>
-                      <a:ext cx="5260340" cy="236220"/>
+                      <a:ext cx="4648276" cy="1700429"/>
                     </a:xfrm>
                     <a:prstGeom prst="rect">
                       <a:avLst/>
@@ -1741,7 +1948,7 @@
         <w:t xml:space="preserve">Paso </w:t>
       </w:r>
       <w:r>
-        <w:t>4</w:t>
+        <w:t>3</w:t>
       </w:r>
       <w:r>
         <w:t>:</w:t>
@@ -1761,21 +1968,7 @@
         <w:rPr>
           <w:lang w:val="es"/>
         </w:rPr>
-        <w:t xml:space="preserve">Configuración de </w:t>
-      </w:r>
-      <w:proofErr w:type="spellStart"/>
-      <w:r>
-        <w:rPr>
-          <w:lang w:val="es"/>
-        </w:rPr>
-        <w:t>Nginx</w:t>
-      </w:r>
-      <w:proofErr w:type="spellEnd"/>
-      <w:r>
-        <w:rPr>
-          <w:lang w:val="es"/>
-        </w:rPr>
-        <w:t xml:space="preserve"> como Proxy Inverso</w:t>
+        <w:t>Verificación de sintaxis y reinicio del servicio</w:t>
       </w:r>
     </w:p>
     <w:p>
@@ -1787,39 +1980,116 @@
         </w:rPr>
       </w:pPr>
       <w:r>
-        <w:t xml:space="preserve">El siguiente paso es modificar el archivo de configuración por defecto de </w:t>
+        <w:rPr>
+          <w:lang w:val="es-ES"/>
+        </w:rPr>
+        <w:t xml:space="preserve">Tras guardar los cambios en el archivo de configuración, </w:t>
+      </w:r>
+      <w:r>
+        <w:rPr>
+          <w:lang w:val="es-ES"/>
+        </w:rPr>
+        <w:t>comprobamos</w:t>
+      </w:r>
+      <w:r>
+        <w:rPr>
+          <w:lang w:val="es-ES"/>
+        </w:rPr>
+        <w:t xml:space="preserve"> que no hemos </w:t>
+      </w:r>
+      <w:r>
+        <w:rPr>
+          <w:lang w:val="es-ES"/>
+        </w:rPr>
+        <w:t>cometido</w:t>
+      </w:r>
+      <w:r>
+        <w:rPr>
+          <w:lang w:val="es-ES"/>
+        </w:rPr>
+        <w:t xml:space="preserve"> errores. Ejecutamos el comando sudo </w:t>
       </w:r>
       <w:proofErr w:type="spellStart"/>
       <w:r>
-        <w:t>Nginx</w:t>
+        <w:rPr>
+          <w:lang w:val="es-ES"/>
+        </w:rPr>
+        <w:t>nginx</w:t>
       </w:r>
       <w:proofErr w:type="spellEnd"/>
       <w:r>
-        <w:t xml:space="preserve"> para redirigir el tráfico hacia nuestro servidor de aplicaciones. Utilizamos el editor de texto nano con privilegios de administrador mediante el comando sudo nano /</w:t>
+        <w:rPr>
+          <w:lang w:val="es-ES"/>
+        </w:rPr>
+        <w:t xml:space="preserve"> -t</w:t>
+      </w:r>
+      <w:r>
+        <w:rPr>
+          <w:lang w:val="es-ES"/>
+        </w:rPr>
+        <w:t xml:space="preserve"> y </w:t>
+      </w:r>
+      <w:r>
+        <w:rPr>
+          <w:lang w:val="es-ES"/>
+        </w:rPr>
+        <w:t>la salida nos confirma que la sintaxis es correcta (</w:t>
       </w:r>
       <w:proofErr w:type="spellStart"/>
       <w:r>
-        <w:t>etc</w:t>
+        <w:rPr>
+          <w:lang w:val="es-ES"/>
+        </w:rPr>
+        <w:t>syntax</w:t>
       </w:r>
       <w:proofErr w:type="spellEnd"/>
       <w:r>
-        <w:t>/</w:t>
+        <w:rPr>
+          <w:lang w:val="es-ES"/>
+        </w:rPr>
+        <w:t xml:space="preserve"> </w:t>
       </w:r>
       <w:proofErr w:type="spellStart"/>
       <w:r>
-        <w:t>nginx</w:t>
+        <w:rPr>
+          <w:lang w:val="es-ES"/>
+        </w:rPr>
+        <w:t>is</w:t>
       </w:r>
       <w:proofErr w:type="spellEnd"/>
       <w:r>
-        <w:t>/sites-</w:t>
+        <w:rPr>
+          <w:lang w:val="es-ES"/>
+        </w:rPr>
+        <w:t xml:space="preserve"> ok) y que la prueba ha sido exitosa (test </w:t>
       </w:r>
       <w:proofErr w:type="spellStart"/>
       <w:r>
-        <w:t>available</w:t>
+        <w:rPr>
+          <w:lang w:val="es-ES"/>
+        </w:rPr>
+        <w:t>is</w:t>
       </w:r>
       <w:proofErr w:type="spellEnd"/>
       <w:r>
-        <w:t>/default (captura 5.png).</w:t>
+        <w:rPr>
+          <w:lang w:val="es-ES"/>
+        </w:rPr>
+        <w:t xml:space="preserve"> </w:t>
+      </w:r>
+      <w:proofErr w:type="spellStart"/>
+      <w:r>
+        <w:rPr>
+          <w:lang w:val="es-ES"/>
+        </w:rPr>
+        <w:t>successful</w:t>
+      </w:r>
+      <w:proofErr w:type="spellEnd"/>
+      <w:r>
+        <w:rPr>
+          <w:lang w:val="es-ES"/>
+        </w:rPr>
+        <w:t xml:space="preserve">). </w:t>
       </w:r>
     </w:p>
     <w:p>
@@ -1832,14 +2102,85 @@
       </w:pPr>
       <w:r>
         <w:rPr>
+          <w:lang w:val="es-ES"/>
+        </w:rPr>
+        <w:t xml:space="preserve">Finalmente, aplicamos la nueva configuración reiniciando el servicio de </w:t>
+      </w:r>
+      <w:proofErr w:type="spellStart"/>
+      <w:r>
+        <w:rPr>
+          <w:lang w:val="es-ES"/>
+        </w:rPr>
+        <w:t>Nginx</w:t>
+      </w:r>
+      <w:proofErr w:type="spellEnd"/>
+      <w:r>
+        <w:rPr>
+          <w:lang w:val="es-ES"/>
+        </w:rPr>
+        <w:t xml:space="preserve"> mediante el comando sudo </w:t>
+      </w:r>
+      <w:proofErr w:type="spellStart"/>
+      <w:r>
+        <w:rPr>
+          <w:lang w:val="es-ES"/>
+        </w:rPr>
+        <w:t>systemctl</w:t>
+      </w:r>
+      <w:proofErr w:type="spellEnd"/>
+      <w:r>
+        <w:rPr>
+          <w:lang w:val="es-ES"/>
+        </w:rPr>
+        <w:t xml:space="preserve"> </w:t>
+      </w:r>
+      <w:proofErr w:type="spellStart"/>
+      <w:r>
+        <w:rPr>
+          <w:lang w:val="es-ES"/>
+        </w:rPr>
+        <w:t>restart</w:t>
+      </w:r>
+      <w:proofErr w:type="spellEnd"/>
+      <w:r>
+        <w:rPr>
+          <w:lang w:val="es-ES"/>
+        </w:rPr>
+        <w:t xml:space="preserve"> </w:t>
+      </w:r>
+      <w:proofErr w:type="spellStart"/>
+      <w:r>
+        <w:rPr>
+          <w:lang w:val="es-ES"/>
+        </w:rPr>
+        <w:t>nginx</w:t>
+      </w:r>
+      <w:proofErr w:type="spellEnd"/>
+      <w:r>
+        <w:rPr>
+          <w:lang w:val="es-ES"/>
+        </w:rPr>
+        <w:t xml:space="preserve">. </w:t>
+      </w:r>
+    </w:p>
+    <w:p>
+      <w:pPr>
+        <w:spacing w:after="160" w:line="259" w:lineRule="auto"/>
+        <w:ind w:left="0"/>
+        <w:rPr>
+          <w:lang w:val="es-ES"/>
+        </w:rPr>
+      </w:pPr>
+      <w:r>
+        <w:rPr>
           <w:noProof/>
           <w:lang w:val="es-ES"/>
         </w:rPr>
         <w:drawing>
-          <wp:inline distT="0" distB="0" distL="0" distR="0" wp14:anchorId="46A2F4F8" wp14:editId="749CA036">
-            <wp:extent cx="4911090" cy="215900"/>
-            <wp:effectExtent l="0" t="0" r="3810" b="0"/>
-            <wp:docPr id="6" name="Imagen 6"/>
+          <wp:inline distT="0" distB="0" distL="0" distR="0" wp14:anchorId="7DA2B7BD" wp14:editId="5F2475A9">
+            <wp:extent cx="5394960" cy="701040"/>
+            <wp:effectExtent l="0" t="0" r="0" b="3810"/>
+            <wp:docPr id="12" name="Imagen 12"/>
             <wp:cNvGraphicFramePr>
               <a:graphicFrameLocks xmlns:a="http://schemas.openxmlformats.org/drawingml/2006/main" noChangeAspect="1"/>
             </wp:cNvGraphicFramePr>
@@ -1868,7 +2209,7 @@
                   <pic:spPr bwMode="auto">
                     <a:xfrm>
                       <a:off x="0" y="0"/>
-                      <a:ext cx="4911090" cy="215900"/>
+                      <a:ext cx="5394960" cy="701040"/>
                     </a:xfrm>
                     <a:prstGeom prst="rect">
                       <a:avLst/>
@@ -1887,199 +2228,68 @@
     </w:p>
     <w:p>
       <w:pPr>
-        <w:spacing w:after="160" w:line="259" w:lineRule="auto"/>
+        <w:pStyle w:val="Ttulo2"/>
         <w:ind w:left="0"/>
-        <w:rPr>
-          <w:lang w:val="es-ES"/>
-        </w:rPr>
-      </w:pPr>
-      <w:r>
-        <w:rPr>
-          <w:lang w:val="es-ES"/>
-        </w:rPr>
-        <w:t xml:space="preserve">Dentro del bloque </w:t>
+      </w:pPr>
+      <w:r>
+        <w:t xml:space="preserve">Paso </w:t>
+      </w:r>
+      <w:r>
+        <w:t>4</w:t>
+      </w:r>
+      <w:r>
+        <w:t>:</w:t>
+      </w:r>
+      <w:r>
+        <w:rPr>
+          <w:rFonts w:ascii="Montserrat" w:eastAsia="Montserrat" w:hAnsi="Montserrat" w:cs="Montserrat"/>
+          <w:kern w:val="0"/>
+          <w:sz w:val="20"/>
+          <w:szCs w:val="20"/>
+          <w:lang w:val="es" w:eastAsia="es-ES"/>
+          <w14:ligatures w14:val="none"/>
+        </w:rPr>
+        <w:t xml:space="preserve"> </w:t>
+      </w:r>
+      <w:r>
+        <w:rPr>
+          <w:lang w:val="es"/>
+        </w:rPr>
+        <w:t xml:space="preserve">Comprobación del funcionamiento de </w:t>
       </w:r>
       <w:proofErr w:type="spellStart"/>
       <w:r>
         <w:rPr>
-          <w:lang w:val="es-ES"/>
-        </w:rPr>
-        <w:t>location</w:t>
+          <w:lang w:val="es"/>
+        </w:rPr>
+        <w:t>Nginx</w:t>
       </w:r>
       <w:proofErr w:type="spellEnd"/>
-      <w:r>
-        <w:rPr>
-          <w:lang w:val="es-ES"/>
-        </w:rPr>
-        <w:t xml:space="preserve"> /, añadimos las directivas necesarias para el proxy inverso (captura 6.png): </w:t>
-      </w:r>
-    </w:p>
-    <w:p>
-      <w:pPr>
-        <w:numPr>
-          <w:ilvl w:val="0"/>
-          <w:numId w:val="17"/>
-        </w:numPr>
-        <w:spacing w:after="160" w:line="259" w:lineRule="auto"/>
-        <w:rPr>
-          <w:lang w:val="es-ES"/>
-        </w:rPr>
-      </w:pPr>
-      <w:proofErr w:type="spellStart"/>
-      <w:r>
-        <w:rPr>
-          <w:lang w:val="es-ES"/>
-        </w:rPr>
-        <w:t>proxy_pass</w:t>
-      </w:r>
-      <w:proofErr w:type="spellEnd"/>
-      <w:r>
-        <w:rPr>
-          <w:lang w:val="es-ES"/>
-        </w:rPr>
-        <w:t xml:space="preserve"> [http://172.16.156.1:3000</w:t>
-      </w:r>
-      <w:proofErr w:type="gramStart"/>
-      <w:r>
-        <w:rPr>
-          <w:lang w:val="es-ES"/>
-        </w:rPr>
-        <w:t>](</w:t>
-      </w:r>
-      <w:proofErr w:type="gramEnd"/>
-      <w:r>
-        <w:rPr>
-          <w:lang w:val="es-ES"/>
-        </w:rPr>
-        <w:t xml:space="preserve">http://172.16.156.1:3000);: Redirige las peticiones entrantes a la dirección IP 172.16.156.1 por el puerto 3000. </w:t>
-      </w:r>
-    </w:p>
-    <w:p>
-      <w:pPr>
-        <w:numPr>
-          <w:ilvl w:val="0"/>
-          <w:numId w:val="17"/>
-        </w:numPr>
-        <w:spacing w:after="160" w:line="259" w:lineRule="auto"/>
-        <w:rPr>
-          <w:lang w:val="es-ES"/>
-        </w:rPr>
-      </w:pPr>
-      <w:proofErr w:type="spellStart"/>
-      <w:r>
-        <w:rPr>
-          <w:lang w:val="es-ES"/>
-        </w:rPr>
-        <w:t>proxy_set_header</w:t>
-      </w:r>
-      <w:proofErr w:type="spellEnd"/>
-      <w:r>
-        <w:rPr>
-          <w:lang w:val="es-ES"/>
-        </w:rPr>
-        <w:t xml:space="preserve"> Host $</w:t>
-      </w:r>
-      <w:proofErr w:type="gramStart"/>
-      <w:r>
-        <w:rPr>
-          <w:lang w:val="es-ES"/>
-        </w:rPr>
-        <w:t>host;:</w:t>
-      </w:r>
-      <w:proofErr w:type="gramEnd"/>
-      <w:r>
-        <w:rPr>
-          <w:lang w:val="es-ES"/>
-        </w:rPr>
-        <w:t xml:space="preserve"> Mantiene el encabezado del host original. </w:t>
-      </w:r>
-    </w:p>
-    <w:p>
-      <w:pPr>
-        <w:numPr>
-          <w:ilvl w:val="0"/>
-          <w:numId w:val="17"/>
-        </w:numPr>
-        <w:spacing w:after="160" w:line="259" w:lineRule="auto"/>
-        <w:rPr>
-          <w:lang w:val="es-ES"/>
-        </w:rPr>
-      </w:pPr>
-      <w:proofErr w:type="spellStart"/>
-      <w:r>
-        <w:rPr>
-          <w:lang w:val="es-ES"/>
-        </w:rPr>
-        <w:t>proxy_set_header</w:t>
-      </w:r>
-      <w:proofErr w:type="spellEnd"/>
-      <w:r>
-        <w:rPr>
-          <w:lang w:val="es-ES"/>
-        </w:rPr>
-        <w:t xml:space="preserve"> X-Real-IP $</w:t>
-      </w:r>
-      <w:proofErr w:type="spellStart"/>
-      <w:r>
-        <w:rPr>
-          <w:lang w:val="es-ES"/>
-        </w:rPr>
-        <w:t>remote_</w:t>
-      </w:r>
-      <w:proofErr w:type="gramStart"/>
-      <w:r>
-        <w:rPr>
-          <w:lang w:val="es-ES"/>
-        </w:rPr>
-        <w:t>addr</w:t>
-      </w:r>
-      <w:proofErr w:type="spellEnd"/>
-      <w:r>
-        <w:rPr>
-          <w:lang w:val="es-ES"/>
-        </w:rPr>
-        <w:t>;:</w:t>
-      </w:r>
-      <w:proofErr w:type="gramEnd"/>
-      <w:r>
-        <w:rPr>
-          <w:lang w:val="es-ES"/>
-        </w:rPr>
-        <w:t xml:space="preserve"> Pasa la dirección IP real del cliente al servidor de </w:t>
-      </w:r>
-      <w:proofErr w:type="spellStart"/>
-      <w:r>
-        <w:rPr>
-          <w:lang w:val="es-ES"/>
-        </w:rPr>
-        <w:t>backend</w:t>
-      </w:r>
-      <w:proofErr w:type="spellEnd"/>
-      <w:r>
-        <w:rPr>
-          <w:lang w:val="es-ES"/>
-        </w:rPr>
-        <w:t xml:space="preserve">. </w:t>
-      </w:r>
-    </w:p>
-    <w:p>
-      <w:pPr>
-        <w:spacing w:after="160" w:line="259" w:lineRule="auto"/>
+    </w:p>
+    <w:p>
+      <w:pPr>
+        <w:spacing w:before="240"/>
         <w:ind w:left="0"/>
-        <w:rPr>
-          <w:lang w:val="es-ES"/>
-        </w:rPr>
+      </w:pPr>
+      <w:r>
+        <w:t xml:space="preserve">Una vez finalizada la instalación, verificamos que el servidor web está levantado y respondiendo peticiones. Para ello, lanzamos una petición HTTP local a la máquina utilizando el comando. </w:t>
+      </w:r>
+    </w:p>
+    <w:p>
+      <w:pPr>
+        <w:spacing w:before="240"/>
+        <w:ind w:left="0"/>
+        <w:jc w:val="center"/>
       </w:pPr>
       <w:r>
         <w:rPr>
           <w:noProof/>
-          <w:lang w:val="es-ES"/>
         </w:rPr>
         <w:drawing>
-          <wp:inline distT="0" distB="0" distL="0" distR="0" wp14:anchorId="22C265F2" wp14:editId="16CDBE59">
-            <wp:extent cx="4736465" cy="965835"/>
-            <wp:effectExtent l="0" t="0" r="6985" b="5715"/>
-            <wp:docPr id="7" name="Imagen 7"/>
+          <wp:inline distT="0" distB="0" distL="0" distR="0" wp14:anchorId="1B2322B2" wp14:editId="216F464C">
+            <wp:extent cx="2918460" cy="1216922"/>
+            <wp:effectExtent l="0" t="0" r="0" b="2540"/>
+            <wp:docPr id="13" name="Imagen 13"/>
             <wp:cNvGraphicFramePr>
               <a:graphicFrameLocks xmlns:a="http://schemas.openxmlformats.org/drawingml/2006/main" noChangeAspect="1"/>
             </wp:cNvGraphicFramePr>
@@ -2108,7 +2318,7 @@
                   <pic:spPr bwMode="auto">
                     <a:xfrm>
                       <a:off x="0" y="0"/>
-                      <a:ext cx="4736465" cy="965835"/>
+                      <a:ext cx="2959289" cy="1233947"/>
                     </a:xfrm>
                     <a:prstGeom prst="rect">
                       <a:avLst/>
@@ -2127,264 +2337,22 @@
     </w:p>
     <w:p>
       <w:pPr>
-        <w:pStyle w:val="Ttulo2"/>
+        <w:spacing w:before="240"/>
         <w:ind w:left="0"/>
       </w:pPr>
       <w:r>
-        <w:t xml:space="preserve">Paso </w:t>
-      </w:r>
-      <w:r>
-        <w:t>5</w:t>
-      </w:r>
-      <w:r>
-        <w:t>:</w:t>
-      </w:r>
-      <w:r>
-        <w:rPr>
-          <w:rFonts w:ascii="Montserrat" w:eastAsia="Montserrat" w:hAnsi="Montserrat" w:cs="Montserrat"/>
-          <w:kern w:val="0"/>
-          <w:sz w:val="20"/>
-          <w:szCs w:val="20"/>
-          <w:lang w:val="es" w:eastAsia="es-ES"/>
-          <w14:ligatures w14:val="none"/>
-        </w:rPr>
-        <w:t xml:space="preserve"> </w:t>
-      </w:r>
-      <w:r>
-        <w:rPr>
-          <w:lang w:val="es"/>
-        </w:rPr>
-        <w:t>Verificación de sintaxis y reinicio del servicio</w:t>
-      </w:r>
-    </w:p>
-    <w:p>
-      <w:pPr>
-        <w:spacing w:after="160" w:line="259" w:lineRule="auto"/>
-        <w:ind w:left="0"/>
-        <w:rPr>
-          <w:lang w:val="es-ES"/>
-        </w:rPr>
-      </w:pPr>
-      <w:r>
-        <w:rPr>
-          <w:lang w:val="es-ES"/>
-        </w:rPr>
-        <w:t xml:space="preserve">Tras guardar los cambios en el archivo de configuración, es fundamental comprobar que no hemos introducido errores de sintaxis. Ejecutamos sudo </w:t>
+        <w:t>Esta captura c</w:t>
+      </w:r>
+      <w:r>
+        <w:t xml:space="preserve">onfirma que recibimos un código de estado HTTP/1.1 200 OK por parte del servidor </w:t>
       </w:r>
       <w:proofErr w:type="spellStart"/>
       <w:r>
-        <w:rPr>
-          <w:lang w:val="es-ES"/>
-        </w:rPr>
         <w:t>nginx</w:t>
       </w:r>
       <w:proofErr w:type="spellEnd"/>
       <w:r>
-        <w:rPr>
-          <w:lang w:val="es-ES"/>
-        </w:rPr>
-        <w:t xml:space="preserve"> -t. La salida nos </w:t>
-      </w:r>
-      <w:r>
-        <w:rPr>
-          <w:lang w:val="es-ES"/>
-        </w:rPr>
-        <w:lastRenderedPageBreak/>
-        <w:t>confirma que la sintaxis es correcta (</w:t>
-      </w:r>
-      <w:proofErr w:type="spellStart"/>
-      <w:r>
-        <w:rPr>
-          <w:lang w:val="es-ES"/>
-        </w:rPr>
-        <w:t>syntax</w:t>
-      </w:r>
-      <w:proofErr w:type="spellEnd"/>
-      <w:r>
-        <w:rPr>
-          <w:lang w:val="es-ES"/>
-        </w:rPr>
-        <w:t xml:space="preserve"> </w:t>
-      </w:r>
-      <w:proofErr w:type="spellStart"/>
-      <w:r>
-        <w:rPr>
-          <w:lang w:val="es-ES"/>
-        </w:rPr>
-        <w:t>is</w:t>
-      </w:r>
-      <w:proofErr w:type="spellEnd"/>
-      <w:r>
-        <w:rPr>
-          <w:lang w:val="es-ES"/>
-        </w:rPr>
-        <w:t xml:space="preserve"> ok) y que la prueba ha sido exitosa (test </w:t>
-      </w:r>
-      <w:proofErr w:type="spellStart"/>
-      <w:r>
-        <w:rPr>
-          <w:lang w:val="es-ES"/>
-        </w:rPr>
-        <w:t>is</w:t>
-      </w:r>
-      <w:proofErr w:type="spellEnd"/>
-      <w:r>
-        <w:rPr>
-          <w:lang w:val="es-ES"/>
-        </w:rPr>
-        <w:t xml:space="preserve"> </w:t>
-      </w:r>
-      <w:proofErr w:type="spellStart"/>
-      <w:r>
-        <w:rPr>
-          <w:lang w:val="es-ES"/>
-        </w:rPr>
-        <w:t>successful</w:t>
-      </w:r>
-      <w:proofErr w:type="spellEnd"/>
-      <w:r>
-        <w:rPr>
-          <w:lang w:val="es-ES"/>
-        </w:rPr>
-        <w:t xml:space="preserve">), como se ve en la captura 7.png. </w:t>
-      </w:r>
-    </w:p>
-    <w:p>
-      <w:pPr>
-        <w:spacing w:after="160" w:line="259" w:lineRule="auto"/>
-        <w:ind w:left="0"/>
-        <w:rPr>
-          <w:lang w:val="es-ES"/>
-        </w:rPr>
-      </w:pPr>
-      <w:r>
-        <w:rPr>
-          <w:lang w:val="es-ES"/>
-        </w:rPr>
-        <w:t xml:space="preserve">Finalmente, aplicamos la nueva configuración reiniciando el servicio mediante el comando sudo </w:t>
-      </w:r>
-      <w:proofErr w:type="spellStart"/>
-      <w:r>
-        <w:rPr>
-          <w:lang w:val="es-ES"/>
-        </w:rPr>
-        <w:t>systemctl</w:t>
-      </w:r>
-      <w:proofErr w:type="spellEnd"/>
-      <w:r>
-        <w:rPr>
-          <w:lang w:val="es-ES"/>
-        </w:rPr>
-        <w:t xml:space="preserve"> </w:t>
-      </w:r>
-      <w:proofErr w:type="spellStart"/>
-      <w:r>
-        <w:rPr>
-          <w:lang w:val="es-ES"/>
-        </w:rPr>
-        <w:t>restart</w:t>
-      </w:r>
-      <w:proofErr w:type="spellEnd"/>
-      <w:r>
-        <w:rPr>
-          <w:lang w:val="es-ES"/>
-        </w:rPr>
-        <w:t xml:space="preserve"> </w:t>
-      </w:r>
-      <w:proofErr w:type="spellStart"/>
-      <w:r>
-        <w:rPr>
-          <w:lang w:val="es-ES"/>
-        </w:rPr>
-        <w:t>nginx</w:t>
-      </w:r>
-      <w:proofErr w:type="spellEnd"/>
-      <w:r>
-        <w:rPr>
-          <w:lang w:val="es-ES"/>
-        </w:rPr>
-        <w:t xml:space="preserve">. </w:t>
-      </w:r>
-    </w:p>
-    <w:p>
-      <w:pPr>
-        <w:spacing w:after="160" w:line="259" w:lineRule="auto"/>
-        <w:ind w:left="0"/>
-        <w:rPr>
-          <w:lang w:val="es-ES"/>
-        </w:rPr>
-      </w:pPr>
-      <w:r>
-        <w:rPr>
-          <w:noProof/>
-        </w:rPr>
-        <w:drawing>
-          <wp:inline distT="0" distB="0" distL="0" distR="0" wp14:anchorId="0B3FA294" wp14:editId="234CC13D">
-            <wp:extent cx="5301615" cy="852805"/>
-            <wp:effectExtent l="0" t="0" r="0" b="4445"/>
-            <wp:docPr id="9" name="Imagen 9"/>
-            <wp:cNvGraphicFramePr>
-              <a:graphicFrameLocks xmlns:a="http://schemas.openxmlformats.org/drawingml/2006/main" noChangeAspect="1"/>
-            </wp:cNvGraphicFramePr>
-            <a:graphic xmlns:a="http://schemas.openxmlformats.org/drawingml/2006/main">
-              <a:graphicData uri="http://schemas.openxmlformats.org/drawingml/2006/picture">
-                <pic:pic xmlns:pic="http://schemas.openxmlformats.org/drawingml/2006/picture">
-                  <pic:nvPicPr>
-                    <pic:cNvPr id="0" name="Picture 5"/>
-                    <pic:cNvPicPr>
-                      <a:picLocks noChangeAspect="1" noChangeArrowheads="1"/>
-                    </pic:cNvPicPr>
-                  </pic:nvPicPr>
-                  <pic:blipFill>
-                    <a:blip r:embed="rId14">
-                      <a:extLst>
-                        <a:ext uri="{28A0092B-C50C-407E-A947-70E740481C1C}">
-                          <a14:useLocalDpi xmlns:a14="http://schemas.microsoft.com/office/drawing/2010/main" val="0"/>
-                        </a:ext>
-                      </a:extLst>
-                    </a:blip>
-                    <a:srcRect/>
-                    <a:stretch>
-                      <a:fillRect/>
-                    </a:stretch>
-                  </pic:blipFill>
-                  <pic:spPr bwMode="auto">
-                    <a:xfrm>
-                      <a:off x="0" y="0"/>
-                      <a:ext cx="5301615" cy="852805"/>
-                    </a:xfrm>
-                    <a:prstGeom prst="rect">
-                      <a:avLst/>
-                    </a:prstGeom>
-                    <a:noFill/>
-                    <a:ln>
-                      <a:noFill/>
-                    </a:ln>
-                  </pic:spPr>
-                </pic:pic>
-              </a:graphicData>
-            </a:graphic>
-          </wp:inline>
-        </w:drawing>
-      </w:r>
-    </w:p>
-    <w:p>
-      <w:pPr>
-        <w:spacing w:after="160" w:line="259" w:lineRule="auto"/>
-        <w:ind w:left="0"/>
-        <w:jc w:val="left"/>
-        <w:rPr>
-          <w:rFonts w:ascii="Montserrat Medium" w:eastAsiaTheme="majorEastAsia" w:hAnsi="Montserrat Medium" w:cstheme="majorBidi"/>
-          <w:kern w:val="2"/>
-          <w:sz w:val="28"/>
-          <w:szCs w:val="40"/>
-          <w:lang w:val="es-ES" w:eastAsia="en-US"/>
-          <w14:ligatures w14:val="standardContextual"/>
-        </w:rPr>
-      </w:pPr>
-      <w:bookmarkStart w:id="4" w:name="_Toc242119014"/>
-      <w:r>
-        <w:br w:type="page"/>
+        <w:t xml:space="preserve">/1.22.1, lo que indica que el servicio está funcionando correctamente. </w:t>
       </w:r>
     </w:p>
     <w:p>
@@ -2395,8 +2363,8 @@
           <w:numId w:val="11"/>
         </w:numPr>
       </w:pPr>
-      <w:r>
-        <w:lastRenderedPageBreak/>
+      <w:bookmarkStart w:id="4" w:name="_Toc242119014"/>
+      <w:r>
         <w:t xml:space="preserve">Configuración del servidor </w:t>
       </w:r>
       <w:proofErr w:type="spellStart"/>
@@ -2463,7 +2431,6 @@
       </w:pPr>
       <w:bookmarkStart w:id="6" w:name="_Toc242119016"/>
       <w:r>
-        <w:lastRenderedPageBreak/>
         <w:t>Configuración del servidor de base de datos con MongoDB</w:t>
       </w:r>
       <w:bookmarkEnd w:id="6"/>
@@ -2526,7 +2493,6 @@
       </w:pPr>
       <w:bookmarkStart w:id="8" w:name="_Toc242119018"/>
       <w:r>
-        <w:lastRenderedPageBreak/>
         <w:t>Configuración del servidor de base de datos como sistema de ficheros compartido</w:t>
       </w:r>
       <w:bookmarkEnd w:id="8"/>
@@ -2564,8 +2530,8 @@
       <w:proofErr w:type="spellEnd"/>
     </w:p>
     <w:sectPr>
-      <w:headerReference w:type="default" r:id="rId15"/>
-      <w:headerReference w:type="first" r:id="rId16"/>
+      <w:headerReference w:type="default" r:id="rId14"/>
+      <w:headerReference w:type="first" r:id="rId15"/>
       <w:pgSz w:w="11906" w:h="16838"/>
       <w:pgMar w:top="1417" w:right="1701" w:bottom="1417" w:left="1701" w:header="708" w:footer="708" w:gutter="0"/>
       <w:cols w:space="708"/>
@@ -3090,6 +3056,155 @@
     </w:lvl>
   </w:abstractNum>
   <w:abstractNum w:abstractNumId="3" w15:restartNumberingAfterBreak="0">
+    <w:nsid w:val="1B76315A"/>
+    <w:multiLevelType w:val="multilevel"/>
+    <w:tmpl w:val="310C03D4"/>
+    <w:lvl w:ilvl="0">
+      <w:start w:val="1"/>
+      <w:numFmt w:val="bullet"/>
+      <w:lvlText w:val=""/>
+      <w:lvlJc w:val="left"/>
+      <w:pPr>
+        <w:tabs>
+          <w:tab w:val="num" w:pos="720"/>
+        </w:tabs>
+        <w:ind w:left="720" w:hanging="360"/>
+      </w:pPr>
+      <w:rPr>
+        <w:rFonts w:ascii="Symbol" w:hAnsi="Symbol" w:hint="default"/>
+        <w:sz w:val="20"/>
+      </w:rPr>
+    </w:lvl>
+    <w:lvl w:ilvl="1" w:tentative="1">
+      <w:start w:val="1"/>
+      <w:numFmt w:val="bullet"/>
+      <w:lvlText w:val="o"/>
+      <w:lvlJc w:val="left"/>
+      <w:pPr>
+        <w:tabs>
+          <w:tab w:val="num" w:pos="1440"/>
+        </w:tabs>
+        <w:ind w:left="1440" w:hanging="360"/>
+      </w:pPr>
+      <w:rPr>
+        <w:rFonts w:ascii="Courier New" w:hAnsi="Courier New" w:hint="default"/>
+        <w:sz w:val="20"/>
+      </w:rPr>
+    </w:lvl>
+    <w:lvl w:ilvl="2" w:tentative="1">
+      <w:start w:val="1"/>
+      <w:numFmt w:val="bullet"/>
+      <w:lvlText w:val=""/>
+      <w:lvlJc w:val="left"/>
+      <w:pPr>
+        <w:tabs>
+          <w:tab w:val="num" w:pos="2160"/>
+        </w:tabs>
+        <w:ind w:left="2160" w:hanging="360"/>
+      </w:pPr>
+      <w:rPr>
+        <w:rFonts w:ascii="Wingdings" w:hAnsi="Wingdings" w:hint="default"/>
+        <w:sz w:val="20"/>
+      </w:rPr>
+    </w:lvl>
+    <w:lvl w:ilvl="3" w:tentative="1">
+      <w:start w:val="1"/>
+      <w:numFmt w:val="bullet"/>
+      <w:lvlText w:val=""/>
+      <w:lvlJc w:val="left"/>
+      <w:pPr>
+        <w:tabs>
+          <w:tab w:val="num" w:pos="2880"/>
+        </w:tabs>
+        <w:ind w:left="2880" w:hanging="360"/>
+      </w:pPr>
+      <w:rPr>
+        <w:rFonts w:ascii="Wingdings" w:hAnsi="Wingdings" w:hint="default"/>
+        <w:sz w:val="20"/>
+      </w:rPr>
+    </w:lvl>
+    <w:lvl w:ilvl="4" w:tentative="1">
+      <w:start w:val="1"/>
+      <w:numFmt w:val="bullet"/>
+      <w:lvlText w:val=""/>
+      <w:lvlJc w:val="left"/>
+      <w:pPr>
+        <w:tabs>
+          <w:tab w:val="num" w:pos="3600"/>
+        </w:tabs>
+        <w:ind w:left="3600" w:hanging="360"/>
+      </w:pPr>
+      <w:rPr>
+        <w:rFonts w:ascii="Wingdings" w:hAnsi="Wingdings" w:hint="default"/>
+        <w:sz w:val="20"/>
+      </w:rPr>
+    </w:lvl>
+    <w:lvl w:ilvl="5" w:tentative="1">
+      <w:start w:val="1"/>
+      <w:numFmt w:val="bullet"/>
+      <w:lvlText w:val=""/>
+      <w:lvlJc w:val="left"/>
+      <w:pPr>
+        <w:tabs>
+          <w:tab w:val="num" w:pos="4320"/>
+        </w:tabs>
+        <w:ind w:left="4320" w:hanging="360"/>
+      </w:pPr>
+      <w:rPr>
+        <w:rFonts w:ascii="Wingdings" w:hAnsi="Wingdings" w:hint="default"/>
+        <w:sz w:val="20"/>
+      </w:rPr>
+    </w:lvl>
+    <w:lvl w:ilvl="6" w:tentative="1">
+      <w:start w:val="1"/>
+      <w:numFmt w:val="bullet"/>
+      <w:lvlText w:val=""/>
+      <w:lvlJc w:val="left"/>
+      <w:pPr>
+        <w:tabs>
+          <w:tab w:val="num" w:pos="5040"/>
+        </w:tabs>
+        <w:ind w:left="5040" w:hanging="360"/>
+      </w:pPr>
+      <w:rPr>
+        <w:rFonts w:ascii="Wingdings" w:hAnsi="Wingdings" w:hint="default"/>
+        <w:sz w:val="20"/>
+      </w:rPr>
+    </w:lvl>
+    <w:lvl w:ilvl="7" w:tentative="1">
+      <w:start w:val="1"/>
+      <w:numFmt w:val="bullet"/>
+      <w:lvlText w:val=""/>
+      <w:lvlJc w:val="left"/>
+      <w:pPr>
+        <w:tabs>
+          <w:tab w:val="num" w:pos="5760"/>
+        </w:tabs>
+        <w:ind w:left="5760" w:hanging="360"/>
+      </w:pPr>
+      <w:rPr>
+        <w:rFonts w:ascii="Wingdings" w:hAnsi="Wingdings" w:hint="default"/>
+        <w:sz w:val="20"/>
+      </w:rPr>
+    </w:lvl>
+    <w:lvl w:ilvl="8" w:tentative="1">
+      <w:start w:val="1"/>
+      <w:numFmt w:val="bullet"/>
+      <w:lvlText w:val=""/>
+      <w:lvlJc w:val="left"/>
+      <w:pPr>
+        <w:tabs>
+          <w:tab w:val="num" w:pos="6480"/>
+        </w:tabs>
+        <w:ind w:left="6480" w:hanging="360"/>
+      </w:pPr>
+      <w:rPr>
+        <w:rFonts w:ascii="Wingdings" w:hAnsi="Wingdings" w:hint="default"/>
+        <w:sz w:val="20"/>
+      </w:rPr>
+    </w:lvl>
+  </w:abstractNum>
+  <w:abstractNum w:abstractNumId="4" w15:restartNumberingAfterBreak="0">
     <w:nsid w:val="250B5AFF"/>
     <w:multiLevelType w:val="multilevel"/>
     <w:tmpl w:val="3FCE56A4"/>
@@ -3238,7 +3353,7 @@
       </w:rPr>
     </w:lvl>
   </w:abstractNum>
-  <w:abstractNum w:abstractNumId="4" w15:restartNumberingAfterBreak="0">
+  <w:abstractNum w:abstractNumId="5" w15:restartNumberingAfterBreak="0">
     <w:nsid w:val="25A97CAB"/>
     <w:multiLevelType w:val="hybridMultilevel"/>
     <w:tmpl w:val="756C3D04"/>
@@ -3327,7 +3442,7 @@
       </w:pPr>
     </w:lvl>
   </w:abstractNum>
-  <w:abstractNum w:abstractNumId="5" w15:restartNumberingAfterBreak="0">
+  <w:abstractNum w:abstractNumId="6" w15:restartNumberingAfterBreak="0">
     <w:nsid w:val="2A4847F5"/>
     <w:multiLevelType w:val="multilevel"/>
     <w:tmpl w:val="74125E48"/>
@@ -3476,7 +3591,7 @@
       </w:rPr>
     </w:lvl>
   </w:abstractNum>
-  <w:abstractNum w:abstractNumId="6" w15:restartNumberingAfterBreak="0">
+  <w:abstractNum w:abstractNumId="7" w15:restartNumberingAfterBreak="0">
     <w:nsid w:val="2C8529BC"/>
     <w:multiLevelType w:val="hybridMultilevel"/>
     <w:tmpl w:val="756C3D04"/>
@@ -3565,7 +3680,7 @@
       </w:pPr>
     </w:lvl>
   </w:abstractNum>
-  <w:abstractNum w:abstractNumId="7" w15:restartNumberingAfterBreak="0">
+  <w:abstractNum w:abstractNumId="8" w15:restartNumberingAfterBreak="0">
     <w:nsid w:val="41AC14B4"/>
     <w:multiLevelType w:val="hybridMultilevel"/>
     <w:tmpl w:val="756C3D04"/>
@@ -3654,7 +3769,7 @@
       </w:pPr>
     </w:lvl>
   </w:abstractNum>
-  <w:abstractNum w:abstractNumId="8" w15:restartNumberingAfterBreak="0">
+  <w:abstractNum w:abstractNumId="9" w15:restartNumberingAfterBreak="0">
     <w:nsid w:val="42737BC9"/>
     <w:multiLevelType w:val="hybridMultilevel"/>
     <w:tmpl w:val="756C3D04"/>
@@ -3743,7 +3858,7 @@
       </w:pPr>
     </w:lvl>
   </w:abstractNum>
-  <w:abstractNum w:abstractNumId="9" w15:restartNumberingAfterBreak="0">
+  <w:abstractNum w:abstractNumId="10" w15:restartNumberingAfterBreak="0">
     <w:nsid w:val="4A277EBF"/>
     <w:multiLevelType w:val="multilevel"/>
     <w:tmpl w:val="651A13A8"/>
@@ -3892,7 +4007,7 @@
       </w:rPr>
     </w:lvl>
   </w:abstractNum>
-  <w:abstractNum w:abstractNumId="10" w15:restartNumberingAfterBreak="0">
+  <w:abstractNum w:abstractNumId="11" w15:restartNumberingAfterBreak="0">
     <w:nsid w:val="4E2E76A6"/>
     <w:multiLevelType w:val="multilevel"/>
     <w:tmpl w:val="756C3D04"/>
@@ -3982,7 +4097,7 @@
       </w:pPr>
     </w:lvl>
   </w:abstractNum>
-  <w:abstractNum w:abstractNumId="11" w15:restartNumberingAfterBreak="0">
+  <w:abstractNum w:abstractNumId="12" w15:restartNumberingAfterBreak="0">
     <w:nsid w:val="50674A31"/>
     <w:multiLevelType w:val="multilevel"/>
     <w:tmpl w:val="E5A80976"/>
@@ -4131,7 +4246,7 @@
       </w:rPr>
     </w:lvl>
   </w:abstractNum>
-  <w:abstractNum w:abstractNumId="12" w15:restartNumberingAfterBreak="0">
+  <w:abstractNum w:abstractNumId="13" w15:restartNumberingAfterBreak="0">
     <w:nsid w:val="518E6B5F"/>
     <w:multiLevelType w:val="hybridMultilevel"/>
     <w:tmpl w:val="F8A8D2E8"/>
@@ -4220,7 +4335,7 @@
       </w:pPr>
     </w:lvl>
   </w:abstractNum>
-  <w:abstractNum w:abstractNumId="13" w15:restartNumberingAfterBreak="0">
+  <w:abstractNum w:abstractNumId="14" w15:restartNumberingAfterBreak="0">
     <w:nsid w:val="519C1E37"/>
     <w:multiLevelType w:val="multilevel"/>
     <w:tmpl w:val="A4388C64"/>
@@ -4369,7 +4484,7 @@
       </w:rPr>
     </w:lvl>
   </w:abstractNum>
-  <w:abstractNum w:abstractNumId="14" w15:restartNumberingAfterBreak="0">
+  <w:abstractNum w:abstractNumId="15" w15:restartNumberingAfterBreak="0">
     <w:nsid w:val="62646A90"/>
     <w:multiLevelType w:val="multilevel"/>
     <w:tmpl w:val="AE903512"/>
@@ -4518,7 +4633,7 @@
       </w:rPr>
     </w:lvl>
   </w:abstractNum>
-  <w:abstractNum w:abstractNumId="15" w15:restartNumberingAfterBreak="0">
+  <w:abstractNum w:abstractNumId="16" w15:restartNumberingAfterBreak="0">
     <w:nsid w:val="64416E88"/>
     <w:multiLevelType w:val="hybridMultilevel"/>
     <w:tmpl w:val="756C3D04"/>
@@ -4607,7 +4722,7 @@
       </w:pPr>
     </w:lvl>
   </w:abstractNum>
-  <w:abstractNum w:abstractNumId="16" w15:restartNumberingAfterBreak="0">
+  <w:abstractNum w:abstractNumId="17" w15:restartNumberingAfterBreak="0">
     <w:nsid w:val="73F24A1A"/>
     <w:multiLevelType w:val="hybridMultilevel"/>
     <w:tmpl w:val="F8A8D2E8"/>
@@ -4697,46 +4812,46 @@
     </w:lvl>
   </w:abstractNum>
   <w:num w:numId="1" w16cid:durableId="515771326">
-    <w:abstractNumId w:val="13"/>
+    <w:abstractNumId w:val="14"/>
   </w:num>
   <w:num w:numId="2" w16cid:durableId="542718523">
-    <w:abstractNumId w:val="3"/>
+    <w:abstractNumId w:val="4"/>
   </w:num>
   <w:num w:numId="3" w16cid:durableId="846941253">
-    <w:abstractNumId w:val="15"/>
+    <w:abstractNumId w:val="16"/>
   </w:num>
   <w:num w:numId="4" w16cid:durableId="447313891">
+    <w:abstractNumId w:val="9"/>
+  </w:num>
+  <w:num w:numId="5" w16cid:durableId="146213896">
+    <w:abstractNumId w:val="5"/>
+  </w:num>
+  <w:num w:numId="6" w16cid:durableId="2124952983">
+    <w:abstractNumId w:val="11"/>
+  </w:num>
+  <w:num w:numId="7" w16cid:durableId="997616244">
+    <w:abstractNumId w:val="7"/>
+  </w:num>
+  <w:num w:numId="8" w16cid:durableId="2107383776">
     <w:abstractNumId w:val="8"/>
   </w:num>
-  <w:num w:numId="5" w16cid:durableId="146213896">
-    <w:abstractNumId w:val="4"/>
-  </w:num>
-  <w:num w:numId="6" w16cid:durableId="2124952983">
-    <w:abstractNumId w:val="10"/>
-  </w:num>
-  <w:num w:numId="7" w16cid:durableId="997616244">
+  <w:num w:numId="9" w16cid:durableId="798454432">
     <w:abstractNumId w:val="6"/>
-  </w:num>
-  <w:num w:numId="8" w16cid:durableId="2107383776">
-    <w:abstractNumId w:val="7"/>
-  </w:num>
-  <w:num w:numId="9" w16cid:durableId="798454432">
-    <w:abstractNumId w:val="5"/>
   </w:num>
   <w:num w:numId="10" w16cid:durableId="700669975">
     <w:abstractNumId w:val="0"/>
   </w:num>
   <w:num w:numId="11" w16cid:durableId="1822034867">
+    <w:abstractNumId w:val="13"/>
+  </w:num>
+  <w:num w:numId="12" w16cid:durableId="390932176">
     <w:abstractNumId w:val="12"/>
   </w:num>
-  <w:num w:numId="12" w16cid:durableId="390932176">
-    <w:abstractNumId w:val="11"/>
-  </w:num>
   <w:num w:numId="13" w16cid:durableId="2117867398">
-    <w:abstractNumId w:val="16"/>
+    <w:abstractNumId w:val="17"/>
   </w:num>
   <w:num w:numId="14" w16cid:durableId="955333856">
-    <w:abstractNumId w:val="14"/>
+    <w:abstractNumId w:val="15"/>
   </w:num>
   <w:num w:numId="15" w16cid:durableId="966204407">
     <w:abstractNumId w:val="2"/>
@@ -4745,7 +4860,10 @@
     <w:abstractNumId w:val="1"/>
   </w:num>
   <w:num w:numId="17" w16cid:durableId="1245800432">
-    <w:abstractNumId w:val="9"/>
+    <w:abstractNumId w:val="10"/>
+  </w:num>
+  <w:num w:numId="18" w16cid:durableId="468518847">
+    <w:abstractNumId w:val="3"/>
   </w:num>
 </w:numbering>
 </file>

</xml_diff>

<commit_message>
Punto 2.1 Informe 2
</commit_message>
<xml_diff>
--- a/Informe P2/P2.docx
+++ b/Informe P2/P2.docx
@@ -15,6 +15,8 @@
           <w:lang w:val="es-ES"/>
         </w:rPr>
       </w:pPr>
+      <w:bookmarkStart w:id="0" w:name="_Hlk242292486"/>
+      <w:bookmarkEnd w:id="0"/>
     </w:p>
     <w:p>
       <w:pPr>
@@ -435,7 +437,7 @@
           <w:r>
             <w:fldChar w:fldCharType="separate"/>
           </w:r>
-          <w:hyperlink w:anchor="_Toc242119011" w:history="1">
+          <w:hyperlink w:anchor="_Toc242293207" w:history="1">
             <w:r>
               <w:rPr>
                 <w:rStyle w:val="Hipervnculo"/>
@@ -481,7 +483,7 @@
                 <w:noProof/>
                 <w:webHidden/>
               </w:rPr>
-              <w:instrText xml:space="preserve"> PAGEREF _Toc242119011 \h </w:instrText>
+              <w:instrText xml:space="preserve"> PAGEREF _Toc242293207 \h </w:instrText>
             </w:r>
             <w:r>
               <w:rPr>
@@ -528,13 +530,13 @@
               <w14:ligatures w14:val="standardContextual"/>
             </w:rPr>
           </w:pPr>
-          <w:hyperlink w:anchor="_Toc242119012" w:history="1">
+          <w:hyperlink w:anchor="_Toc242293208" w:history="1">
             <w:r>
               <w:rPr>
                 <w:rStyle w:val="Hipervnculo"/>
                 <w:noProof/>
               </w:rPr>
-              <w:t>Paso 1: Creación y configuración de la máquina Proxy</w:t>
+              <w:t>Paso 1: Actualización del sistema e instalación de paquetes</w:t>
             </w:r>
             <w:r>
               <w:rPr>
@@ -555,7 +557,7 @@
                 <w:noProof/>
                 <w:webHidden/>
               </w:rPr>
-              <w:instrText xml:space="preserve"> PAGEREF _Toc242119012 \h </w:instrText>
+              <w:instrText xml:space="preserve"> PAGEREF _Toc242293208 \h </w:instrText>
             </w:r>
             <w:r>
               <w:rPr>
@@ -602,13 +604,13 @@
               <w14:ligatures w14:val="standardContextual"/>
             </w:rPr>
           </w:pPr>
-          <w:hyperlink w:anchor="_Toc242119013" w:history="1">
+          <w:hyperlink w:anchor="_Toc242293209" w:history="1">
             <w:r>
               <w:rPr>
                 <w:rStyle w:val="Hipervnculo"/>
                 <w:noProof/>
               </w:rPr>
-              <w:t>Paso 2: Creación y configuración de la máquina Server</w:t>
+              <w:t>Paso 2: Configuración de Nginx como Proxy Inverso</w:t>
             </w:r>
             <w:r>
               <w:rPr>
@@ -629,7 +631,7 @@
                 <w:noProof/>
                 <w:webHidden/>
               </w:rPr>
-              <w:instrText xml:space="preserve"> PAGEREF _Toc242119013 \h </w:instrText>
+              <w:instrText xml:space="preserve"> PAGEREF _Toc242293209 \h </w:instrText>
             </w:r>
             <w:r>
               <w:rPr>
@@ -650,6 +652,154 @@
                 <w:webHidden/>
               </w:rPr>
               <w:t>3</w:t>
+            </w:r>
+            <w:r>
+              <w:rPr>
+                <w:noProof/>
+                <w:webHidden/>
+              </w:rPr>
+              <w:fldChar w:fldCharType="end"/>
+            </w:r>
+          </w:hyperlink>
+        </w:p>
+        <w:p>
+          <w:pPr>
+            <w:pStyle w:val="TDC2"/>
+            <w:tabs>
+              <w:tab w:val="right" w:pos="8494"/>
+            </w:tabs>
+            <w:rPr>
+              <w:rFonts w:asciiTheme="minorHAnsi" w:eastAsiaTheme="minorEastAsia" w:hAnsiTheme="minorHAnsi" w:cstheme="minorBidi"/>
+              <w:noProof/>
+              <w:kern w:val="2"/>
+              <w:sz w:val="24"/>
+              <w:szCs w:val="24"/>
+              <w:lang w:val="es-ES"/>
+              <w14:ligatures w14:val="standardContextual"/>
+            </w:rPr>
+          </w:pPr>
+          <w:hyperlink w:anchor="_Toc242293210" w:history="1">
+            <w:r>
+              <w:rPr>
+                <w:rStyle w:val="Hipervnculo"/>
+                <w:noProof/>
+              </w:rPr>
+              <w:t>Paso 3: Verificación de sintaxis y reinicio del servicio</w:t>
+            </w:r>
+            <w:r>
+              <w:rPr>
+                <w:noProof/>
+                <w:webHidden/>
+              </w:rPr>
+              <w:tab/>
+            </w:r>
+            <w:r>
+              <w:rPr>
+                <w:noProof/>
+                <w:webHidden/>
+              </w:rPr>
+              <w:fldChar w:fldCharType="begin"/>
+            </w:r>
+            <w:r>
+              <w:rPr>
+                <w:noProof/>
+                <w:webHidden/>
+              </w:rPr>
+              <w:instrText xml:space="preserve"> PAGEREF _Toc242293210 \h </w:instrText>
+            </w:r>
+            <w:r>
+              <w:rPr>
+                <w:noProof/>
+                <w:webHidden/>
+              </w:rPr>
+            </w:r>
+            <w:r>
+              <w:rPr>
+                <w:noProof/>
+                <w:webHidden/>
+              </w:rPr>
+              <w:fldChar w:fldCharType="separate"/>
+            </w:r>
+            <w:r>
+              <w:rPr>
+                <w:noProof/>
+                <w:webHidden/>
+              </w:rPr>
+              <w:t>4</w:t>
+            </w:r>
+            <w:r>
+              <w:rPr>
+                <w:noProof/>
+                <w:webHidden/>
+              </w:rPr>
+              <w:fldChar w:fldCharType="end"/>
+            </w:r>
+          </w:hyperlink>
+        </w:p>
+        <w:p>
+          <w:pPr>
+            <w:pStyle w:val="TDC2"/>
+            <w:tabs>
+              <w:tab w:val="right" w:pos="8494"/>
+            </w:tabs>
+            <w:rPr>
+              <w:rFonts w:asciiTheme="minorHAnsi" w:eastAsiaTheme="minorEastAsia" w:hAnsiTheme="minorHAnsi" w:cstheme="minorBidi"/>
+              <w:noProof/>
+              <w:kern w:val="2"/>
+              <w:sz w:val="24"/>
+              <w:szCs w:val="24"/>
+              <w:lang w:val="es-ES"/>
+              <w14:ligatures w14:val="standardContextual"/>
+            </w:rPr>
+          </w:pPr>
+          <w:hyperlink w:anchor="_Toc242293211" w:history="1">
+            <w:r>
+              <w:rPr>
+                <w:rStyle w:val="Hipervnculo"/>
+                <w:noProof/>
+              </w:rPr>
+              <w:t>Paso 4: Comprobación del funcionamiento de Nginx</w:t>
+            </w:r>
+            <w:r>
+              <w:rPr>
+                <w:noProof/>
+                <w:webHidden/>
+              </w:rPr>
+              <w:tab/>
+            </w:r>
+            <w:r>
+              <w:rPr>
+                <w:noProof/>
+                <w:webHidden/>
+              </w:rPr>
+              <w:fldChar w:fldCharType="begin"/>
+            </w:r>
+            <w:r>
+              <w:rPr>
+                <w:noProof/>
+                <w:webHidden/>
+              </w:rPr>
+              <w:instrText xml:space="preserve"> PAGEREF _Toc242293211 \h </w:instrText>
+            </w:r>
+            <w:r>
+              <w:rPr>
+                <w:noProof/>
+                <w:webHidden/>
+              </w:rPr>
+            </w:r>
+            <w:r>
+              <w:rPr>
+                <w:noProof/>
+                <w:webHidden/>
+              </w:rPr>
+              <w:fldChar w:fldCharType="separate"/>
+            </w:r>
+            <w:r>
+              <w:rPr>
+                <w:noProof/>
+                <w:webHidden/>
+              </w:rPr>
+              <w:t>4</w:t>
             </w:r>
             <w:r>
               <w:rPr>
@@ -677,7 +827,7 @@
               <w14:ligatures w14:val="standardContextual"/>
             </w:rPr>
           </w:pPr>
-          <w:hyperlink w:anchor="_Toc242119014" w:history="1">
+          <w:hyperlink w:anchor="_Toc242293212" w:history="1">
             <w:r>
               <w:rPr>
                 <w:rStyle w:val="Hipervnculo"/>
@@ -723,7 +873,7 @@
                 <w:noProof/>
                 <w:webHidden/>
               </w:rPr>
-              <w:instrText xml:space="preserve"> PAGEREF _Toc242119014 \h </w:instrText>
+              <w:instrText xml:space="preserve"> PAGEREF _Toc242293212 \h </w:instrText>
             </w:r>
             <w:r>
               <w:rPr>
@@ -743,7 +893,7 @@
                 <w:noProof/>
                 <w:webHidden/>
               </w:rPr>
-              <w:t>4</w:t>
+              <w:t>5</w:t>
             </w:r>
             <w:r>
               <w:rPr>
@@ -770,13 +920,13 @@
               <w14:ligatures w14:val="standardContextual"/>
             </w:rPr>
           </w:pPr>
-          <w:hyperlink w:anchor="_Toc242119015" w:history="1">
+          <w:hyperlink w:anchor="_Toc242293213" w:history="1">
             <w:r>
               <w:rPr>
                 <w:rStyle w:val="Hipervnculo"/>
                 <w:noProof/>
               </w:rPr>
-              <w:t>Paso 1: Creación y configuración de la máquina Proxy</w:t>
+              <w:t>Paso 1: Acceso temporal a internet e instalación de dependencias</w:t>
             </w:r>
             <w:r>
               <w:rPr>
@@ -797,7 +947,7 @@
                 <w:noProof/>
                 <w:webHidden/>
               </w:rPr>
-              <w:instrText xml:space="preserve"> PAGEREF _Toc242119015 \h </w:instrText>
+              <w:instrText xml:space="preserve"> PAGEREF _Toc242293213 \h </w:instrText>
             </w:r>
             <w:r>
               <w:rPr>
@@ -817,7 +967,229 @@
                 <w:noProof/>
                 <w:webHidden/>
               </w:rPr>
-              <w:t>4</w:t>
+              <w:t>5</w:t>
+            </w:r>
+            <w:r>
+              <w:rPr>
+                <w:noProof/>
+                <w:webHidden/>
+              </w:rPr>
+              <w:fldChar w:fldCharType="end"/>
+            </w:r>
+          </w:hyperlink>
+        </w:p>
+        <w:p>
+          <w:pPr>
+            <w:pStyle w:val="TDC2"/>
+            <w:tabs>
+              <w:tab w:val="right" w:pos="8494"/>
+            </w:tabs>
+            <w:rPr>
+              <w:rFonts w:asciiTheme="minorHAnsi" w:eastAsiaTheme="minorEastAsia" w:hAnsiTheme="minorHAnsi" w:cstheme="minorBidi"/>
+              <w:noProof/>
+              <w:kern w:val="2"/>
+              <w:sz w:val="24"/>
+              <w:szCs w:val="24"/>
+              <w:lang w:val="es-ES"/>
+              <w14:ligatures w14:val="standardContextual"/>
+            </w:rPr>
+          </w:pPr>
+          <w:hyperlink w:anchor="_Toc242293214" w:history="1">
+            <w:r>
+              <w:rPr>
+                <w:rStyle w:val="Hipervnculo"/>
+                <w:noProof/>
+              </w:rPr>
+              <w:t>Paso 2: Descarga y configuración de la aplicación</w:t>
+            </w:r>
+            <w:r>
+              <w:rPr>
+                <w:noProof/>
+                <w:webHidden/>
+              </w:rPr>
+              <w:tab/>
+            </w:r>
+            <w:r>
+              <w:rPr>
+                <w:noProof/>
+                <w:webHidden/>
+              </w:rPr>
+              <w:fldChar w:fldCharType="begin"/>
+            </w:r>
+            <w:r>
+              <w:rPr>
+                <w:noProof/>
+                <w:webHidden/>
+              </w:rPr>
+              <w:instrText xml:space="preserve"> PAGEREF _Toc242293214 \h </w:instrText>
+            </w:r>
+            <w:r>
+              <w:rPr>
+                <w:noProof/>
+                <w:webHidden/>
+              </w:rPr>
+            </w:r>
+            <w:r>
+              <w:rPr>
+                <w:noProof/>
+                <w:webHidden/>
+              </w:rPr>
+              <w:fldChar w:fldCharType="separate"/>
+            </w:r>
+            <w:r>
+              <w:rPr>
+                <w:noProof/>
+                <w:webHidden/>
+              </w:rPr>
+              <w:t>6</w:t>
+            </w:r>
+            <w:r>
+              <w:rPr>
+                <w:noProof/>
+                <w:webHidden/>
+              </w:rPr>
+              <w:fldChar w:fldCharType="end"/>
+            </w:r>
+          </w:hyperlink>
+        </w:p>
+        <w:p>
+          <w:pPr>
+            <w:pStyle w:val="TDC2"/>
+            <w:tabs>
+              <w:tab w:val="right" w:pos="8494"/>
+            </w:tabs>
+            <w:rPr>
+              <w:rFonts w:asciiTheme="minorHAnsi" w:eastAsiaTheme="minorEastAsia" w:hAnsiTheme="minorHAnsi" w:cstheme="minorBidi"/>
+              <w:noProof/>
+              <w:kern w:val="2"/>
+              <w:sz w:val="24"/>
+              <w:szCs w:val="24"/>
+              <w:lang w:val="es-ES"/>
+              <w14:ligatures w14:val="standardContextual"/>
+            </w:rPr>
+          </w:pPr>
+          <w:hyperlink w:anchor="_Toc242293215" w:history="1">
+            <w:r>
+              <w:rPr>
+                <w:rStyle w:val="Hipervnculo"/>
+                <w:noProof/>
+              </w:rPr>
+              <w:t>Paso 3: Ejecución como servicio systemd</w:t>
+            </w:r>
+            <w:r>
+              <w:rPr>
+                <w:noProof/>
+                <w:webHidden/>
+              </w:rPr>
+              <w:tab/>
+            </w:r>
+            <w:r>
+              <w:rPr>
+                <w:noProof/>
+                <w:webHidden/>
+              </w:rPr>
+              <w:fldChar w:fldCharType="begin"/>
+            </w:r>
+            <w:r>
+              <w:rPr>
+                <w:noProof/>
+                <w:webHidden/>
+              </w:rPr>
+              <w:instrText xml:space="preserve"> PAGEREF _Toc242293215 \h </w:instrText>
+            </w:r>
+            <w:r>
+              <w:rPr>
+                <w:noProof/>
+                <w:webHidden/>
+              </w:rPr>
+            </w:r>
+            <w:r>
+              <w:rPr>
+                <w:noProof/>
+                <w:webHidden/>
+              </w:rPr>
+              <w:fldChar w:fldCharType="separate"/>
+            </w:r>
+            <w:r>
+              <w:rPr>
+                <w:noProof/>
+                <w:webHidden/>
+              </w:rPr>
+              <w:t>7</w:t>
+            </w:r>
+            <w:r>
+              <w:rPr>
+                <w:noProof/>
+                <w:webHidden/>
+              </w:rPr>
+              <w:fldChar w:fldCharType="end"/>
+            </w:r>
+          </w:hyperlink>
+        </w:p>
+        <w:p>
+          <w:pPr>
+            <w:pStyle w:val="TDC2"/>
+            <w:tabs>
+              <w:tab w:val="right" w:pos="8494"/>
+            </w:tabs>
+            <w:rPr>
+              <w:rFonts w:asciiTheme="minorHAnsi" w:eastAsiaTheme="minorEastAsia" w:hAnsiTheme="minorHAnsi" w:cstheme="minorBidi"/>
+              <w:noProof/>
+              <w:kern w:val="2"/>
+              <w:sz w:val="24"/>
+              <w:szCs w:val="24"/>
+              <w:lang w:val="es-ES"/>
+              <w14:ligatures w14:val="standardContextual"/>
+            </w:rPr>
+          </w:pPr>
+          <w:hyperlink w:anchor="_Toc242293216" w:history="1">
+            <w:r>
+              <w:rPr>
+                <w:rStyle w:val="Hipervnculo"/>
+                <w:noProof/>
+              </w:rPr>
+              <w:t>Paso 4: Verificación final desde el Proxy</w:t>
+            </w:r>
+            <w:r>
+              <w:rPr>
+                <w:noProof/>
+                <w:webHidden/>
+              </w:rPr>
+              <w:tab/>
+            </w:r>
+            <w:r>
+              <w:rPr>
+                <w:noProof/>
+                <w:webHidden/>
+              </w:rPr>
+              <w:fldChar w:fldCharType="begin"/>
+            </w:r>
+            <w:r>
+              <w:rPr>
+                <w:noProof/>
+                <w:webHidden/>
+              </w:rPr>
+              <w:instrText xml:space="preserve"> PAGEREF _Toc242293216 \h </w:instrText>
+            </w:r>
+            <w:r>
+              <w:rPr>
+                <w:noProof/>
+                <w:webHidden/>
+              </w:rPr>
+            </w:r>
+            <w:r>
+              <w:rPr>
+                <w:noProof/>
+                <w:webHidden/>
+              </w:rPr>
+              <w:fldChar w:fldCharType="separate"/>
+            </w:r>
+            <w:r>
+              <w:rPr>
+                <w:noProof/>
+                <w:webHidden/>
+              </w:rPr>
+              <w:t>7</w:t>
             </w:r>
             <w:r>
               <w:rPr>
@@ -845,7 +1217,7 @@
               <w14:ligatures w14:val="standardContextual"/>
             </w:rPr>
           </w:pPr>
-          <w:hyperlink w:anchor="_Toc242119016" w:history="1">
+          <w:hyperlink w:anchor="_Toc242293217" w:history="1">
             <w:r>
               <w:rPr>
                 <w:rStyle w:val="Hipervnculo"/>
@@ -891,7 +1263,7 @@
                 <w:noProof/>
                 <w:webHidden/>
               </w:rPr>
-              <w:instrText xml:space="preserve"> PAGEREF _Toc242119016 \h </w:instrText>
+              <w:instrText xml:space="preserve"> PAGEREF _Toc242293217 \h </w:instrText>
             </w:r>
             <w:r>
               <w:rPr>
@@ -911,7 +1283,7 @@
                 <w:noProof/>
                 <w:webHidden/>
               </w:rPr>
-              <w:t>5</w:t>
+              <w:t>8</w:t>
             </w:r>
             <w:r>
               <w:rPr>
@@ -938,7 +1310,7 @@
               <w14:ligatures w14:val="standardContextual"/>
             </w:rPr>
           </w:pPr>
-          <w:hyperlink w:anchor="_Toc242119017" w:history="1">
+          <w:hyperlink w:anchor="_Toc242293218" w:history="1">
             <w:r>
               <w:rPr>
                 <w:rStyle w:val="Hipervnculo"/>
@@ -965,7 +1337,7 @@
                 <w:noProof/>
                 <w:webHidden/>
               </w:rPr>
-              <w:instrText xml:space="preserve"> PAGEREF _Toc242119017 \h </w:instrText>
+              <w:instrText xml:space="preserve"> PAGEREF _Toc242293218 \h </w:instrText>
             </w:r>
             <w:r>
               <w:rPr>
@@ -985,7 +1357,7 @@
                 <w:noProof/>
                 <w:webHidden/>
               </w:rPr>
-              <w:t>5</w:t>
+              <w:t>8</w:t>
             </w:r>
             <w:r>
               <w:rPr>
@@ -1013,7 +1385,7 @@
               <w14:ligatures w14:val="standardContextual"/>
             </w:rPr>
           </w:pPr>
-          <w:hyperlink w:anchor="_Toc242119018" w:history="1">
+          <w:hyperlink w:anchor="_Toc242293219" w:history="1">
             <w:r>
               <w:rPr>
                 <w:rStyle w:val="Hipervnculo"/>
@@ -1059,7 +1431,7 @@
                 <w:noProof/>
                 <w:webHidden/>
               </w:rPr>
-              <w:instrText xml:space="preserve"> PAGEREF _Toc242119018 \h </w:instrText>
+              <w:instrText xml:space="preserve"> PAGEREF _Toc242293219 \h </w:instrText>
             </w:r>
             <w:r>
               <w:rPr>
@@ -1079,7 +1451,7 @@
                 <w:noProof/>
                 <w:webHidden/>
               </w:rPr>
-              <w:t>6</w:t>
+              <w:t>9</w:t>
             </w:r>
             <w:r>
               <w:rPr>
@@ -1106,7 +1478,7 @@
               <w14:ligatures w14:val="standardContextual"/>
             </w:rPr>
           </w:pPr>
-          <w:hyperlink w:anchor="_Toc242119019" w:history="1">
+          <w:hyperlink w:anchor="_Toc242293220" w:history="1">
             <w:r>
               <w:rPr>
                 <w:rStyle w:val="Hipervnculo"/>
@@ -1133,7 +1505,7 @@
                 <w:noProof/>
                 <w:webHidden/>
               </w:rPr>
-              <w:instrText xml:space="preserve"> PAGEREF _Toc242119019 \h </w:instrText>
+              <w:instrText xml:space="preserve"> PAGEREF _Toc242293220 \h </w:instrText>
             </w:r>
             <w:r>
               <w:rPr>
@@ -1153,7 +1525,7 @@
                 <w:noProof/>
                 <w:webHidden/>
               </w:rPr>
-              <w:t>6</w:t>
+              <w:t>9</w:t>
             </w:r>
             <w:r>
               <w:rPr>
@@ -1198,19 +1570,18 @@
           <w:numId w:val="11"/>
         </w:numPr>
       </w:pPr>
-      <w:bookmarkStart w:id="0" w:name="_Toc242119011"/>
+      <w:bookmarkStart w:id="1" w:name="_Toc242293207"/>
       <w:r>
         <w:lastRenderedPageBreak/>
         <w:t>Configurar la MV que hace la función de Proxy HTTP</w:t>
       </w:r>
-      <w:bookmarkEnd w:id="0"/>
+      <w:bookmarkEnd w:id="1"/>
     </w:p>
     <w:p>
       <w:pPr>
         <w:spacing w:before="240"/>
         <w:ind w:left="0"/>
       </w:pPr>
-      <w:bookmarkStart w:id="1" w:name="_Toc242119012"/>
       <w:r>
         <w:t xml:space="preserve">En esta primera parte, procederemos a instalar y configurar el servidor web </w:t>
       </w:r>
@@ -1228,22 +1599,22 @@
         <w:pStyle w:val="Ttulo2"/>
         <w:ind w:left="0"/>
       </w:pPr>
+      <w:bookmarkStart w:id="2" w:name="_Toc242293208"/>
       <w:r>
         <w:t xml:space="preserve">Paso 1: </w:t>
       </w:r>
-      <w:bookmarkStart w:id="2" w:name="_l30242tk01ug" w:colFirst="0" w:colLast="0"/>
-      <w:bookmarkEnd w:id="1"/>
+      <w:bookmarkStart w:id="3" w:name="_l30242tk01ug" w:colFirst="0" w:colLast="0"/>
+      <w:bookmarkEnd w:id="3"/>
+      <w:r>
+        <w:t>Actualización del sistema e instalación de paquetes</w:t>
+      </w:r>
       <w:bookmarkEnd w:id="2"/>
-      <w:r>
-        <w:t>Actualización del sistema e instalación de paquetes</w:t>
-      </w:r>
     </w:p>
     <w:p>
       <w:pPr>
         <w:spacing w:before="240"/>
         <w:ind w:left="0"/>
       </w:pPr>
-      <w:bookmarkStart w:id="3" w:name="_Toc242119013"/>
       <w:r>
         <w:t xml:space="preserve">Antes de instalar nuevos servicios, actualizamos la lista de paquetes disponibles en el sistema utilizando el comando sudo </w:t>
       </w:r>
@@ -1323,7 +1694,6 @@
         </w:drawing>
       </w:r>
     </w:p>
-    <w:bookmarkEnd w:id="3"/>
     <w:p>
       <w:pPr>
         <w:spacing w:before="240"/>
@@ -1470,6 +1840,7 @@
         <w:pStyle w:val="Ttulo2"/>
         <w:ind w:left="0"/>
       </w:pPr>
+      <w:bookmarkStart w:id="4" w:name="_Toc242293209"/>
       <w:r>
         <w:t xml:space="preserve">Paso </w:t>
       </w:r>
@@ -1499,6 +1870,7 @@
         </w:rPr>
         <w:t xml:space="preserve"> como Proxy Inverso</w:t>
       </w:r>
+      <w:bookmarkEnd w:id="4"/>
     </w:p>
     <w:p>
       <w:pPr>
@@ -1671,6 +2043,7 @@
         <w:rPr>
           <w:lang w:val="es-ES"/>
         </w:rPr>
+        <w:lastRenderedPageBreak/>
         <w:t xml:space="preserve">Dentro de este archivo, editamos el bloque server que escucha en el puerto 80. Específicamente, configuramos la directiva </w:t>
       </w:r>
       <w:proofErr w:type="spellStart"/>
@@ -1944,6 +2317,7 @@
           <w:lang w:val="es"/>
         </w:rPr>
       </w:pPr>
+      <w:bookmarkStart w:id="5" w:name="_Toc242293210"/>
       <w:r>
         <w:t xml:space="preserve">Paso </w:t>
       </w:r>
@@ -1970,6 +2344,7 @@
         </w:rPr>
         <w:t>Verificación de sintaxis y reinicio del servicio</w:t>
       </w:r>
+      <w:bookmarkEnd w:id="5"/>
     </w:p>
     <w:p>
       <w:pPr>
@@ -2231,6 +2606,7 @@
         <w:pStyle w:val="Ttulo2"/>
         <w:ind w:left="0"/>
       </w:pPr>
+      <w:bookmarkStart w:id="6" w:name="_Toc242293211"/>
       <w:r>
         <w:t xml:space="preserve">Paso </w:t>
       </w:r>
@@ -2264,6 +2640,7 @@
         </w:rPr>
         <w:t>Nginx</w:t>
       </w:r>
+      <w:bookmarkEnd w:id="6"/>
       <w:proofErr w:type="spellEnd"/>
     </w:p>
     <w:p>
@@ -2363,8 +2740,9 @@
           <w:numId w:val="11"/>
         </w:numPr>
       </w:pPr>
-      <w:bookmarkStart w:id="4" w:name="_Toc242119014"/>
-      <w:r>
+      <w:bookmarkStart w:id="7" w:name="_Toc242293212"/>
+      <w:r>
+        <w:lastRenderedPageBreak/>
         <w:t xml:space="preserve">Configuración del servidor </w:t>
       </w:r>
       <w:proofErr w:type="spellStart"/>
@@ -2379,19 +2757,8 @@
       <w:r>
         <w:t>NodeJS</w:t>
       </w:r>
-      <w:bookmarkEnd w:id="4"/>
+      <w:bookmarkEnd w:id="7"/>
       <w:proofErr w:type="spellEnd"/>
-    </w:p>
-    <w:p>
-      <w:pPr>
-        <w:pStyle w:val="Ttulo2"/>
-        <w:ind w:left="0"/>
-      </w:pPr>
-      <w:bookmarkStart w:id="5" w:name="_Toc242119015"/>
-      <w:r>
-        <w:t>Paso 1: Creación y configuración de la máquina Proxy</w:t>
-      </w:r>
-      <w:bookmarkEnd w:id="5"/>
     </w:p>
     <w:p>
       <w:pPr>
@@ -2402,14 +2769,57 @@
           <w:lang w:val="es-ES"/>
         </w:rPr>
       </w:pPr>
+      <w:r>
+        <w:rPr>
+          <w:lang w:val="es-ES"/>
+        </w:rPr>
+        <w:t xml:space="preserve">En este apartado se despliega la aplicación de prueba </w:t>
+      </w:r>
       <w:proofErr w:type="spellStart"/>
       <w:r>
         <w:rPr>
           <w:lang w:val="es-ES"/>
         </w:rPr>
-        <w:t>aaa</w:t>
+        <w:t>express-start</w:t>
       </w:r>
       <w:proofErr w:type="spellEnd"/>
+      <w:r>
+        <w:rPr>
+          <w:lang w:val="es-ES"/>
+        </w:rPr>
+        <w:t xml:space="preserve"> en la máquina </w:t>
+      </w:r>
+      <w:proofErr w:type="spellStart"/>
+      <w:r>
+        <w:rPr>
+          <w:lang w:val="es-ES"/>
+        </w:rPr>
+        <w:t>backend</w:t>
+      </w:r>
+      <w:proofErr w:type="spellEnd"/>
+      <w:r>
+        <w:rPr>
+          <w:lang w:val="es-ES"/>
+        </w:rPr>
+        <w:t>. Se configurará para que escuche en el puerto 3000 y se ejecutará de forma persistente como un servicio del sistema.</w:t>
+      </w:r>
+    </w:p>
+    <w:p>
+      <w:pPr>
+        <w:pStyle w:val="Ttulo2"/>
+        <w:ind w:left="0"/>
+      </w:pPr>
+      <w:bookmarkStart w:id="8" w:name="_Toc242293213"/>
+      <w:r>
+        <w:t xml:space="preserve">Paso 1: </w:t>
+      </w:r>
+      <w:r>
+        <w:rPr>
+          <w:lang w:val="es"/>
+        </w:rPr>
+        <w:t>Acceso temporal a internet e instalación de dependencias</w:t>
+      </w:r>
+      <w:bookmarkEnd w:id="8"/>
     </w:p>
     <w:p>
       <w:pPr>
@@ -2417,6 +2827,1146 @@
         <w:ind w:left="0"/>
         <w:jc w:val="left"/>
       </w:pPr>
+      <w:r>
+        <w:t xml:space="preserve">Dado que la máquina virtual del </w:t>
+      </w:r>
+      <w:proofErr w:type="spellStart"/>
+      <w:r>
+        <w:t>backend</w:t>
+      </w:r>
+      <w:proofErr w:type="spellEnd"/>
+      <w:r>
+        <w:t xml:space="preserve"> se encuentra en una red interna sin salida directa a internet, es necesario habilitar temporalmente una interfaz conectada a la red externa (en este caso, ens9). Se levanta la interfaz y se solicita una dirección IP mediante DHCP: </w:t>
+      </w:r>
+    </w:p>
+    <w:p>
+      <w:pPr>
+        <w:spacing w:after="160" w:line="259" w:lineRule="auto"/>
+        <w:ind w:left="0"/>
+        <w:jc w:val="center"/>
+      </w:pPr>
+      <w:r>
+        <w:rPr>
+          <w:noProof/>
+        </w:rPr>
+        <w:drawing>
+          <wp:inline distT="0" distB="0" distL="0" distR="0" wp14:anchorId="493AC632" wp14:editId="3D1B74B5">
+            <wp:extent cx="4566601" cy="2564310"/>
+            <wp:effectExtent l="0" t="0" r="5715" b="7620"/>
+            <wp:docPr id="1" name="Imagen 1"/>
+            <wp:cNvGraphicFramePr>
+              <a:graphicFrameLocks xmlns:a="http://schemas.openxmlformats.org/drawingml/2006/main" noChangeAspect="1"/>
+            </wp:cNvGraphicFramePr>
+            <a:graphic xmlns:a="http://schemas.openxmlformats.org/drawingml/2006/main">
+              <a:graphicData uri="http://schemas.openxmlformats.org/drawingml/2006/picture">
+                <pic:pic xmlns:pic="http://schemas.openxmlformats.org/drawingml/2006/picture">
+                  <pic:nvPicPr>
+                    <pic:cNvPr id="0" name="Picture 1"/>
+                    <pic:cNvPicPr>
+                      <a:picLocks noChangeAspect="1" noChangeArrowheads="1"/>
+                    </pic:cNvPicPr>
+                  </pic:nvPicPr>
+                  <pic:blipFill>
+                    <a:blip r:embed="rId14" cstate="print">
+                      <a:extLst>
+                        <a:ext uri="{28A0092B-C50C-407E-A947-70E740481C1C}">
+                          <a14:useLocalDpi xmlns:a14="http://schemas.microsoft.com/office/drawing/2010/main" val="0"/>
+                        </a:ext>
+                      </a:extLst>
+                    </a:blip>
+                    <a:srcRect/>
+                    <a:stretch>
+                      <a:fillRect/>
+                    </a:stretch>
+                  </pic:blipFill>
+                  <pic:spPr bwMode="auto">
+                    <a:xfrm>
+                      <a:off x="0" y="0"/>
+                      <a:ext cx="4571832" cy="2567247"/>
+                    </a:xfrm>
+                    <a:prstGeom prst="rect">
+                      <a:avLst/>
+                    </a:prstGeom>
+                    <a:noFill/>
+                    <a:ln>
+                      <a:noFill/>
+                    </a:ln>
+                  </pic:spPr>
+                </pic:pic>
+              </a:graphicData>
+            </a:graphic>
+          </wp:inline>
+        </w:drawing>
+      </w:r>
+    </w:p>
+    <w:p>
+      <w:pPr>
+        <w:spacing w:after="160" w:line="259" w:lineRule="auto"/>
+        <w:ind w:left="0"/>
+      </w:pPr>
+      <w:r>
+        <w:t>A continuación, actualizamos los repositorios e instalamos herramientas básicas (</w:t>
+      </w:r>
+      <w:proofErr w:type="spellStart"/>
+      <w:r>
+        <w:t>curl</w:t>
+      </w:r>
+      <w:proofErr w:type="spellEnd"/>
+      <w:r>
+        <w:t xml:space="preserve"> y </w:t>
+      </w:r>
+      <w:proofErr w:type="spellStart"/>
+      <w:r>
+        <w:t>git</w:t>
+      </w:r>
+      <w:proofErr w:type="spellEnd"/>
+      <w:r>
+        <w:t xml:space="preserve">). Además, añadimos el repositorio oficial de </w:t>
+      </w:r>
+      <w:proofErr w:type="spellStart"/>
+      <w:r>
+        <w:t>NodeSource</w:t>
+      </w:r>
+      <w:proofErr w:type="spellEnd"/>
+      <w:r>
+        <w:t xml:space="preserve"> para instalar la versión 20 LTS de </w:t>
+      </w:r>
+      <w:proofErr w:type="spellStart"/>
+      <w:r>
+        <w:t>NodeJS</w:t>
+      </w:r>
+      <w:proofErr w:type="spellEnd"/>
+      <w:r>
+        <w:t xml:space="preserve">, ya que la incluida por defecto en los repositorios de Debian está desactualizada. </w:t>
+      </w:r>
+    </w:p>
+    <w:p>
+      <w:pPr>
+        <w:spacing w:after="160" w:line="259" w:lineRule="auto"/>
+        <w:ind w:left="0"/>
+        <w:jc w:val="center"/>
+      </w:pPr>
+      <w:r>
+        <w:rPr>
+          <w:noProof/>
+        </w:rPr>
+        <w:drawing>
+          <wp:inline distT="0" distB="0" distL="0" distR="0" wp14:anchorId="768CF882" wp14:editId="19269528">
+            <wp:extent cx="2562225" cy="189865"/>
+            <wp:effectExtent l="0" t="0" r="9525" b="635"/>
+            <wp:docPr id="5" name="Imagen 5"/>
+            <wp:cNvGraphicFramePr>
+              <a:graphicFrameLocks xmlns:a="http://schemas.openxmlformats.org/drawingml/2006/main" noChangeAspect="1"/>
+            </wp:cNvGraphicFramePr>
+            <a:graphic xmlns:a="http://schemas.openxmlformats.org/drawingml/2006/main">
+              <a:graphicData uri="http://schemas.openxmlformats.org/drawingml/2006/picture">
+                <pic:pic xmlns:pic="http://schemas.openxmlformats.org/drawingml/2006/picture">
+                  <pic:nvPicPr>
+                    <pic:cNvPr id="0" name="Picture 2"/>
+                    <pic:cNvPicPr>
+                      <a:picLocks noChangeAspect="1" noChangeArrowheads="1"/>
+                    </pic:cNvPicPr>
+                  </pic:nvPicPr>
+                  <pic:blipFill>
+                    <a:blip r:embed="rId15">
+                      <a:extLst>
+                        <a:ext uri="{28A0092B-C50C-407E-A947-70E740481C1C}">
+                          <a14:useLocalDpi xmlns:a14="http://schemas.microsoft.com/office/drawing/2010/main" val="0"/>
+                        </a:ext>
+                      </a:extLst>
+                    </a:blip>
+                    <a:srcRect/>
+                    <a:stretch>
+                      <a:fillRect/>
+                    </a:stretch>
+                  </pic:blipFill>
+                  <pic:spPr bwMode="auto">
+                    <a:xfrm>
+                      <a:off x="0" y="0"/>
+                      <a:ext cx="2562225" cy="189865"/>
+                    </a:xfrm>
+                    <a:prstGeom prst="rect">
+                      <a:avLst/>
+                    </a:prstGeom>
+                    <a:noFill/>
+                    <a:ln>
+                      <a:noFill/>
+                    </a:ln>
+                  </pic:spPr>
+                </pic:pic>
+              </a:graphicData>
+            </a:graphic>
+          </wp:inline>
+        </w:drawing>
+      </w:r>
+    </w:p>
+    <w:p>
+      <w:pPr>
+        <w:spacing w:after="160" w:line="259" w:lineRule="auto"/>
+        <w:ind w:left="0"/>
+        <w:jc w:val="center"/>
+      </w:pPr>
+      <w:r>
+        <w:rPr>
+          <w:noProof/>
+        </w:rPr>
+        <w:drawing>
+          <wp:inline distT="0" distB="0" distL="0" distR="0" wp14:anchorId="30FBC8FB" wp14:editId="1377B194">
+            <wp:extent cx="3528060" cy="189865"/>
+            <wp:effectExtent l="0" t="0" r="0" b="635"/>
+            <wp:docPr id="6" name="Imagen 6"/>
+            <wp:cNvGraphicFramePr>
+              <a:graphicFrameLocks xmlns:a="http://schemas.openxmlformats.org/drawingml/2006/main" noChangeAspect="1"/>
+            </wp:cNvGraphicFramePr>
+            <a:graphic xmlns:a="http://schemas.openxmlformats.org/drawingml/2006/main">
+              <a:graphicData uri="http://schemas.openxmlformats.org/drawingml/2006/picture">
+                <pic:pic xmlns:pic="http://schemas.openxmlformats.org/drawingml/2006/picture">
+                  <pic:nvPicPr>
+                    <pic:cNvPr id="0" name="Picture 3"/>
+                    <pic:cNvPicPr>
+                      <a:picLocks noChangeAspect="1" noChangeArrowheads="1"/>
+                    </pic:cNvPicPr>
+                  </pic:nvPicPr>
+                  <pic:blipFill>
+                    <a:blip r:embed="rId16">
+                      <a:extLst>
+                        <a:ext uri="{28A0092B-C50C-407E-A947-70E740481C1C}">
+                          <a14:useLocalDpi xmlns:a14="http://schemas.microsoft.com/office/drawing/2010/main" val="0"/>
+                        </a:ext>
+                      </a:extLst>
+                    </a:blip>
+                    <a:srcRect/>
+                    <a:stretch>
+                      <a:fillRect/>
+                    </a:stretch>
+                  </pic:blipFill>
+                  <pic:spPr bwMode="auto">
+                    <a:xfrm>
+                      <a:off x="0" y="0"/>
+                      <a:ext cx="3528060" cy="189865"/>
+                    </a:xfrm>
+                    <a:prstGeom prst="rect">
+                      <a:avLst/>
+                    </a:prstGeom>
+                    <a:noFill/>
+                    <a:ln>
+                      <a:noFill/>
+                    </a:ln>
+                  </pic:spPr>
+                </pic:pic>
+              </a:graphicData>
+            </a:graphic>
+          </wp:inline>
+        </w:drawing>
+      </w:r>
+    </w:p>
+    <w:p>
+      <w:pPr>
+        <w:spacing w:after="160" w:line="259" w:lineRule="auto"/>
+        <w:ind w:left="0"/>
+        <w:jc w:val="center"/>
+      </w:pPr>
+      <w:r>
+        <w:rPr>
+          <w:noProof/>
+        </w:rPr>
+        <w:drawing>
+          <wp:inline distT="0" distB="0" distL="0" distR="0" wp14:anchorId="720F9F95" wp14:editId="54CAFDA6">
+            <wp:extent cx="5400040" cy="180975"/>
+            <wp:effectExtent l="0" t="0" r="0" b="9525"/>
+            <wp:docPr id="7" name="Imagen 7"/>
+            <wp:cNvGraphicFramePr>
+              <a:graphicFrameLocks xmlns:a="http://schemas.openxmlformats.org/drawingml/2006/main" noChangeAspect="1"/>
+            </wp:cNvGraphicFramePr>
+            <a:graphic xmlns:a="http://schemas.openxmlformats.org/drawingml/2006/main">
+              <a:graphicData uri="http://schemas.openxmlformats.org/drawingml/2006/picture">
+                <pic:pic xmlns:pic="http://schemas.openxmlformats.org/drawingml/2006/picture">
+                  <pic:nvPicPr>
+                    <pic:cNvPr id="0" name="Picture 4"/>
+                    <pic:cNvPicPr>
+                      <a:picLocks noChangeAspect="1" noChangeArrowheads="1"/>
+                    </pic:cNvPicPr>
+                  </pic:nvPicPr>
+                  <pic:blipFill>
+                    <a:blip r:embed="rId17">
+                      <a:extLst>
+                        <a:ext uri="{28A0092B-C50C-407E-A947-70E740481C1C}">
+                          <a14:useLocalDpi xmlns:a14="http://schemas.microsoft.com/office/drawing/2010/main" val="0"/>
+                        </a:ext>
+                      </a:extLst>
+                    </a:blip>
+                    <a:srcRect/>
+                    <a:stretch>
+                      <a:fillRect/>
+                    </a:stretch>
+                  </pic:blipFill>
+                  <pic:spPr bwMode="auto">
+                    <a:xfrm>
+                      <a:off x="0" y="0"/>
+                      <a:ext cx="5400040" cy="180975"/>
+                    </a:xfrm>
+                    <a:prstGeom prst="rect">
+                      <a:avLst/>
+                    </a:prstGeom>
+                    <a:noFill/>
+                    <a:ln>
+                      <a:noFill/>
+                    </a:ln>
+                  </pic:spPr>
+                </pic:pic>
+              </a:graphicData>
+            </a:graphic>
+          </wp:inline>
+        </w:drawing>
+      </w:r>
+    </w:p>
+    <w:p>
+      <w:pPr>
+        <w:spacing w:after="160" w:line="259" w:lineRule="auto"/>
+        <w:ind w:left="0"/>
+        <w:jc w:val="center"/>
+      </w:pPr>
+      <w:r>
+        <w:rPr>
+          <w:noProof/>
+        </w:rPr>
+        <w:drawing>
+          <wp:inline distT="0" distB="0" distL="0" distR="0" wp14:anchorId="408BBE4F" wp14:editId="4C10BD22">
+            <wp:extent cx="3476625" cy="310515"/>
+            <wp:effectExtent l="0" t="0" r="9525" b="0"/>
+            <wp:docPr id="9" name="Imagen 9"/>
+            <wp:cNvGraphicFramePr>
+              <a:graphicFrameLocks xmlns:a="http://schemas.openxmlformats.org/drawingml/2006/main" noChangeAspect="1"/>
+            </wp:cNvGraphicFramePr>
+            <a:graphic xmlns:a="http://schemas.openxmlformats.org/drawingml/2006/main">
+              <a:graphicData uri="http://schemas.openxmlformats.org/drawingml/2006/picture">
+                <pic:pic xmlns:pic="http://schemas.openxmlformats.org/drawingml/2006/picture">
+                  <pic:nvPicPr>
+                    <pic:cNvPr id="0" name="Picture 5"/>
+                    <pic:cNvPicPr>
+                      <a:picLocks noChangeAspect="1" noChangeArrowheads="1"/>
+                    </pic:cNvPicPr>
+                  </pic:nvPicPr>
+                  <pic:blipFill>
+                    <a:blip r:embed="rId18">
+                      <a:extLst>
+                        <a:ext uri="{28A0092B-C50C-407E-A947-70E740481C1C}">
+                          <a14:useLocalDpi xmlns:a14="http://schemas.microsoft.com/office/drawing/2010/main" val="0"/>
+                        </a:ext>
+                      </a:extLst>
+                    </a:blip>
+                    <a:srcRect/>
+                    <a:stretch>
+                      <a:fillRect/>
+                    </a:stretch>
+                  </pic:blipFill>
+                  <pic:spPr bwMode="auto">
+                    <a:xfrm>
+                      <a:off x="0" y="0"/>
+                      <a:ext cx="3476625" cy="310515"/>
+                    </a:xfrm>
+                    <a:prstGeom prst="rect">
+                      <a:avLst/>
+                    </a:prstGeom>
+                    <a:noFill/>
+                    <a:ln>
+                      <a:noFill/>
+                    </a:ln>
+                  </pic:spPr>
+                </pic:pic>
+              </a:graphicData>
+            </a:graphic>
+          </wp:inline>
+        </w:drawing>
+      </w:r>
+    </w:p>
+    <w:p>
+      <w:pPr>
+        <w:spacing w:after="160" w:line="259" w:lineRule="auto"/>
+        <w:ind w:left="0"/>
+      </w:pPr>
+      <w:r>
+        <w:t xml:space="preserve">Tras ejecutar los comandos de instalación, verificamos la versión de </w:t>
+      </w:r>
+      <w:proofErr w:type="spellStart"/>
+      <w:r>
+        <w:t>Node</w:t>
+      </w:r>
+      <w:proofErr w:type="spellEnd"/>
+      <w:r>
+        <w:t xml:space="preserve"> instalada, obteniendo la v20.20.2. </w:t>
+      </w:r>
+    </w:p>
+    <w:p>
+      <w:pPr>
+        <w:spacing w:after="160" w:line="259" w:lineRule="auto"/>
+        <w:ind w:left="0"/>
+        <w:jc w:val="center"/>
+      </w:pPr>
+      <w:r>
+        <w:rPr>
+          <w:noProof/>
+        </w:rPr>
+        <w:drawing>
+          <wp:inline distT="0" distB="0" distL="0" distR="0" wp14:anchorId="1C33C493" wp14:editId="3DA96A04">
+            <wp:extent cx="2026920" cy="344805"/>
+            <wp:effectExtent l="0" t="0" r="0" b="0"/>
+            <wp:docPr id="14" name="Imagen 14"/>
+            <wp:cNvGraphicFramePr>
+              <a:graphicFrameLocks xmlns:a="http://schemas.openxmlformats.org/drawingml/2006/main" noChangeAspect="1"/>
+            </wp:cNvGraphicFramePr>
+            <a:graphic xmlns:a="http://schemas.openxmlformats.org/drawingml/2006/main">
+              <a:graphicData uri="http://schemas.openxmlformats.org/drawingml/2006/picture">
+                <pic:pic xmlns:pic="http://schemas.openxmlformats.org/drawingml/2006/picture">
+                  <pic:nvPicPr>
+                    <pic:cNvPr id="0" name="Picture 6"/>
+                    <pic:cNvPicPr>
+                      <a:picLocks noChangeAspect="1" noChangeArrowheads="1"/>
+                    </pic:cNvPicPr>
+                  </pic:nvPicPr>
+                  <pic:blipFill>
+                    <a:blip r:embed="rId19">
+                      <a:extLst>
+                        <a:ext uri="{28A0092B-C50C-407E-A947-70E740481C1C}">
+                          <a14:useLocalDpi xmlns:a14="http://schemas.microsoft.com/office/drawing/2010/main" val="0"/>
+                        </a:ext>
+                      </a:extLst>
+                    </a:blip>
+                    <a:srcRect/>
+                    <a:stretch>
+                      <a:fillRect/>
+                    </a:stretch>
+                  </pic:blipFill>
+                  <pic:spPr bwMode="auto">
+                    <a:xfrm>
+                      <a:off x="0" y="0"/>
+                      <a:ext cx="2026920" cy="344805"/>
+                    </a:xfrm>
+                    <a:prstGeom prst="rect">
+                      <a:avLst/>
+                    </a:prstGeom>
+                    <a:noFill/>
+                    <a:ln>
+                      <a:noFill/>
+                    </a:ln>
+                  </pic:spPr>
+                </pic:pic>
+              </a:graphicData>
+            </a:graphic>
+          </wp:inline>
+        </w:drawing>
+      </w:r>
+      <w:r>
+        <w:br w:type="page"/>
+      </w:r>
+    </w:p>
+    <w:p>
+      <w:pPr>
+        <w:pStyle w:val="Ttulo2"/>
+        <w:ind w:left="0"/>
+      </w:pPr>
+      <w:bookmarkStart w:id="9" w:name="_Toc242293214"/>
+      <w:r>
+        <w:lastRenderedPageBreak/>
+        <w:t xml:space="preserve">Paso </w:t>
+      </w:r>
+      <w:r>
+        <w:t>2</w:t>
+      </w:r>
+      <w:r>
+        <w:t xml:space="preserve">: </w:t>
+      </w:r>
+      <w:r>
+        <w:rPr>
+          <w:lang w:val="es"/>
+        </w:rPr>
+        <w:t>Descarga y configuración de la aplicación</w:t>
+      </w:r>
+      <w:bookmarkEnd w:id="9"/>
+    </w:p>
+    <w:p>
+      <w:pPr>
+        <w:spacing w:after="160"/>
+        <w:ind w:left="0"/>
+      </w:pPr>
+      <w:r>
+        <w:t xml:space="preserve">Utilizando </w:t>
+      </w:r>
+      <w:proofErr w:type="spellStart"/>
+      <w:r>
+        <w:t>git</w:t>
+      </w:r>
+      <w:proofErr w:type="spellEnd"/>
+      <w:r>
+        <w:t xml:space="preserve">, clonamos el repositorio de la aplicación proporcionado para la práctica. El código fuente principal y el archivo </w:t>
+      </w:r>
+      <w:proofErr w:type="spellStart"/>
+      <w:proofErr w:type="gramStart"/>
+      <w:r>
+        <w:t>package.json</w:t>
+      </w:r>
+      <w:proofErr w:type="spellEnd"/>
+      <w:proofErr w:type="gramEnd"/>
+      <w:r>
+        <w:t xml:space="preserve"> se encuentran en el subdirectorio </w:t>
+      </w:r>
+      <w:proofErr w:type="spellStart"/>
+      <w:r>
+        <w:t>hello</w:t>
+      </w:r>
+      <w:proofErr w:type="spellEnd"/>
+      <w:r>
+        <w:t xml:space="preserve">, por lo que accedemos a él y ejecutamos </w:t>
+      </w:r>
+      <w:proofErr w:type="spellStart"/>
+      <w:r>
+        <w:t>npm</w:t>
+      </w:r>
+      <w:proofErr w:type="spellEnd"/>
+      <w:r>
+        <w:t xml:space="preserve"> </w:t>
+      </w:r>
+      <w:proofErr w:type="spellStart"/>
+      <w:r>
+        <w:t>install</w:t>
+      </w:r>
+      <w:proofErr w:type="spellEnd"/>
+      <w:r>
+        <w:t xml:space="preserve"> para descargar los módulos necesarios.</w:t>
+      </w:r>
+    </w:p>
+    <w:p>
+      <w:pPr>
+        <w:spacing w:after="160" w:line="259" w:lineRule="auto"/>
+        <w:ind w:left="0"/>
+        <w:jc w:val="center"/>
+      </w:pPr>
+      <w:r>
+        <w:rPr>
+          <w:noProof/>
+        </w:rPr>
+        <w:drawing>
+          <wp:inline distT="0" distB="0" distL="0" distR="0" wp14:anchorId="67AF6C15" wp14:editId="3F6F29C3">
+            <wp:extent cx="4735806" cy="3404278"/>
+            <wp:effectExtent l="0" t="0" r="8255" b="5715"/>
+            <wp:docPr id="15" name="Imagen 15"/>
+            <wp:cNvGraphicFramePr>
+              <a:graphicFrameLocks xmlns:a="http://schemas.openxmlformats.org/drawingml/2006/main" noChangeAspect="1"/>
+            </wp:cNvGraphicFramePr>
+            <a:graphic xmlns:a="http://schemas.openxmlformats.org/drawingml/2006/main">
+              <a:graphicData uri="http://schemas.openxmlformats.org/drawingml/2006/picture">
+                <pic:pic xmlns:pic="http://schemas.openxmlformats.org/drawingml/2006/picture">
+                  <pic:nvPicPr>
+                    <pic:cNvPr id="0" name="Picture 7"/>
+                    <pic:cNvPicPr>
+                      <a:picLocks noChangeAspect="1" noChangeArrowheads="1"/>
+                    </pic:cNvPicPr>
+                  </pic:nvPicPr>
+                  <pic:blipFill>
+                    <a:blip r:embed="rId20">
+                      <a:extLst>
+                        <a:ext uri="{28A0092B-C50C-407E-A947-70E740481C1C}">
+                          <a14:useLocalDpi xmlns:a14="http://schemas.microsoft.com/office/drawing/2010/main" val="0"/>
+                        </a:ext>
+                      </a:extLst>
+                    </a:blip>
+                    <a:srcRect/>
+                    <a:stretch>
+                      <a:fillRect/>
+                    </a:stretch>
+                  </pic:blipFill>
+                  <pic:spPr bwMode="auto">
+                    <a:xfrm>
+                      <a:off x="0" y="0"/>
+                      <a:ext cx="4741165" cy="3408130"/>
+                    </a:xfrm>
+                    <a:prstGeom prst="rect">
+                      <a:avLst/>
+                    </a:prstGeom>
+                    <a:noFill/>
+                    <a:ln>
+                      <a:noFill/>
+                    </a:ln>
+                  </pic:spPr>
+                </pic:pic>
+              </a:graphicData>
+            </a:graphic>
+          </wp:inline>
+        </w:drawing>
+      </w:r>
+    </w:p>
+    <w:p>
+      <w:pPr>
+        <w:spacing w:after="160"/>
+        <w:ind w:left="0"/>
+      </w:pPr>
+      <w:r>
+        <w:t xml:space="preserve">Por defecto, el código de la aplicación (hello.js) está configurado para arrancar en el puerto 8080. Como nuestro Proxy </w:t>
+      </w:r>
+      <w:proofErr w:type="spellStart"/>
+      <w:r>
+        <w:t>Nginx</w:t>
+      </w:r>
+      <w:proofErr w:type="spellEnd"/>
+      <w:r>
+        <w:t xml:space="preserve"> está configurado para reenviar el tráfico al puerto 3000, es necesario editar el archivo original. Modificamos la función </w:t>
+      </w:r>
+      <w:proofErr w:type="spellStart"/>
+      <w:proofErr w:type="gramStart"/>
+      <w:r>
+        <w:t>app.listen</w:t>
+      </w:r>
+      <w:proofErr w:type="spellEnd"/>
+      <w:proofErr w:type="gramEnd"/>
+      <w:r>
+        <w:t xml:space="preserve"> para que escuche en el puerto 3000 y en todas las interfaces ("0.0.0.0"), permitiendo así recibir las peticiones de la red interna.</w:t>
+      </w:r>
+    </w:p>
+    <w:p>
+      <w:pPr>
+        <w:spacing w:after="160" w:line="259" w:lineRule="auto"/>
+        <w:ind w:left="0"/>
+        <w:jc w:val="center"/>
+      </w:pPr>
+      <w:r>
+        <w:rPr>
+          <w:noProof/>
+        </w:rPr>
+        <w:drawing>
+          <wp:inline distT="0" distB="0" distL="0" distR="0" wp14:anchorId="490D6148" wp14:editId="28DF89F7">
+            <wp:extent cx="4045585" cy="233045"/>
+            <wp:effectExtent l="0" t="0" r="0" b="0"/>
+            <wp:docPr id="16" name="Imagen 16"/>
+            <wp:cNvGraphicFramePr>
+              <a:graphicFrameLocks xmlns:a="http://schemas.openxmlformats.org/drawingml/2006/main" noChangeAspect="1"/>
+            </wp:cNvGraphicFramePr>
+            <a:graphic xmlns:a="http://schemas.openxmlformats.org/drawingml/2006/main">
+              <a:graphicData uri="http://schemas.openxmlformats.org/drawingml/2006/picture">
+                <pic:pic xmlns:pic="http://schemas.openxmlformats.org/drawingml/2006/picture">
+                  <pic:nvPicPr>
+                    <pic:cNvPr id="0" name="Picture 8"/>
+                    <pic:cNvPicPr>
+                      <a:picLocks noChangeAspect="1" noChangeArrowheads="1"/>
+                    </pic:cNvPicPr>
+                  </pic:nvPicPr>
+                  <pic:blipFill>
+                    <a:blip r:embed="rId21">
+                      <a:extLst>
+                        <a:ext uri="{28A0092B-C50C-407E-A947-70E740481C1C}">
+                          <a14:useLocalDpi xmlns:a14="http://schemas.microsoft.com/office/drawing/2010/main" val="0"/>
+                        </a:ext>
+                      </a:extLst>
+                    </a:blip>
+                    <a:srcRect/>
+                    <a:stretch>
+                      <a:fillRect/>
+                    </a:stretch>
+                  </pic:blipFill>
+                  <pic:spPr bwMode="auto">
+                    <a:xfrm>
+                      <a:off x="0" y="0"/>
+                      <a:ext cx="4045585" cy="233045"/>
+                    </a:xfrm>
+                    <a:prstGeom prst="rect">
+                      <a:avLst/>
+                    </a:prstGeom>
+                    <a:noFill/>
+                    <a:ln>
+                      <a:noFill/>
+                    </a:ln>
+                  </pic:spPr>
+                </pic:pic>
+              </a:graphicData>
+            </a:graphic>
+          </wp:inline>
+        </w:drawing>
+      </w:r>
+    </w:p>
+    <w:p>
+      <w:pPr>
+        <w:spacing w:after="160" w:line="259" w:lineRule="auto"/>
+        <w:ind w:left="0"/>
+        <w:jc w:val="center"/>
+      </w:pPr>
+      <w:r>
+        <w:rPr>
+          <w:noProof/>
+        </w:rPr>
+        <w:drawing>
+          <wp:inline distT="0" distB="0" distL="0" distR="0" wp14:anchorId="61244249" wp14:editId="300BD91A">
+            <wp:extent cx="4356100" cy="396875"/>
+            <wp:effectExtent l="0" t="0" r="6350" b="3175"/>
+            <wp:docPr id="17" name="Imagen 17"/>
+            <wp:cNvGraphicFramePr>
+              <a:graphicFrameLocks xmlns:a="http://schemas.openxmlformats.org/drawingml/2006/main" noChangeAspect="1"/>
+            </wp:cNvGraphicFramePr>
+            <a:graphic xmlns:a="http://schemas.openxmlformats.org/drawingml/2006/main">
+              <a:graphicData uri="http://schemas.openxmlformats.org/drawingml/2006/picture">
+                <pic:pic xmlns:pic="http://schemas.openxmlformats.org/drawingml/2006/picture">
+                  <pic:nvPicPr>
+                    <pic:cNvPr id="0" name="Picture 9"/>
+                    <pic:cNvPicPr>
+                      <a:picLocks noChangeAspect="1" noChangeArrowheads="1"/>
+                    </pic:cNvPicPr>
+                  </pic:nvPicPr>
+                  <pic:blipFill>
+                    <a:blip r:embed="rId22">
+                      <a:extLst>
+                        <a:ext uri="{28A0092B-C50C-407E-A947-70E740481C1C}">
+                          <a14:useLocalDpi xmlns:a14="http://schemas.microsoft.com/office/drawing/2010/main" val="0"/>
+                        </a:ext>
+                      </a:extLst>
+                    </a:blip>
+                    <a:srcRect/>
+                    <a:stretch>
+                      <a:fillRect/>
+                    </a:stretch>
+                  </pic:blipFill>
+                  <pic:spPr bwMode="auto">
+                    <a:xfrm>
+                      <a:off x="0" y="0"/>
+                      <a:ext cx="4356100" cy="396875"/>
+                    </a:xfrm>
+                    <a:prstGeom prst="rect">
+                      <a:avLst/>
+                    </a:prstGeom>
+                    <a:noFill/>
+                    <a:ln>
+                      <a:noFill/>
+                    </a:ln>
+                  </pic:spPr>
+                </pic:pic>
+              </a:graphicData>
+            </a:graphic>
+          </wp:inline>
+        </w:drawing>
+      </w:r>
+    </w:p>
+    <w:p>
+      <w:pPr>
+        <w:spacing w:after="160" w:line="259" w:lineRule="auto"/>
+        <w:ind w:left="0"/>
+        <w:jc w:val="left"/>
+        <w:rPr>
+          <w:rFonts w:ascii="Montserrat Medium" w:eastAsiaTheme="majorEastAsia" w:hAnsi="Montserrat Medium" w:cstheme="majorBidi"/>
+          <w:kern w:val="2"/>
+          <w:sz w:val="24"/>
+          <w:szCs w:val="32"/>
+          <w:lang w:val="es-ES" w:eastAsia="en-US"/>
+          <w14:ligatures w14:val="standardContextual"/>
+        </w:rPr>
+      </w:pPr>
+      <w:r>
+        <w:br w:type="page"/>
+      </w:r>
+    </w:p>
+    <w:p>
+      <w:pPr>
+        <w:pStyle w:val="Ttulo2"/>
+        <w:ind w:left="0"/>
+        <w:rPr>
+          <w:lang w:val="es"/>
+        </w:rPr>
+      </w:pPr>
+      <w:bookmarkStart w:id="10" w:name="_Toc242293215"/>
+      <w:r>
+        <w:lastRenderedPageBreak/>
+        <w:t xml:space="preserve">Paso </w:t>
+      </w:r>
+      <w:r>
+        <w:t>3</w:t>
+      </w:r>
+      <w:r>
+        <w:t xml:space="preserve">: </w:t>
+      </w:r>
+      <w:r>
+        <w:rPr>
+          <w:lang w:val="es"/>
+        </w:rPr>
+        <w:t xml:space="preserve">Ejecución como servicio </w:t>
+      </w:r>
+      <w:proofErr w:type="spellStart"/>
+      <w:r>
+        <w:rPr>
+          <w:lang w:val="es"/>
+        </w:rPr>
+        <w:t>systemd</w:t>
+      </w:r>
+      <w:bookmarkEnd w:id="10"/>
+      <w:proofErr w:type="spellEnd"/>
+    </w:p>
+    <w:p>
+      <w:pPr>
+        <w:spacing w:after="160" w:line="259" w:lineRule="auto"/>
+        <w:ind w:left="0"/>
+      </w:pPr>
+      <w:r>
+        <w:t>Para garantizar la disponibilidad de la aplicación independientemente de las sesiones de terminal y asegurar su arranque automático tras reiniciar la máquina, creamos un archivo de servicio en /</w:t>
+      </w:r>
+      <w:proofErr w:type="spellStart"/>
+      <w:r>
+        <w:t>etc</w:t>
+      </w:r>
+      <w:proofErr w:type="spellEnd"/>
+      <w:r>
+        <w:t>/</w:t>
+      </w:r>
+      <w:proofErr w:type="spellStart"/>
+      <w:r>
+        <w:t>systemd</w:t>
+      </w:r>
+      <w:proofErr w:type="spellEnd"/>
+      <w:r>
+        <w:t>/</w:t>
+      </w:r>
+      <w:proofErr w:type="spellStart"/>
+      <w:r>
+        <w:t>system</w:t>
+      </w:r>
+      <w:proofErr w:type="spellEnd"/>
+      <w:r>
+        <w:t>/</w:t>
+      </w:r>
+      <w:proofErr w:type="spellStart"/>
+      <w:r>
+        <w:t>express-start.service</w:t>
+      </w:r>
+      <w:proofErr w:type="spellEnd"/>
+      <w:r>
+        <w:t>.</w:t>
+      </w:r>
+    </w:p>
+    <w:p>
+      <w:pPr>
+        <w:spacing w:after="160" w:line="259" w:lineRule="auto"/>
+        <w:ind w:left="0"/>
+        <w:jc w:val="center"/>
+      </w:pPr>
+      <w:r>
+        <w:rPr>
+          <w:noProof/>
+        </w:rPr>
+        <w:drawing>
+          <wp:inline distT="0" distB="0" distL="0" distR="0" wp14:anchorId="6FE75D39" wp14:editId="02C44C4D">
+            <wp:extent cx="5850074" cy="112131"/>
+            <wp:effectExtent l="0" t="0" r="0" b="2540"/>
+            <wp:docPr id="18" name="Imagen 18"/>
+            <wp:cNvGraphicFramePr>
+              <a:graphicFrameLocks xmlns:a="http://schemas.openxmlformats.org/drawingml/2006/main" noChangeAspect="1"/>
+            </wp:cNvGraphicFramePr>
+            <a:graphic xmlns:a="http://schemas.openxmlformats.org/drawingml/2006/main">
+              <a:graphicData uri="http://schemas.openxmlformats.org/drawingml/2006/picture">
+                <pic:pic xmlns:pic="http://schemas.openxmlformats.org/drawingml/2006/picture">
+                  <pic:nvPicPr>
+                    <pic:cNvPr id="0" name="Picture 10"/>
+                    <pic:cNvPicPr>
+                      <a:picLocks noChangeAspect="1" noChangeArrowheads="1"/>
+                    </pic:cNvPicPr>
+                  </pic:nvPicPr>
+                  <pic:blipFill>
+                    <a:blip r:embed="rId23">
+                      <a:extLst>
+                        <a:ext uri="{28A0092B-C50C-407E-A947-70E740481C1C}">
+                          <a14:useLocalDpi xmlns:a14="http://schemas.microsoft.com/office/drawing/2010/main" val="0"/>
+                        </a:ext>
+                      </a:extLst>
+                    </a:blip>
+                    <a:srcRect/>
+                    <a:stretch>
+                      <a:fillRect/>
+                    </a:stretch>
+                  </pic:blipFill>
+                  <pic:spPr bwMode="auto">
+                    <a:xfrm>
+                      <a:off x="0" y="0"/>
+                      <a:ext cx="6076361" cy="116468"/>
+                    </a:xfrm>
+                    <a:prstGeom prst="rect">
+                      <a:avLst/>
+                    </a:prstGeom>
+                    <a:noFill/>
+                    <a:ln>
+                      <a:noFill/>
+                    </a:ln>
+                  </pic:spPr>
+                </pic:pic>
+              </a:graphicData>
+            </a:graphic>
+          </wp:inline>
+        </w:drawing>
+      </w:r>
+    </w:p>
+    <w:p>
+      <w:pPr>
+        <w:spacing w:after="160" w:line="259" w:lineRule="auto"/>
+        <w:ind w:left="0"/>
+        <w:jc w:val="center"/>
+      </w:pPr>
+      <w:r>
+        <w:rPr>
+          <w:noProof/>
+        </w:rPr>
+        <w:drawing>
+          <wp:inline distT="0" distB="0" distL="0" distR="0" wp14:anchorId="2ED4B45E" wp14:editId="3118472D">
+            <wp:extent cx="4123690" cy="2009775"/>
+            <wp:effectExtent l="0" t="0" r="0" b="9525"/>
+            <wp:docPr id="19" name="Imagen 19"/>
+            <wp:cNvGraphicFramePr>
+              <a:graphicFrameLocks xmlns:a="http://schemas.openxmlformats.org/drawingml/2006/main" noChangeAspect="1"/>
+            </wp:cNvGraphicFramePr>
+            <a:graphic xmlns:a="http://schemas.openxmlformats.org/drawingml/2006/main">
+              <a:graphicData uri="http://schemas.openxmlformats.org/drawingml/2006/picture">
+                <pic:pic xmlns:pic="http://schemas.openxmlformats.org/drawingml/2006/picture">
+                  <pic:nvPicPr>
+                    <pic:cNvPr id="0" name="Picture 11"/>
+                    <pic:cNvPicPr>
+                      <a:picLocks noChangeAspect="1" noChangeArrowheads="1"/>
+                    </pic:cNvPicPr>
+                  </pic:nvPicPr>
+                  <pic:blipFill>
+                    <a:blip r:embed="rId24">
+                      <a:extLst>
+                        <a:ext uri="{28A0092B-C50C-407E-A947-70E740481C1C}">
+                          <a14:useLocalDpi xmlns:a14="http://schemas.microsoft.com/office/drawing/2010/main" val="0"/>
+                        </a:ext>
+                      </a:extLst>
+                    </a:blip>
+                    <a:srcRect/>
+                    <a:stretch>
+                      <a:fillRect/>
+                    </a:stretch>
+                  </pic:blipFill>
+                  <pic:spPr bwMode="auto">
+                    <a:xfrm>
+                      <a:off x="0" y="0"/>
+                      <a:ext cx="4123690" cy="2009775"/>
+                    </a:xfrm>
+                    <a:prstGeom prst="rect">
+                      <a:avLst/>
+                    </a:prstGeom>
+                    <a:noFill/>
+                    <a:ln>
+                      <a:noFill/>
+                    </a:ln>
+                  </pic:spPr>
+                </pic:pic>
+              </a:graphicData>
+            </a:graphic>
+          </wp:inline>
+        </w:drawing>
+      </w:r>
+    </w:p>
+    <w:p>
+      <w:pPr>
+        <w:spacing w:after="160" w:line="259" w:lineRule="auto"/>
+        <w:ind w:left="0"/>
+      </w:pPr>
+      <w:r>
+        <w:t xml:space="preserve">Una vez definido el servicio con sus correspondientes rutas y usuario, recargamos los demonios de </w:t>
+      </w:r>
+      <w:proofErr w:type="spellStart"/>
+      <w:r>
+        <w:t>systemd</w:t>
+      </w:r>
+      <w:proofErr w:type="spellEnd"/>
+      <w:r>
+        <w:t>, habilitamos el servicio para que inicie con el sistema y lo arrancamos. Al verificar su estado, confirmamos que se encuentra active (running) y escuchando peticiones en el puerto 3000.</w:t>
+      </w:r>
+    </w:p>
+    <w:p>
+      <w:pPr>
+        <w:spacing w:after="160" w:line="259" w:lineRule="auto"/>
+        <w:ind w:left="0"/>
+        <w:jc w:val="center"/>
+      </w:pPr>
+      <w:r>
+        <w:rPr>
+          <w:noProof/>
+        </w:rPr>
+        <w:drawing>
+          <wp:inline distT="0" distB="0" distL="0" distR="0" wp14:anchorId="42F240DF" wp14:editId="2F77C91C">
+            <wp:extent cx="5391785" cy="1276985"/>
+            <wp:effectExtent l="0" t="0" r="0" b="0"/>
+            <wp:docPr id="20" name="Imagen 20"/>
+            <wp:cNvGraphicFramePr>
+              <a:graphicFrameLocks xmlns:a="http://schemas.openxmlformats.org/drawingml/2006/main" noChangeAspect="1"/>
+            </wp:cNvGraphicFramePr>
+            <a:graphic xmlns:a="http://schemas.openxmlformats.org/drawingml/2006/main">
+              <a:graphicData uri="http://schemas.openxmlformats.org/drawingml/2006/picture">
+                <pic:pic xmlns:pic="http://schemas.openxmlformats.org/drawingml/2006/picture">
+                  <pic:nvPicPr>
+                    <pic:cNvPr id="0" name="Picture 12"/>
+                    <pic:cNvPicPr>
+                      <a:picLocks noChangeAspect="1" noChangeArrowheads="1"/>
+                    </pic:cNvPicPr>
+                  </pic:nvPicPr>
+                  <pic:blipFill>
+                    <a:blip r:embed="rId25">
+                      <a:extLst>
+                        <a:ext uri="{28A0092B-C50C-407E-A947-70E740481C1C}">
+                          <a14:useLocalDpi xmlns:a14="http://schemas.microsoft.com/office/drawing/2010/main" val="0"/>
+                        </a:ext>
+                      </a:extLst>
+                    </a:blip>
+                    <a:srcRect/>
+                    <a:stretch>
+                      <a:fillRect/>
+                    </a:stretch>
+                  </pic:blipFill>
+                  <pic:spPr bwMode="auto">
+                    <a:xfrm>
+                      <a:off x="0" y="0"/>
+                      <a:ext cx="5391785" cy="1276985"/>
+                    </a:xfrm>
+                    <a:prstGeom prst="rect">
+                      <a:avLst/>
+                    </a:prstGeom>
+                    <a:noFill/>
+                    <a:ln>
+                      <a:noFill/>
+                    </a:ln>
+                  </pic:spPr>
+                </pic:pic>
+              </a:graphicData>
+            </a:graphic>
+          </wp:inline>
+        </w:drawing>
+      </w:r>
+    </w:p>
+    <w:p>
+      <w:pPr>
+        <w:pStyle w:val="Ttulo2"/>
+        <w:ind w:left="0"/>
+        <w:rPr>
+          <w:lang w:val="es"/>
+        </w:rPr>
+      </w:pPr>
+      <w:bookmarkStart w:id="11" w:name="_Toc242293216"/>
+      <w:r>
+        <w:t xml:space="preserve">Paso </w:t>
+      </w:r>
+      <w:r>
+        <w:t>4</w:t>
+      </w:r>
+      <w:r>
+        <w:t xml:space="preserve">: </w:t>
+      </w:r>
+      <w:r>
+        <w:rPr>
+          <w:lang w:val="es"/>
+        </w:rPr>
+        <w:t>Verificación final desde el Proxy</w:t>
+      </w:r>
+      <w:bookmarkEnd w:id="11"/>
+    </w:p>
+    <w:p>
+      <w:pPr>
+        <w:spacing w:after="160" w:line="259" w:lineRule="auto"/>
+        <w:ind w:left="0"/>
+      </w:pPr>
+      <w:r>
+        <w:t xml:space="preserve">Para comprobar la correcta comunicación entre ambas máquinas, volvemos a la máquina Proxy y realizamos una petición local con el comando </w:t>
+      </w:r>
+      <w:proofErr w:type="spellStart"/>
+      <w:r>
+        <w:t>curl</w:t>
+      </w:r>
+      <w:proofErr w:type="spellEnd"/>
+      <w:r>
+        <w:t xml:space="preserve"> -I 127.0.0.1. El servidor responde con un código 200 OK e incluye las cabeceras correspondientes, evidenciando que el tráfico pasa por </w:t>
+      </w:r>
+      <w:proofErr w:type="spellStart"/>
+      <w:r>
+        <w:t>Nginx</w:t>
+      </w:r>
+      <w:proofErr w:type="spellEnd"/>
+      <w:r>
+        <w:t xml:space="preserve"> y es resuelto correctamente por nuestra aplicación </w:t>
+      </w:r>
+      <w:proofErr w:type="spellStart"/>
+      <w:r>
+        <w:t>backend</w:t>
+      </w:r>
+      <w:proofErr w:type="spellEnd"/>
+      <w:r>
+        <w:t xml:space="preserve"> en </w:t>
+      </w:r>
+      <w:proofErr w:type="spellStart"/>
+      <w:r>
+        <w:t>NodeJS</w:t>
+      </w:r>
+      <w:proofErr w:type="spellEnd"/>
+      <w:r>
+        <w:t xml:space="preserve">. </w:t>
+      </w:r>
+    </w:p>
+    <w:p>
+      <w:pPr>
+        <w:spacing w:after="160" w:line="259" w:lineRule="auto"/>
+        <w:ind w:left="0"/>
+        <w:jc w:val="center"/>
+        <w:rPr>
+          <w:rFonts w:ascii="Montserrat Medium" w:eastAsiaTheme="majorEastAsia" w:hAnsi="Montserrat Medium" w:cstheme="majorBidi"/>
+          <w:kern w:val="2"/>
+          <w:sz w:val="28"/>
+          <w:szCs w:val="40"/>
+          <w:lang w:val="es-ES" w:eastAsia="en-US"/>
+          <w14:ligatures w14:val="standardContextual"/>
+        </w:rPr>
+      </w:pPr>
+      <w:r>
+        <w:rPr>
+          <w:noProof/>
+        </w:rPr>
+        <w:drawing>
+          <wp:inline distT="0" distB="0" distL="0" distR="0" wp14:anchorId="73E4ADDA" wp14:editId="6D1C76C3">
+            <wp:extent cx="3269615" cy="1751330"/>
+            <wp:effectExtent l="0" t="0" r="6985" b="1270"/>
+            <wp:docPr id="22" name="Imagen 22"/>
+            <wp:cNvGraphicFramePr>
+              <a:graphicFrameLocks xmlns:a="http://schemas.openxmlformats.org/drawingml/2006/main" noChangeAspect="1"/>
+            </wp:cNvGraphicFramePr>
+            <a:graphic xmlns:a="http://schemas.openxmlformats.org/drawingml/2006/main">
+              <a:graphicData uri="http://schemas.openxmlformats.org/drawingml/2006/picture">
+                <pic:pic xmlns:pic="http://schemas.openxmlformats.org/drawingml/2006/picture">
+                  <pic:nvPicPr>
+                    <pic:cNvPr id="0" name="Picture 14"/>
+                    <pic:cNvPicPr>
+                      <a:picLocks noChangeAspect="1" noChangeArrowheads="1"/>
+                    </pic:cNvPicPr>
+                  </pic:nvPicPr>
+                  <pic:blipFill>
+                    <a:blip r:embed="rId26">
+                      <a:extLst>
+                        <a:ext uri="{28A0092B-C50C-407E-A947-70E740481C1C}">
+                          <a14:useLocalDpi xmlns:a14="http://schemas.microsoft.com/office/drawing/2010/main" val="0"/>
+                        </a:ext>
+                      </a:extLst>
+                    </a:blip>
+                    <a:srcRect/>
+                    <a:stretch>
+                      <a:fillRect/>
+                    </a:stretch>
+                  </pic:blipFill>
+                  <pic:spPr bwMode="auto">
+                    <a:xfrm>
+                      <a:off x="0" y="0"/>
+                      <a:ext cx="3269615" cy="1751330"/>
+                    </a:xfrm>
+                    <a:prstGeom prst="rect">
+                      <a:avLst/>
+                    </a:prstGeom>
+                    <a:noFill/>
+                    <a:ln>
+                      <a:noFill/>
+                    </a:ln>
+                  </pic:spPr>
+                </pic:pic>
+              </a:graphicData>
+            </a:graphic>
+          </wp:inline>
+        </w:drawing>
+      </w:r>
       <w:r>
         <w:br w:type="page"/>
       </w:r>
@@ -2429,25 +3979,26 @@
           <w:numId w:val="11"/>
         </w:numPr>
       </w:pPr>
-      <w:bookmarkStart w:id="6" w:name="_Toc242119016"/>
-      <w:r>
+      <w:bookmarkStart w:id="12" w:name="_Toc242293217"/>
+      <w:r>
+        <w:lastRenderedPageBreak/>
         <w:t>Configuración del servidor de base de datos con MongoDB</w:t>
       </w:r>
-      <w:bookmarkEnd w:id="6"/>
+      <w:bookmarkEnd w:id="12"/>
     </w:p>
     <w:p>
       <w:pPr>
         <w:pStyle w:val="Ttulo2"/>
         <w:ind w:left="0"/>
       </w:pPr>
-      <w:bookmarkStart w:id="7" w:name="_Toc242119017"/>
+      <w:bookmarkStart w:id="13" w:name="_Toc242293218"/>
       <w:r>
         <w:t>Paso</w:t>
       </w:r>
       <w:r>
         <w:t xml:space="preserve"> 1: Creación y configuración de la máquina Proxy</w:t>
       </w:r>
-      <w:bookmarkEnd w:id="7"/>
+      <w:bookmarkEnd w:id="13"/>
     </w:p>
     <w:p>
       <w:pPr>
@@ -2491,25 +4042,26 @@
           <w:numId w:val="11"/>
         </w:numPr>
       </w:pPr>
-      <w:bookmarkStart w:id="8" w:name="_Toc242119018"/>
-      <w:r>
+      <w:bookmarkStart w:id="14" w:name="_Toc242293219"/>
+      <w:r>
+        <w:lastRenderedPageBreak/>
         <w:t>Configuración del servidor de base de datos como sistema de ficheros compartido</w:t>
       </w:r>
-      <w:bookmarkEnd w:id="8"/>
+      <w:bookmarkEnd w:id="14"/>
     </w:p>
     <w:p>
       <w:pPr>
         <w:pStyle w:val="Ttulo2"/>
         <w:ind w:left="0"/>
       </w:pPr>
-      <w:bookmarkStart w:id="9" w:name="_Toc242119019"/>
+      <w:bookmarkStart w:id="15" w:name="_Toc242293220"/>
       <w:r>
         <w:t>Paso</w:t>
       </w:r>
       <w:r>
         <w:t xml:space="preserve"> 1: Creación y configuración de la máquina Proxy</w:t>
       </w:r>
-      <w:bookmarkEnd w:id="9"/>
+      <w:bookmarkEnd w:id="15"/>
     </w:p>
     <w:p>
       <w:pPr>
@@ -2530,8 +4082,8 @@
       <w:proofErr w:type="spellEnd"/>
     </w:p>
     <w:sectPr>
-      <w:headerReference w:type="default" r:id="rId14"/>
-      <w:headerReference w:type="first" r:id="rId15"/>
+      <w:headerReference w:type="default" r:id="rId27"/>
+      <w:headerReference w:type="first" r:id="rId28"/>
       <w:pgSz w:w="11906" w:h="16838"/>
       <w:pgMar w:top="1417" w:right="1701" w:bottom="1417" w:left="1701" w:header="708" w:footer="708" w:gutter="0"/>
       <w:cols w:space="708"/>
@@ -6002,6 +7554,19 @@
       <w:ind w:left="200"/>
     </w:pPr>
   </w:style>
+  <w:style w:type="character" w:styleId="CdigoHTML">
+    <w:name w:val="HTML Code"/>
+    <w:basedOn w:val="Fuentedeprrafopredeter"/>
+    <w:uiPriority w:val="99"/>
+    <w:semiHidden/>
+    <w:unhideWhenUsed/>
+    <w:rsid w:val="00535BF8"/>
+    <w:rPr>
+      <w:rFonts w:ascii="Courier New" w:eastAsia="Times New Roman" w:hAnsi="Courier New" w:cs="Courier New"/>
+      <w:sz w:val="20"/>
+      <w:szCs w:val="20"/>
+    </w:rPr>
+  </w:style>
 </w:styles>
 </file>
 

</xml_diff>

<commit_message>
Informe P2 Punto 3,4,5
</commit_message>
<xml_diff>
--- a/Informe P2/P2.docx
+++ b/Informe P2/P2.docx
@@ -437,7 +437,7 @@
           <w:r>
             <w:fldChar w:fldCharType="separate"/>
           </w:r>
-          <w:hyperlink w:anchor="_Toc242293207" w:history="1">
+          <w:hyperlink w:anchor="_Toc242351550" w:history="1">
             <w:r>
               <w:rPr>
                 <w:rStyle w:val="Hipervnculo"/>
@@ -483,7 +483,7 @@
                 <w:noProof/>
                 <w:webHidden/>
               </w:rPr>
-              <w:instrText xml:space="preserve"> PAGEREF _Toc242293207 \h </w:instrText>
+              <w:instrText xml:space="preserve"> PAGEREF _Toc242351550 \h </w:instrText>
             </w:r>
             <w:r>
               <w:rPr>
@@ -530,7 +530,7 @@
               <w14:ligatures w14:val="standardContextual"/>
             </w:rPr>
           </w:pPr>
-          <w:hyperlink w:anchor="_Toc242293208" w:history="1">
+          <w:hyperlink w:anchor="_Toc242351551" w:history="1">
             <w:r>
               <w:rPr>
                 <w:rStyle w:val="Hipervnculo"/>
@@ -557,7 +557,7 @@
                 <w:noProof/>
                 <w:webHidden/>
               </w:rPr>
-              <w:instrText xml:space="preserve"> PAGEREF _Toc242293208 \h </w:instrText>
+              <w:instrText xml:space="preserve"> PAGEREF _Toc242351551 \h </w:instrText>
             </w:r>
             <w:r>
               <w:rPr>
@@ -604,7 +604,7 @@
               <w14:ligatures w14:val="standardContextual"/>
             </w:rPr>
           </w:pPr>
-          <w:hyperlink w:anchor="_Toc242293209" w:history="1">
+          <w:hyperlink w:anchor="_Toc242351552" w:history="1">
             <w:r>
               <w:rPr>
                 <w:rStyle w:val="Hipervnculo"/>
@@ -631,7 +631,7 @@
                 <w:noProof/>
                 <w:webHidden/>
               </w:rPr>
-              <w:instrText xml:space="preserve"> PAGEREF _Toc242293209 \h </w:instrText>
+              <w:instrText xml:space="preserve"> PAGEREF _Toc242351552 \h </w:instrText>
             </w:r>
             <w:r>
               <w:rPr>
@@ -678,7 +678,7 @@
               <w14:ligatures w14:val="standardContextual"/>
             </w:rPr>
           </w:pPr>
-          <w:hyperlink w:anchor="_Toc242293210" w:history="1">
+          <w:hyperlink w:anchor="_Toc242351553" w:history="1">
             <w:r>
               <w:rPr>
                 <w:rStyle w:val="Hipervnculo"/>
@@ -705,7 +705,7 @@
                 <w:noProof/>
                 <w:webHidden/>
               </w:rPr>
-              <w:instrText xml:space="preserve"> PAGEREF _Toc242293210 \h </w:instrText>
+              <w:instrText xml:space="preserve"> PAGEREF _Toc242351553 \h </w:instrText>
             </w:r>
             <w:r>
               <w:rPr>
@@ -752,7 +752,7 @@
               <w14:ligatures w14:val="standardContextual"/>
             </w:rPr>
           </w:pPr>
-          <w:hyperlink w:anchor="_Toc242293211" w:history="1">
+          <w:hyperlink w:anchor="_Toc242351554" w:history="1">
             <w:r>
               <w:rPr>
                 <w:rStyle w:val="Hipervnculo"/>
@@ -779,7 +779,7 @@
                 <w:noProof/>
                 <w:webHidden/>
               </w:rPr>
-              <w:instrText xml:space="preserve"> PAGEREF _Toc242293211 \h </w:instrText>
+              <w:instrText xml:space="preserve"> PAGEREF _Toc242351554 \h </w:instrText>
             </w:r>
             <w:r>
               <w:rPr>
@@ -827,7 +827,7 @@
               <w14:ligatures w14:val="standardContextual"/>
             </w:rPr>
           </w:pPr>
-          <w:hyperlink w:anchor="_Toc242293212" w:history="1">
+          <w:hyperlink w:anchor="_Toc242351555" w:history="1">
             <w:r>
               <w:rPr>
                 <w:rStyle w:val="Hipervnculo"/>
@@ -873,7 +873,7 @@
                 <w:noProof/>
                 <w:webHidden/>
               </w:rPr>
-              <w:instrText xml:space="preserve"> PAGEREF _Toc242293212 \h </w:instrText>
+              <w:instrText xml:space="preserve"> PAGEREF _Toc242351555 \h </w:instrText>
             </w:r>
             <w:r>
               <w:rPr>
@@ -920,7 +920,7 @@
               <w14:ligatures w14:val="standardContextual"/>
             </w:rPr>
           </w:pPr>
-          <w:hyperlink w:anchor="_Toc242293213" w:history="1">
+          <w:hyperlink w:anchor="_Toc242351556" w:history="1">
             <w:r>
               <w:rPr>
                 <w:rStyle w:val="Hipervnculo"/>
@@ -947,7 +947,7 @@
                 <w:noProof/>
                 <w:webHidden/>
               </w:rPr>
-              <w:instrText xml:space="preserve"> PAGEREF _Toc242293213 \h </w:instrText>
+              <w:instrText xml:space="preserve"> PAGEREF _Toc242351556 \h </w:instrText>
             </w:r>
             <w:r>
               <w:rPr>
@@ -994,7 +994,7 @@
               <w14:ligatures w14:val="standardContextual"/>
             </w:rPr>
           </w:pPr>
-          <w:hyperlink w:anchor="_Toc242293214" w:history="1">
+          <w:hyperlink w:anchor="_Toc242351557" w:history="1">
             <w:r>
               <w:rPr>
                 <w:rStyle w:val="Hipervnculo"/>
@@ -1021,7 +1021,7 @@
                 <w:noProof/>
                 <w:webHidden/>
               </w:rPr>
-              <w:instrText xml:space="preserve"> PAGEREF _Toc242293214 \h </w:instrText>
+              <w:instrText xml:space="preserve"> PAGEREF _Toc242351557 \h </w:instrText>
             </w:r>
             <w:r>
               <w:rPr>
@@ -1068,7 +1068,7 @@
               <w14:ligatures w14:val="standardContextual"/>
             </w:rPr>
           </w:pPr>
-          <w:hyperlink w:anchor="_Toc242293215" w:history="1">
+          <w:hyperlink w:anchor="_Toc242351558" w:history="1">
             <w:r>
               <w:rPr>
                 <w:rStyle w:val="Hipervnculo"/>
@@ -1095,7 +1095,7 @@
                 <w:noProof/>
                 <w:webHidden/>
               </w:rPr>
-              <w:instrText xml:space="preserve"> PAGEREF _Toc242293215 \h </w:instrText>
+              <w:instrText xml:space="preserve"> PAGEREF _Toc242351558 \h </w:instrText>
             </w:r>
             <w:r>
               <w:rPr>
@@ -1142,7 +1142,7 @@
               <w14:ligatures w14:val="standardContextual"/>
             </w:rPr>
           </w:pPr>
-          <w:hyperlink w:anchor="_Toc242293216" w:history="1">
+          <w:hyperlink w:anchor="_Toc242351559" w:history="1">
             <w:r>
               <w:rPr>
                 <w:rStyle w:val="Hipervnculo"/>
@@ -1169,7 +1169,7 @@
                 <w:noProof/>
                 <w:webHidden/>
               </w:rPr>
-              <w:instrText xml:space="preserve"> PAGEREF _Toc242293216 \h </w:instrText>
+              <w:instrText xml:space="preserve"> PAGEREF _Toc242351559 \h </w:instrText>
             </w:r>
             <w:r>
               <w:rPr>
@@ -1217,7 +1217,7 @@
               <w14:ligatures w14:val="standardContextual"/>
             </w:rPr>
           </w:pPr>
-          <w:hyperlink w:anchor="_Toc242293217" w:history="1">
+          <w:hyperlink w:anchor="_Toc242351560" w:history="1">
             <w:r>
               <w:rPr>
                 <w:rStyle w:val="Hipervnculo"/>
@@ -1263,7 +1263,7 @@
                 <w:noProof/>
                 <w:webHidden/>
               </w:rPr>
-              <w:instrText xml:space="preserve"> PAGEREF _Toc242293217 \h </w:instrText>
+              <w:instrText xml:space="preserve"> PAGEREF _Toc242351560 \h </w:instrText>
             </w:r>
             <w:r>
               <w:rPr>
@@ -1310,13 +1310,13 @@
               <w14:ligatures w14:val="standardContextual"/>
             </w:rPr>
           </w:pPr>
-          <w:hyperlink w:anchor="_Toc242293218" w:history="1">
+          <w:hyperlink w:anchor="_Toc242351561" w:history="1">
             <w:r>
               <w:rPr>
                 <w:rStyle w:val="Hipervnculo"/>
                 <w:noProof/>
               </w:rPr>
-              <w:t>Paso 1: Creación y configuración de la máquina Proxy</w:t>
+              <w:t>Paso 1: Acceso temporal a internet</w:t>
             </w:r>
             <w:r>
               <w:rPr>
@@ -1337,7 +1337,7 @@
                 <w:noProof/>
                 <w:webHidden/>
               </w:rPr>
-              <w:instrText xml:space="preserve"> PAGEREF _Toc242293218 \h </w:instrText>
+              <w:instrText xml:space="preserve"> PAGEREF _Toc242351561 \h </w:instrText>
             </w:r>
             <w:r>
               <w:rPr>
@@ -1358,6 +1358,302 @@
                 <w:webHidden/>
               </w:rPr>
               <w:t>8</w:t>
+            </w:r>
+            <w:r>
+              <w:rPr>
+                <w:noProof/>
+                <w:webHidden/>
+              </w:rPr>
+              <w:fldChar w:fldCharType="end"/>
+            </w:r>
+          </w:hyperlink>
+        </w:p>
+        <w:p>
+          <w:pPr>
+            <w:pStyle w:val="TDC2"/>
+            <w:tabs>
+              <w:tab w:val="right" w:pos="8494"/>
+            </w:tabs>
+            <w:rPr>
+              <w:rFonts w:asciiTheme="minorHAnsi" w:eastAsiaTheme="minorEastAsia" w:hAnsiTheme="minorHAnsi" w:cstheme="minorBidi"/>
+              <w:noProof/>
+              <w:kern w:val="2"/>
+              <w:sz w:val="24"/>
+              <w:szCs w:val="24"/>
+              <w:lang w:val="es-ES"/>
+              <w14:ligatures w14:val="standardContextual"/>
+            </w:rPr>
+          </w:pPr>
+          <w:hyperlink w:anchor="_Toc242351562" w:history="1">
+            <w:r>
+              <w:rPr>
+                <w:rStyle w:val="Hipervnculo"/>
+                <w:noProof/>
+              </w:rPr>
+              <w:t>Paso 2: Instalación de MongoDB 8.0</w:t>
+            </w:r>
+            <w:r>
+              <w:rPr>
+                <w:noProof/>
+                <w:webHidden/>
+              </w:rPr>
+              <w:tab/>
+            </w:r>
+            <w:r>
+              <w:rPr>
+                <w:noProof/>
+                <w:webHidden/>
+              </w:rPr>
+              <w:fldChar w:fldCharType="begin"/>
+            </w:r>
+            <w:r>
+              <w:rPr>
+                <w:noProof/>
+                <w:webHidden/>
+              </w:rPr>
+              <w:instrText xml:space="preserve"> PAGEREF _Toc242351562 \h </w:instrText>
+            </w:r>
+            <w:r>
+              <w:rPr>
+                <w:noProof/>
+                <w:webHidden/>
+              </w:rPr>
+            </w:r>
+            <w:r>
+              <w:rPr>
+                <w:noProof/>
+                <w:webHidden/>
+              </w:rPr>
+              <w:fldChar w:fldCharType="separate"/>
+            </w:r>
+            <w:r>
+              <w:rPr>
+                <w:noProof/>
+                <w:webHidden/>
+              </w:rPr>
+              <w:t>8</w:t>
+            </w:r>
+            <w:r>
+              <w:rPr>
+                <w:noProof/>
+                <w:webHidden/>
+              </w:rPr>
+              <w:fldChar w:fldCharType="end"/>
+            </w:r>
+          </w:hyperlink>
+        </w:p>
+        <w:p>
+          <w:pPr>
+            <w:pStyle w:val="TDC2"/>
+            <w:tabs>
+              <w:tab w:val="right" w:pos="8494"/>
+            </w:tabs>
+            <w:rPr>
+              <w:rFonts w:asciiTheme="minorHAnsi" w:eastAsiaTheme="minorEastAsia" w:hAnsiTheme="minorHAnsi" w:cstheme="minorBidi"/>
+              <w:noProof/>
+              <w:kern w:val="2"/>
+              <w:sz w:val="24"/>
+              <w:szCs w:val="24"/>
+              <w:lang w:val="es-ES"/>
+              <w14:ligatures w14:val="standardContextual"/>
+            </w:rPr>
+          </w:pPr>
+          <w:hyperlink w:anchor="_Toc242351563" w:history="1">
+            <w:r>
+              <w:rPr>
+                <w:rStyle w:val="Hipervnculo"/>
+                <w:noProof/>
+              </w:rPr>
+              <w:t>Paso 3: Creación del usuario administrador</w:t>
+            </w:r>
+            <w:r>
+              <w:rPr>
+                <w:noProof/>
+                <w:webHidden/>
+              </w:rPr>
+              <w:tab/>
+            </w:r>
+            <w:r>
+              <w:rPr>
+                <w:noProof/>
+                <w:webHidden/>
+              </w:rPr>
+              <w:fldChar w:fldCharType="begin"/>
+            </w:r>
+            <w:r>
+              <w:rPr>
+                <w:noProof/>
+                <w:webHidden/>
+              </w:rPr>
+              <w:instrText xml:space="preserve"> PAGEREF _Toc242351563 \h </w:instrText>
+            </w:r>
+            <w:r>
+              <w:rPr>
+                <w:noProof/>
+                <w:webHidden/>
+              </w:rPr>
+            </w:r>
+            <w:r>
+              <w:rPr>
+                <w:noProof/>
+                <w:webHidden/>
+              </w:rPr>
+              <w:fldChar w:fldCharType="separate"/>
+            </w:r>
+            <w:r>
+              <w:rPr>
+                <w:noProof/>
+                <w:webHidden/>
+              </w:rPr>
+              <w:t>9</w:t>
+            </w:r>
+            <w:r>
+              <w:rPr>
+                <w:noProof/>
+                <w:webHidden/>
+              </w:rPr>
+              <w:fldChar w:fldCharType="end"/>
+            </w:r>
+          </w:hyperlink>
+        </w:p>
+        <w:p>
+          <w:pPr>
+            <w:pStyle w:val="TDC2"/>
+            <w:tabs>
+              <w:tab w:val="right" w:pos="8494"/>
+            </w:tabs>
+            <w:rPr>
+              <w:rFonts w:asciiTheme="minorHAnsi" w:eastAsiaTheme="minorEastAsia" w:hAnsiTheme="minorHAnsi" w:cstheme="minorBidi"/>
+              <w:noProof/>
+              <w:kern w:val="2"/>
+              <w:sz w:val="24"/>
+              <w:szCs w:val="24"/>
+              <w:lang w:val="es-ES"/>
+              <w14:ligatures w14:val="standardContextual"/>
+            </w:rPr>
+          </w:pPr>
+          <w:hyperlink w:anchor="_Toc242351564" w:history="1">
+            <w:r>
+              <w:rPr>
+                <w:rStyle w:val="Hipervnculo"/>
+                <w:noProof/>
+              </w:rPr>
+              <w:t>Paso 4: Habilitación de la autenticación y configuración de red</w:t>
+            </w:r>
+            <w:r>
+              <w:rPr>
+                <w:noProof/>
+                <w:webHidden/>
+              </w:rPr>
+              <w:tab/>
+            </w:r>
+            <w:r>
+              <w:rPr>
+                <w:noProof/>
+                <w:webHidden/>
+              </w:rPr>
+              <w:fldChar w:fldCharType="begin"/>
+            </w:r>
+            <w:r>
+              <w:rPr>
+                <w:noProof/>
+                <w:webHidden/>
+              </w:rPr>
+              <w:instrText xml:space="preserve"> PAGEREF _Toc242351564 \h </w:instrText>
+            </w:r>
+            <w:r>
+              <w:rPr>
+                <w:noProof/>
+                <w:webHidden/>
+              </w:rPr>
+            </w:r>
+            <w:r>
+              <w:rPr>
+                <w:noProof/>
+                <w:webHidden/>
+              </w:rPr>
+              <w:fldChar w:fldCharType="separate"/>
+            </w:r>
+            <w:r>
+              <w:rPr>
+                <w:noProof/>
+                <w:webHidden/>
+              </w:rPr>
+              <w:t>9</w:t>
+            </w:r>
+            <w:r>
+              <w:rPr>
+                <w:noProof/>
+                <w:webHidden/>
+              </w:rPr>
+              <w:fldChar w:fldCharType="end"/>
+            </w:r>
+          </w:hyperlink>
+        </w:p>
+        <w:p>
+          <w:pPr>
+            <w:pStyle w:val="TDC2"/>
+            <w:tabs>
+              <w:tab w:val="right" w:pos="8494"/>
+            </w:tabs>
+            <w:rPr>
+              <w:rFonts w:asciiTheme="minorHAnsi" w:eastAsiaTheme="minorEastAsia" w:hAnsiTheme="minorHAnsi" w:cstheme="minorBidi"/>
+              <w:noProof/>
+              <w:kern w:val="2"/>
+              <w:sz w:val="24"/>
+              <w:szCs w:val="24"/>
+              <w:lang w:val="es-ES"/>
+              <w14:ligatures w14:val="standardContextual"/>
+            </w:rPr>
+          </w:pPr>
+          <w:hyperlink w:anchor="_Toc242351565" w:history="1">
+            <w:r>
+              <w:rPr>
+                <w:rStyle w:val="Hipervnculo"/>
+                <w:noProof/>
+              </w:rPr>
+              <w:t>Paso 5: Base de datos y usuario de la aplicación</w:t>
+            </w:r>
+            <w:r>
+              <w:rPr>
+                <w:noProof/>
+                <w:webHidden/>
+              </w:rPr>
+              <w:tab/>
+            </w:r>
+            <w:r>
+              <w:rPr>
+                <w:noProof/>
+                <w:webHidden/>
+              </w:rPr>
+              <w:fldChar w:fldCharType="begin"/>
+            </w:r>
+            <w:r>
+              <w:rPr>
+                <w:noProof/>
+                <w:webHidden/>
+              </w:rPr>
+              <w:instrText xml:space="preserve"> PAGEREF _Toc242351565 \h </w:instrText>
+            </w:r>
+            <w:r>
+              <w:rPr>
+                <w:noProof/>
+                <w:webHidden/>
+              </w:rPr>
+            </w:r>
+            <w:r>
+              <w:rPr>
+                <w:noProof/>
+                <w:webHidden/>
+              </w:rPr>
+              <w:fldChar w:fldCharType="separate"/>
+            </w:r>
+            <w:r>
+              <w:rPr>
+                <w:noProof/>
+                <w:webHidden/>
+              </w:rPr>
+              <w:t>10</w:t>
             </w:r>
             <w:r>
               <w:rPr>
@@ -1385,7 +1681,7 @@
               <w14:ligatures w14:val="standardContextual"/>
             </w:rPr>
           </w:pPr>
-          <w:hyperlink w:anchor="_Toc242293219" w:history="1">
+          <w:hyperlink w:anchor="_Toc242351566" w:history="1">
             <w:r>
               <w:rPr>
                 <w:rStyle w:val="Hipervnculo"/>
@@ -1431,7 +1727,7 @@
                 <w:noProof/>
                 <w:webHidden/>
               </w:rPr>
-              <w:instrText xml:space="preserve"> PAGEREF _Toc242293219 \h </w:instrText>
+              <w:instrText xml:space="preserve"> PAGEREF _Toc242351566 \h </w:instrText>
             </w:r>
             <w:r>
               <w:rPr>
@@ -1451,7 +1747,7 @@
                 <w:noProof/>
                 <w:webHidden/>
               </w:rPr>
-              <w:t>9</w:t>
+              <w:t>11</w:t>
             </w:r>
             <w:r>
               <w:rPr>
@@ -1478,13 +1774,13 @@
               <w14:ligatures w14:val="standardContextual"/>
             </w:rPr>
           </w:pPr>
-          <w:hyperlink w:anchor="_Toc242293220" w:history="1">
+          <w:hyperlink w:anchor="_Toc242351567" w:history="1">
             <w:r>
               <w:rPr>
                 <w:rStyle w:val="Hipervnculo"/>
                 <w:noProof/>
               </w:rPr>
-              <w:t>Paso 1: Creación y configuración de la máquina Proxy</w:t>
+              <w:t>Paso 1: Servidor NFS en la máquina de Base de Datos</w:t>
             </w:r>
             <w:r>
               <w:rPr>
@@ -1505,7 +1801,7 @@
                 <w:noProof/>
                 <w:webHidden/>
               </w:rPr>
-              <w:instrText xml:space="preserve"> PAGEREF _Toc242293220 \h </w:instrText>
+              <w:instrText xml:space="preserve"> PAGEREF _Toc242351567 \h </w:instrText>
             </w:r>
             <w:r>
               <w:rPr>
@@ -1525,7 +1821,471 @@
                 <w:noProof/>
                 <w:webHidden/>
               </w:rPr>
-              <w:t>9</w:t>
+              <w:t>11</w:t>
+            </w:r>
+            <w:r>
+              <w:rPr>
+                <w:noProof/>
+                <w:webHidden/>
+              </w:rPr>
+              <w:fldChar w:fldCharType="end"/>
+            </w:r>
+          </w:hyperlink>
+        </w:p>
+        <w:p>
+          <w:pPr>
+            <w:pStyle w:val="TDC2"/>
+            <w:tabs>
+              <w:tab w:val="right" w:pos="8494"/>
+            </w:tabs>
+            <w:rPr>
+              <w:rFonts w:asciiTheme="minorHAnsi" w:eastAsiaTheme="minorEastAsia" w:hAnsiTheme="minorHAnsi" w:cstheme="minorBidi"/>
+              <w:noProof/>
+              <w:kern w:val="2"/>
+              <w:sz w:val="24"/>
+              <w:szCs w:val="24"/>
+              <w:lang w:val="es-ES"/>
+              <w14:ligatures w14:val="standardContextual"/>
+            </w:rPr>
+          </w:pPr>
+          <w:hyperlink w:anchor="_Toc242351568" w:history="1">
+            <w:r>
+              <w:rPr>
+                <w:rStyle w:val="Hipervnculo"/>
+                <w:noProof/>
+              </w:rPr>
+              <w:t>Paso 2: Configuración del modo "NFSv4 only"</w:t>
+            </w:r>
+            <w:r>
+              <w:rPr>
+                <w:noProof/>
+                <w:webHidden/>
+              </w:rPr>
+              <w:tab/>
+            </w:r>
+            <w:r>
+              <w:rPr>
+                <w:noProof/>
+                <w:webHidden/>
+              </w:rPr>
+              <w:fldChar w:fldCharType="begin"/>
+            </w:r>
+            <w:r>
+              <w:rPr>
+                <w:noProof/>
+                <w:webHidden/>
+              </w:rPr>
+              <w:instrText xml:space="preserve"> PAGEREF _Toc242351568 \h </w:instrText>
+            </w:r>
+            <w:r>
+              <w:rPr>
+                <w:noProof/>
+                <w:webHidden/>
+              </w:rPr>
+            </w:r>
+            <w:r>
+              <w:rPr>
+                <w:noProof/>
+                <w:webHidden/>
+              </w:rPr>
+              <w:fldChar w:fldCharType="separate"/>
+            </w:r>
+            <w:r>
+              <w:rPr>
+                <w:noProof/>
+                <w:webHidden/>
+              </w:rPr>
+              <w:t>11</w:t>
+            </w:r>
+            <w:r>
+              <w:rPr>
+                <w:noProof/>
+                <w:webHidden/>
+              </w:rPr>
+              <w:fldChar w:fldCharType="end"/>
+            </w:r>
+          </w:hyperlink>
+        </w:p>
+        <w:p>
+          <w:pPr>
+            <w:pStyle w:val="TDC2"/>
+            <w:tabs>
+              <w:tab w:val="right" w:pos="8494"/>
+            </w:tabs>
+            <w:rPr>
+              <w:rFonts w:asciiTheme="minorHAnsi" w:eastAsiaTheme="minorEastAsia" w:hAnsiTheme="minorHAnsi" w:cstheme="minorBidi"/>
+              <w:noProof/>
+              <w:kern w:val="2"/>
+              <w:sz w:val="24"/>
+              <w:szCs w:val="24"/>
+              <w:lang w:val="es-ES"/>
+              <w14:ligatures w14:val="standardContextual"/>
+            </w:rPr>
+          </w:pPr>
+          <w:hyperlink w:anchor="_Toc242351569" w:history="1">
+            <w:r>
+              <w:rPr>
+                <w:rStyle w:val="Hipervnculo"/>
+                <w:noProof/>
+              </w:rPr>
+              <w:t>Paso 3: Cliente NFS en la máquina Backend</w:t>
+            </w:r>
+            <w:r>
+              <w:rPr>
+                <w:noProof/>
+                <w:webHidden/>
+              </w:rPr>
+              <w:tab/>
+            </w:r>
+            <w:r>
+              <w:rPr>
+                <w:noProof/>
+                <w:webHidden/>
+              </w:rPr>
+              <w:fldChar w:fldCharType="begin"/>
+            </w:r>
+            <w:r>
+              <w:rPr>
+                <w:noProof/>
+                <w:webHidden/>
+              </w:rPr>
+              <w:instrText xml:space="preserve"> PAGEREF _Toc242351569 \h </w:instrText>
+            </w:r>
+            <w:r>
+              <w:rPr>
+                <w:noProof/>
+                <w:webHidden/>
+              </w:rPr>
+            </w:r>
+            <w:r>
+              <w:rPr>
+                <w:noProof/>
+                <w:webHidden/>
+              </w:rPr>
+              <w:fldChar w:fldCharType="separate"/>
+            </w:r>
+            <w:r>
+              <w:rPr>
+                <w:noProof/>
+                <w:webHidden/>
+              </w:rPr>
+              <w:t>12</w:t>
+            </w:r>
+            <w:r>
+              <w:rPr>
+                <w:noProof/>
+                <w:webHidden/>
+              </w:rPr>
+              <w:fldChar w:fldCharType="end"/>
+            </w:r>
+          </w:hyperlink>
+        </w:p>
+        <w:p>
+          <w:pPr>
+            <w:pStyle w:val="TDC2"/>
+            <w:tabs>
+              <w:tab w:val="right" w:pos="8494"/>
+            </w:tabs>
+            <w:rPr>
+              <w:rFonts w:asciiTheme="minorHAnsi" w:eastAsiaTheme="minorEastAsia" w:hAnsiTheme="minorHAnsi" w:cstheme="minorBidi"/>
+              <w:noProof/>
+              <w:kern w:val="2"/>
+              <w:sz w:val="24"/>
+              <w:szCs w:val="24"/>
+              <w:lang w:val="es-ES"/>
+              <w14:ligatures w14:val="standardContextual"/>
+            </w:rPr>
+          </w:pPr>
+          <w:hyperlink w:anchor="_Toc242351570" w:history="1">
+            <w:r>
+              <w:rPr>
+                <w:rStyle w:val="Hipervnculo"/>
+                <w:noProof/>
+              </w:rPr>
+              <w:t>Paso 4: Montaje automático al arrancar</w:t>
+            </w:r>
+            <w:r>
+              <w:rPr>
+                <w:noProof/>
+                <w:webHidden/>
+              </w:rPr>
+              <w:tab/>
+            </w:r>
+            <w:r>
+              <w:rPr>
+                <w:noProof/>
+                <w:webHidden/>
+              </w:rPr>
+              <w:fldChar w:fldCharType="begin"/>
+            </w:r>
+            <w:r>
+              <w:rPr>
+                <w:noProof/>
+                <w:webHidden/>
+              </w:rPr>
+              <w:instrText xml:space="preserve"> PAGEREF _Toc242351570 \h </w:instrText>
+            </w:r>
+            <w:r>
+              <w:rPr>
+                <w:noProof/>
+                <w:webHidden/>
+              </w:rPr>
+            </w:r>
+            <w:r>
+              <w:rPr>
+                <w:noProof/>
+                <w:webHidden/>
+              </w:rPr>
+              <w:fldChar w:fldCharType="separate"/>
+            </w:r>
+            <w:r>
+              <w:rPr>
+                <w:noProof/>
+                <w:webHidden/>
+              </w:rPr>
+              <w:t>12</w:t>
+            </w:r>
+            <w:r>
+              <w:rPr>
+                <w:noProof/>
+                <w:webHidden/>
+              </w:rPr>
+              <w:fldChar w:fldCharType="end"/>
+            </w:r>
+          </w:hyperlink>
+        </w:p>
+        <w:p>
+          <w:pPr>
+            <w:pStyle w:val="TDC1"/>
+            <w:tabs>
+              <w:tab w:val="left" w:pos="480"/>
+              <w:tab w:val="right" w:pos="8494"/>
+            </w:tabs>
+            <w:rPr>
+              <w:rFonts w:asciiTheme="minorHAnsi" w:eastAsiaTheme="minorEastAsia" w:hAnsiTheme="minorHAnsi" w:cstheme="minorBidi"/>
+              <w:noProof/>
+              <w:kern w:val="2"/>
+              <w:sz w:val="24"/>
+              <w:szCs w:val="24"/>
+              <w:lang w:val="es-ES"/>
+              <w14:ligatures w14:val="standardContextual"/>
+            </w:rPr>
+          </w:pPr>
+          <w:hyperlink w:anchor="_Toc242351571" w:history="1">
+            <w:r>
+              <w:rPr>
+                <w:rStyle w:val="Hipervnculo"/>
+                <w:noProof/>
+              </w:rPr>
+              <w:t>5.</w:t>
+            </w:r>
+            <w:r>
+              <w:rPr>
+                <w:rFonts w:asciiTheme="minorHAnsi" w:eastAsiaTheme="minorEastAsia" w:hAnsiTheme="minorHAnsi" w:cstheme="minorBidi"/>
+                <w:noProof/>
+                <w:kern w:val="2"/>
+                <w:sz w:val="24"/>
+                <w:szCs w:val="24"/>
+                <w:lang w:val="es-ES"/>
+                <w14:ligatures w14:val="standardContextual"/>
+              </w:rPr>
+              <w:tab/>
+            </w:r>
+            <w:r>
+              <w:rPr>
+                <w:rStyle w:val="Hipervnculo"/>
+                <w:noProof/>
+              </w:rPr>
+              <w:t>Limpieza de interfaces temporales y aislamiento de red</w:t>
+            </w:r>
+            <w:r>
+              <w:rPr>
+                <w:noProof/>
+                <w:webHidden/>
+              </w:rPr>
+              <w:tab/>
+            </w:r>
+            <w:r>
+              <w:rPr>
+                <w:noProof/>
+                <w:webHidden/>
+              </w:rPr>
+              <w:fldChar w:fldCharType="begin"/>
+            </w:r>
+            <w:r>
+              <w:rPr>
+                <w:noProof/>
+                <w:webHidden/>
+              </w:rPr>
+              <w:instrText xml:space="preserve"> PAGEREF _Toc242351571 \h </w:instrText>
+            </w:r>
+            <w:r>
+              <w:rPr>
+                <w:noProof/>
+                <w:webHidden/>
+              </w:rPr>
+            </w:r>
+            <w:r>
+              <w:rPr>
+                <w:noProof/>
+                <w:webHidden/>
+              </w:rPr>
+              <w:fldChar w:fldCharType="separate"/>
+            </w:r>
+            <w:r>
+              <w:rPr>
+                <w:noProof/>
+                <w:webHidden/>
+              </w:rPr>
+              <w:t>13</w:t>
+            </w:r>
+            <w:r>
+              <w:rPr>
+                <w:noProof/>
+                <w:webHidden/>
+              </w:rPr>
+              <w:fldChar w:fldCharType="end"/>
+            </w:r>
+          </w:hyperlink>
+        </w:p>
+        <w:p>
+          <w:pPr>
+            <w:pStyle w:val="TDC2"/>
+            <w:tabs>
+              <w:tab w:val="right" w:pos="8494"/>
+            </w:tabs>
+            <w:rPr>
+              <w:rFonts w:asciiTheme="minorHAnsi" w:eastAsiaTheme="minorEastAsia" w:hAnsiTheme="minorHAnsi" w:cstheme="minorBidi"/>
+              <w:noProof/>
+              <w:kern w:val="2"/>
+              <w:sz w:val="24"/>
+              <w:szCs w:val="24"/>
+              <w:lang w:val="es-ES"/>
+              <w14:ligatures w14:val="standardContextual"/>
+            </w:rPr>
+          </w:pPr>
+          <w:hyperlink w:anchor="_Toc242351572" w:history="1">
+            <w:r>
+              <w:rPr>
+                <w:rStyle w:val="Hipervnculo"/>
+                <w:noProof/>
+              </w:rPr>
+              <w:t>Paso 1: En la máquina virtual Server (Backend)</w:t>
+            </w:r>
+            <w:r>
+              <w:rPr>
+                <w:noProof/>
+                <w:webHidden/>
+              </w:rPr>
+              <w:tab/>
+            </w:r>
+            <w:r>
+              <w:rPr>
+                <w:noProof/>
+                <w:webHidden/>
+              </w:rPr>
+              <w:fldChar w:fldCharType="begin"/>
+            </w:r>
+            <w:r>
+              <w:rPr>
+                <w:noProof/>
+                <w:webHidden/>
+              </w:rPr>
+              <w:instrText xml:space="preserve"> PAGEREF _Toc242351572 \h </w:instrText>
+            </w:r>
+            <w:r>
+              <w:rPr>
+                <w:noProof/>
+                <w:webHidden/>
+              </w:rPr>
+            </w:r>
+            <w:r>
+              <w:rPr>
+                <w:noProof/>
+                <w:webHidden/>
+              </w:rPr>
+              <w:fldChar w:fldCharType="separate"/>
+            </w:r>
+            <w:r>
+              <w:rPr>
+                <w:noProof/>
+                <w:webHidden/>
+              </w:rPr>
+              <w:t>13</w:t>
+            </w:r>
+            <w:r>
+              <w:rPr>
+                <w:noProof/>
+                <w:webHidden/>
+              </w:rPr>
+              <w:fldChar w:fldCharType="end"/>
+            </w:r>
+          </w:hyperlink>
+        </w:p>
+        <w:p>
+          <w:pPr>
+            <w:pStyle w:val="TDC2"/>
+            <w:tabs>
+              <w:tab w:val="right" w:pos="8494"/>
+            </w:tabs>
+            <w:rPr>
+              <w:rFonts w:asciiTheme="minorHAnsi" w:eastAsiaTheme="minorEastAsia" w:hAnsiTheme="minorHAnsi" w:cstheme="minorBidi"/>
+              <w:noProof/>
+              <w:kern w:val="2"/>
+              <w:sz w:val="24"/>
+              <w:szCs w:val="24"/>
+              <w:lang w:val="es-ES"/>
+              <w14:ligatures w14:val="standardContextual"/>
+            </w:rPr>
+          </w:pPr>
+          <w:hyperlink w:anchor="_Toc242351573" w:history="1">
+            <w:r>
+              <w:rPr>
+                <w:rStyle w:val="Hipervnculo"/>
+                <w:noProof/>
+              </w:rPr>
+              <w:t>Paso 2: En la máquina virtual de Base de Datos</w:t>
+            </w:r>
+            <w:r>
+              <w:rPr>
+                <w:noProof/>
+                <w:webHidden/>
+              </w:rPr>
+              <w:tab/>
+            </w:r>
+            <w:r>
+              <w:rPr>
+                <w:noProof/>
+                <w:webHidden/>
+              </w:rPr>
+              <w:fldChar w:fldCharType="begin"/>
+            </w:r>
+            <w:r>
+              <w:rPr>
+                <w:noProof/>
+                <w:webHidden/>
+              </w:rPr>
+              <w:instrText xml:space="preserve"> PAGEREF _Toc242351573 \h </w:instrText>
+            </w:r>
+            <w:r>
+              <w:rPr>
+                <w:noProof/>
+                <w:webHidden/>
+              </w:rPr>
+            </w:r>
+            <w:r>
+              <w:rPr>
+                <w:noProof/>
+                <w:webHidden/>
+              </w:rPr>
+              <w:fldChar w:fldCharType="separate"/>
+            </w:r>
+            <w:r>
+              <w:rPr>
+                <w:noProof/>
+                <w:webHidden/>
+              </w:rPr>
+              <w:t>14</w:t>
             </w:r>
             <w:r>
               <w:rPr>
@@ -1570,7 +2330,7 @@
           <w:numId w:val="11"/>
         </w:numPr>
       </w:pPr>
-      <w:bookmarkStart w:id="1" w:name="_Toc242293207"/>
+      <w:bookmarkStart w:id="1" w:name="_Toc242351550"/>
       <w:r>
         <w:lastRenderedPageBreak/>
         <w:t>Configurar la MV que hace la función de Proxy HTTP</w:t>
@@ -1599,7 +2359,7 @@
         <w:pStyle w:val="Ttulo2"/>
         <w:ind w:left="0"/>
       </w:pPr>
-      <w:bookmarkStart w:id="2" w:name="_Toc242293208"/>
+      <w:bookmarkStart w:id="2" w:name="_Toc242351551"/>
       <w:r>
         <w:t xml:space="preserve">Paso 1: </w:t>
       </w:r>
@@ -1840,7 +2600,7 @@
         <w:pStyle w:val="Ttulo2"/>
         <w:ind w:left="0"/>
       </w:pPr>
-      <w:bookmarkStart w:id="4" w:name="_Toc242293209"/>
+      <w:bookmarkStart w:id="4" w:name="_Toc242351552"/>
       <w:r>
         <w:t xml:space="preserve">Paso </w:t>
       </w:r>
@@ -2317,7 +3077,7 @@
           <w:lang w:val="es"/>
         </w:rPr>
       </w:pPr>
-      <w:bookmarkStart w:id="5" w:name="_Toc242293210"/>
+      <w:bookmarkStart w:id="5" w:name="_Toc242351553"/>
       <w:r>
         <w:t xml:space="preserve">Paso </w:t>
       </w:r>
@@ -2606,7 +3366,7 @@
         <w:pStyle w:val="Ttulo2"/>
         <w:ind w:left="0"/>
       </w:pPr>
-      <w:bookmarkStart w:id="6" w:name="_Toc242293211"/>
+      <w:bookmarkStart w:id="6" w:name="_Toc242351554"/>
       <w:r>
         <w:t xml:space="preserve">Paso </w:t>
       </w:r>
@@ -2740,7 +3500,7 @@
           <w:numId w:val="11"/>
         </w:numPr>
       </w:pPr>
-      <w:bookmarkStart w:id="7" w:name="_Toc242293212"/>
+      <w:bookmarkStart w:id="7" w:name="_Toc242351555"/>
       <w:r>
         <w:lastRenderedPageBreak/>
         <w:t xml:space="preserve">Configuración del servidor </w:t>
@@ -2809,7 +3569,7 @@
         <w:pStyle w:val="Ttulo2"/>
         <w:ind w:left="0"/>
       </w:pPr>
-      <w:bookmarkStart w:id="8" w:name="_Toc242293213"/>
+      <w:bookmarkStart w:id="8" w:name="_Toc242351556"/>
       <w:r>
         <w:t xml:space="preserve">Paso 1: </w:t>
       </w:r>
@@ -3265,16 +4025,10 @@
         <w:pStyle w:val="Ttulo2"/>
         <w:ind w:left="0"/>
       </w:pPr>
-      <w:bookmarkStart w:id="9" w:name="_Toc242293214"/>
+      <w:bookmarkStart w:id="9" w:name="_Toc242351557"/>
       <w:r>
         <w:lastRenderedPageBreak/>
-        <w:t xml:space="preserve">Paso </w:t>
-      </w:r>
-      <w:r>
-        <w:t>2</w:t>
-      </w:r>
-      <w:r>
-        <w:t xml:space="preserve">: </w:t>
+        <w:t xml:space="preserve">Paso 2: </w:t>
       </w:r>
       <w:r>
         <w:rPr>
@@ -3568,16 +4322,10 @@
           <w:lang w:val="es"/>
         </w:rPr>
       </w:pPr>
-      <w:bookmarkStart w:id="10" w:name="_Toc242293215"/>
+      <w:bookmarkStart w:id="10" w:name="_Toc242351558"/>
       <w:r>
         <w:lastRenderedPageBreak/>
-        <w:t xml:space="preserve">Paso </w:t>
-      </w:r>
-      <w:r>
-        <w:t>3</w:t>
-      </w:r>
-      <w:r>
-        <w:t xml:space="preserve">: </w:t>
+        <w:t xml:space="preserve">Paso 3: </w:t>
       </w:r>
       <w:r>
         <w:rPr>
@@ -3841,15 +4589,9 @@
           <w:lang w:val="es"/>
         </w:rPr>
       </w:pPr>
-      <w:bookmarkStart w:id="11" w:name="_Toc242293216"/>
-      <w:r>
-        <w:t xml:space="preserve">Paso </w:t>
-      </w:r>
-      <w:r>
-        <w:t>4</w:t>
-      </w:r>
-      <w:r>
-        <w:t xml:space="preserve">: </w:t>
+      <w:bookmarkStart w:id="11" w:name="_Toc242351559"/>
+      <w:r>
+        <w:t xml:space="preserve">Paso 4: </w:t>
       </w:r>
       <w:r>
         <w:rPr>
@@ -3979,7 +4721,7 @@
           <w:numId w:val="11"/>
         </w:numPr>
       </w:pPr>
-      <w:bookmarkStart w:id="12" w:name="_Toc242293217"/>
+      <w:bookmarkStart w:id="12" w:name="_Toc242351560"/>
       <w:r>
         <w:lastRenderedPageBreak/>
         <w:t>Configuración del servidor de base de datos con MongoDB</w:t>
@@ -3988,45 +4730,1117 @@
     </w:p>
     <w:p>
       <w:pPr>
+        <w:spacing w:before="240" w:after="160" w:line="259" w:lineRule="auto"/>
+        <w:ind w:left="0"/>
+        <w:jc w:val="left"/>
+        <w:rPr>
+          <w:lang w:val="es-ES"/>
+        </w:rPr>
+      </w:pPr>
+      <w:r>
+        <w:rPr>
+          <w:lang w:val="es-ES"/>
+        </w:rPr>
+        <w:t xml:space="preserve">En la máquina virtual de base de datos se instala MongoDB 8.0, configurando la autenticación requerida para la conexión del </w:t>
+      </w:r>
+      <w:proofErr w:type="spellStart"/>
+      <w:r>
+        <w:rPr>
+          <w:lang w:val="es-ES"/>
+        </w:rPr>
+        <w:t>backend</w:t>
+      </w:r>
+      <w:proofErr w:type="spellEnd"/>
+      <w:r>
+        <w:rPr>
+          <w:lang w:val="es-ES"/>
+        </w:rPr>
+        <w:t xml:space="preserve"> y gestionando su ejecución automática mediante </w:t>
+      </w:r>
+      <w:proofErr w:type="spellStart"/>
+      <w:r>
+        <w:rPr>
+          <w:lang w:val="es-ES"/>
+        </w:rPr>
+        <w:t>systemctl</w:t>
+      </w:r>
+      <w:proofErr w:type="spellEnd"/>
+      <w:r>
+        <w:rPr>
+          <w:lang w:val="es-ES"/>
+        </w:rPr>
+        <w:t>.</w:t>
+      </w:r>
+    </w:p>
+    <w:p>
+      <w:pPr>
         <w:pStyle w:val="Ttulo2"/>
         <w:ind w:left="0"/>
       </w:pPr>
-      <w:bookmarkStart w:id="13" w:name="_Toc242293218"/>
+      <w:bookmarkStart w:id="13" w:name="_Toc242351561"/>
       <w:r>
         <w:t>Paso</w:t>
       </w:r>
       <w:r>
-        <w:t xml:space="preserve"> 1: Creación y configuración de la máquina Proxy</w:t>
+        <w:t xml:space="preserve"> 1: </w:t>
+      </w:r>
+      <w:r>
+        <w:rPr>
+          <w:lang w:val="es"/>
+        </w:rPr>
+        <w:t>Acceso temporal a internet</w:t>
       </w:r>
       <w:bookmarkEnd w:id="13"/>
     </w:p>
     <w:p>
       <w:pPr>
-        <w:spacing w:before="240" w:after="160" w:line="259" w:lineRule="auto"/>
+        <w:spacing w:after="160" w:line="259" w:lineRule="auto"/>
         <w:ind w:left="0"/>
         <w:jc w:val="left"/>
-        <w:rPr>
-          <w:lang w:val="es-ES"/>
-        </w:rPr>
-      </w:pPr>
-      <w:proofErr w:type="spellStart"/>
-      <w:r>
-        <w:rPr>
-          <w:lang w:val="es-ES"/>
-        </w:rPr>
-        <w:t>aaa</w:t>
-      </w:r>
-      <w:proofErr w:type="spellEnd"/>
+      </w:pPr>
+      <w:r>
+        <w:t xml:space="preserve">Se habilita temporalmente la interfaz conectada a la red externa (ens8) y se solicita una dirección IP mediante DHCP para poder descargar los paquetes. </w:t>
+      </w:r>
     </w:p>
     <w:p>
       <w:pPr>
         <w:spacing w:after="160" w:line="259" w:lineRule="auto"/>
         <w:ind w:left="0"/>
+        <w:jc w:val="center"/>
+        <w:rPr>
+          <w:lang w:val="es-ES"/>
+        </w:rPr>
+      </w:pPr>
+      <w:r>
+        <w:rPr>
+          <w:noProof/>
+        </w:rPr>
+        <w:drawing>
+          <wp:inline distT="0" distB="0" distL="0" distR="0" wp14:anchorId="52C4774C" wp14:editId="0903C5BC">
+            <wp:extent cx="5072332" cy="2158922"/>
+            <wp:effectExtent l="0" t="0" r="0" b="0"/>
+            <wp:docPr id="21" name="Imagen 21"/>
+            <wp:cNvGraphicFramePr>
+              <a:graphicFrameLocks xmlns:a="http://schemas.openxmlformats.org/drawingml/2006/main" noChangeAspect="1"/>
+            </wp:cNvGraphicFramePr>
+            <a:graphic xmlns:a="http://schemas.openxmlformats.org/drawingml/2006/main">
+              <a:graphicData uri="http://schemas.openxmlformats.org/drawingml/2006/picture">
+                <pic:pic xmlns:pic="http://schemas.openxmlformats.org/drawingml/2006/picture">
+                  <pic:nvPicPr>
+                    <pic:cNvPr id="0" name="Picture 1"/>
+                    <pic:cNvPicPr>
+                      <a:picLocks noChangeAspect="1" noChangeArrowheads="1"/>
+                    </pic:cNvPicPr>
+                  </pic:nvPicPr>
+                  <pic:blipFill>
+                    <a:blip r:embed="rId27">
+                      <a:extLst>
+                        <a:ext uri="{28A0092B-C50C-407E-A947-70E740481C1C}">
+                          <a14:useLocalDpi xmlns:a14="http://schemas.microsoft.com/office/drawing/2010/main" val="0"/>
+                        </a:ext>
+                      </a:extLst>
+                    </a:blip>
+                    <a:srcRect/>
+                    <a:stretch>
+                      <a:fillRect/>
+                    </a:stretch>
+                  </pic:blipFill>
+                  <pic:spPr bwMode="auto">
+                    <a:xfrm>
+                      <a:off x="0" y="0"/>
+                      <a:ext cx="5077110" cy="2160956"/>
+                    </a:xfrm>
+                    <a:prstGeom prst="rect">
+                      <a:avLst/>
+                    </a:prstGeom>
+                    <a:noFill/>
+                    <a:ln>
+                      <a:noFill/>
+                    </a:ln>
+                  </pic:spPr>
+                </pic:pic>
+              </a:graphicData>
+            </a:graphic>
+          </wp:inline>
+        </w:drawing>
+      </w:r>
+      <w:r>
+        <w:rPr>
+          <w:lang w:val="es-ES"/>
+        </w:rPr>
+        <w:t>.</w:t>
+      </w:r>
+    </w:p>
+    <w:p>
+      <w:pPr>
+        <w:pStyle w:val="Ttulo2"/>
+        <w:ind w:left="0"/>
+      </w:pPr>
+      <w:bookmarkStart w:id="14" w:name="_Toc242351562"/>
+      <w:r>
+        <w:t>Paso</w:t>
+      </w:r>
+      <w:r>
+        <w:t xml:space="preserve"> </w:t>
+      </w:r>
+      <w:r>
+        <w:t>2</w:t>
+      </w:r>
+      <w:r>
+        <w:t xml:space="preserve">: </w:t>
+      </w:r>
+      <w:r>
+        <w:rPr>
+          <w:lang w:val="es"/>
+        </w:rPr>
+        <w:t>Instalación de MongoDB 8.0</w:t>
+      </w:r>
+      <w:bookmarkEnd w:id="14"/>
+    </w:p>
+    <w:p>
+      <w:pPr>
+        <w:spacing w:after="160" w:line="259" w:lineRule="auto"/>
+        <w:ind w:left="0"/>
+      </w:pPr>
+      <w:r>
+        <w:t>Se instalan las herramientas necesarias (</w:t>
+      </w:r>
+      <w:proofErr w:type="spellStart"/>
+      <w:r>
+        <w:t>curl</w:t>
+      </w:r>
+      <w:proofErr w:type="spellEnd"/>
+      <w:r>
+        <w:t xml:space="preserve"> y </w:t>
+      </w:r>
+      <w:proofErr w:type="spellStart"/>
+      <w:r>
+        <w:t>gnupg</w:t>
+      </w:r>
+      <w:proofErr w:type="spellEnd"/>
+      <w:r>
+        <w:t xml:space="preserve">) y se añade la clave GPG junto con el repositorio oficial de MongoDB para Debian 12. </w:t>
+      </w:r>
+    </w:p>
+    <w:p>
+      <w:pPr>
+        <w:spacing w:after="160" w:line="259" w:lineRule="auto"/>
+        <w:ind w:left="0"/>
+        <w:jc w:val="center"/>
+      </w:pPr>
+      <w:r>
+        <w:rPr>
+          <w:noProof/>
+        </w:rPr>
+        <w:drawing>
+          <wp:inline distT="0" distB="0" distL="0" distR="0" wp14:anchorId="0BCAB635" wp14:editId="7ABCC25A">
+            <wp:extent cx="3709670" cy="172720"/>
+            <wp:effectExtent l="0" t="0" r="5080" b="0"/>
+            <wp:docPr id="23" name="Imagen 23"/>
+            <wp:cNvGraphicFramePr>
+              <a:graphicFrameLocks xmlns:a="http://schemas.openxmlformats.org/drawingml/2006/main" noChangeAspect="1"/>
+            </wp:cNvGraphicFramePr>
+            <a:graphic xmlns:a="http://schemas.openxmlformats.org/drawingml/2006/main">
+              <a:graphicData uri="http://schemas.openxmlformats.org/drawingml/2006/picture">
+                <pic:pic xmlns:pic="http://schemas.openxmlformats.org/drawingml/2006/picture">
+                  <pic:nvPicPr>
+                    <pic:cNvPr id="0" name="Picture 2"/>
+                    <pic:cNvPicPr>
+                      <a:picLocks noChangeAspect="1" noChangeArrowheads="1"/>
+                    </pic:cNvPicPr>
+                  </pic:nvPicPr>
+                  <pic:blipFill>
+                    <a:blip r:embed="rId28">
+                      <a:extLst>
+                        <a:ext uri="{28A0092B-C50C-407E-A947-70E740481C1C}">
+                          <a14:useLocalDpi xmlns:a14="http://schemas.microsoft.com/office/drawing/2010/main" val="0"/>
+                        </a:ext>
+                      </a:extLst>
+                    </a:blip>
+                    <a:srcRect/>
+                    <a:stretch>
+                      <a:fillRect/>
+                    </a:stretch>
+                  </pic:blipFill>
+                  <pic:spPr bwMode="auto">
+                    <a:xfrm>
+                      <a:off x="0" y="0"/>
+                      <a:ext cx="3709670" cy="172720"/>
+                    </a:xfrm>
+                    <a:prstGeom prst="rect">
+                      <a:avLst/>
+                    </a:prstGeom>
+                    <a:noFill/>
+                    <a:ln>
+                      <a:noFill/>
+                    </a:ln>
+                  </pic:spPr>
+                </pic:pic>
+              </a:graphicData>
+            </a:graphic>
+          </wp:inline>
+        </w:drawing>
+      </w:r>
+    </w:p>
+    <w:p>
+      <w:pPr>
+        <w:spacing w:after="160" w:line="259" w:lineRule="auto"/>
+        <w:ind w:left="0"/>
+        <w:jc w:val="center"/>
+        <w:rPr>
+          <w:lang w:val="es-ES"/>
+        </w:rPr>
+      </w:pPr>
+      <w:r>
+        <w:rPr>
+          <w:noProof/>
+          <w:lang w:val="es-ES"/>
+        </w:rPr>
+        <w:drawing>
+          <wp:inline distT="0" distB="0" distL="0" distR="0" wp14:anchorId="32FEB7CE" wp14:editId="62ADD61E">
+            <wp:extent cx="5400040" cy="1043940"/>
+            <wp:effectExtent l="0" t="0" r="0" b="3810"/>
+            <wp:docPr id="24" name="Imagen 24"/>
+            <wp:cNvGraphicFramePr>
+              <a:graphicFrameLocks xmlns:a="http://schemas.openxmlformats.org/drawingml/2006/main" noChangeAspect="1"/>
+            </wp:cNvGraphicFramePr>
+            <a:graphic xmlns:a="http://schemas.openxmlformats.org/drawingml/2006/main">
+              <a:graphicData uri="http://schemas.openxmlformats.org/drawingml/2006/picture">
+                <pic:pic xmlns:pic="http://schemas.openxmlformats.org/drawingml/2006/picture">
+                  <pic:nvPicPr>
+                    <pic:cNvPr id="0" name="Picture 3"/>
+                    <pic:cNvPicPr>
+                      <a:picLocks noChangeAspect="1" noChangeArrowheads="1"/>
+                    </pic:cNvPicPr>
+                  </pic:nvPicPr>
+                  <pic:blipFill>
+                    <a:blip r:embed="rId29">
+                      <a:extLst>
+                        <a:ext uri="{28A0092B-C50C-407E-A947-70E740481C1C}">
+                          <a14:useLocalDpi xmlns:a14="http://schemas.microsoft.com/office/drawing/2010/main" val="0"/>
+                        </a:ext>
+                      </a:extLst>
+                    </a:blip>
+                    <a:srcRect/>
+                    <a:stretch>
+                      <a:fillRect/>
+                    </a:stretch>
+                  </pic:blipFill>
+                  <pic:spPr bwMode="auto">
+                    <a:xfrm>
+                      <a:off x="0" y="0"/>
+                      <a:ext cx="5400040" cy="1043940"/>
+                    </a:xfrm>
+                    <a:prstGeom prst="rect">
+                      <a:avLst/>
+                    </a:prstGeom>
+                    <a:noFill/>
+                    <a:ln>
+                      <a:noFill/>
+                    </a:ln>
+                  </pic:spPr>
+                </pic:pic>
+              </a:graphicData>
+            </a:graphic>
+          </wp:inline>
+        </w:drawing>
+      </w:r>
+    </w:p>
+    <w:p>
+      <w:pPr>
+        <w:spacing w:after="160" w:line="259" w:lineRule="auto"/>
+        <w:ind w:left="0"/>
+      </w:pPr>
+      <w:r>
+        <w:t xml:space="preserve">A continuación, se instala el paquete </w:t>
+      </w:r>
+      <w:proofErr w:type="spellStart"/>
+      <w:r>
+        <w:t>mongodb-org</w:t>
+      </w:r>
+      <w:proofErr w:type="spellEnd"/>
+      <w:r>
+        <w:t xml:space="preserve"> en su versión 8.0, se habilita el demonio en </w:t>
+      </w:r>
+      <w:proofErr w:type="spellStart"/>
+      <w:r>
+        <w:t>systemctl</w:t>
+      </w:r>
+      <w:proofErr w:type="spellEnd"/>
+      <w:r>
+        <w:t xml:space="preserve"> para su inicio automático y se verifica la versión instalada (2.13.0 para </w:t>
+      </w:r>
+      <w:proofErr w:type="spellStart"/>
+      <w:r>
+        <w:t>mongosh</w:t>
+      </w:r>
+      <w:proofErr w:type="spellEnd"/>
+      <w:r>
+        <w:t>).</w:t>
+      </w:r>
+    </w:p>
+    <w:p>
+      <w:pPr>
+        <w:spacing w:after="160" w:line="259" w:lineRule="auto"/>
+        <w:ind w:left="0"/>
+        <w:jc w:val="center"/>
+        <w:rPr>
+          <w:lang w:val="es-ES"/>
+        </w:rPr>
+      </w:pPr>
+      <w:r>
+        <w:rPr>
+          <w:noProof/>
+        </w:rPr>
+        <w:drawing>
+          <wp:inline distT="0" distB="0" distL="0" distR="0" wp14:anchorId="65F3315E" wp14:editId="5B64ADAA">
+            <wp:extent cx="3752215" cy="207010"/>
+            <wp:effectExtent l="0" t="0" r="635" b="2540"/>
+            <wp:docPr id="25" name="Imagen 25"/>
+            <wp:cNvGraphicFramePr>
+              <a:graphicFrameLocks xmlns:a="http://schemas.openxmlformats.org/drawingml/2006/main" noChangeAspect="1"/>
+            </wp:cNvGraphicFramePr>
+            <a:graphic xmlns:a="http://schemas.openxmlformats.org/drawingml/2006/main">
+              <a:graphicData uri="http://schemas.openxmlformats.org/drawingml/2006/picture">
+                <pic:pic xmlns:pic="http://schemas.openxmlformats.org/drawingml/2006/picture">
+                  <pic:nvPicPr>
+                    <pic:cNvPr id="0" name="Picture 4"/>
+                    <pic:cNvPicPr>
+                      <a:picLocks noChangeAspect="1" noChangeArrowheads="1"/>
+                    </pic:cNvPicPr>
+                  </pic:nvPicPr>
+                  <pic:blipFill>
+                    <a:blip r:embed="rId30">
+                      <a:extLst>
+                        <a:ext uri="{28A0092B-C50C-407E-A947-70E740481C1C}">
+                          <a14:useLocalDpi xmlns:a14="http://schemas.microsoft.com/office/drawing/2010/main" val="0"/>
+                        </a:ext>
+                      </a:extLst>
+                    </a:blip>
+                    <a:srcRect/>
+                    <a:stretch>
+                      <a:fillRect/>
+                    </a:stretch>
+                  </pic:blipFill>
+                  <pic:spPr bwMode="auto">
+                    <a:xfrm>
+                      <a:off x="0" y="0"/>
+                      <a:ext cx="3752215" cy="207010"/>
+                    </a:xfrm>
+                    <a:prstGeom prst="rect">
+                      <a:avLst/>
+                    </a:prstGeom>
+                    <a:noFill/>
+                    <a:ln>
+                      <a:noFill/>
+                    </a:ln>
+                  </pic:spPr>
+                </pic:pic>
+              </a:graphicData>
+            </a:graphic>
+          </wp:inline>
+        </w:drawing>
+      </w:r>
+    </w:p>
+    <w:p>
+      <w:pPr>
+        <w:spacing w:after="160" w:line="259" w:lineRule="auto"/>
+        <w:ind w:left="0"/>
+        <w:rPr>
+          <w:lang w:val="es-ES"/>
+        </w:rPr>
+      </w:pPr>
+      <w:r>
+        <w:rPr>
+          <w:noProof/>
+          <w:lang w:val="es-ES"/>
+        </w:rPr>
+        <w:drawing>
+          <wp:inline distT="0" distB="0" distL="0" distR="0" wp14:anchorId="58F4950F" wp14:editId="74B33D3F">
+            <wp:extent cx="5391785" cy="526415"/>
+            <wp:effectExtent l="0" t="0" r="0" b="6985"/>
+            <wp:docPr id="26" name="Imagen 26"/>
+            <wp:cNvGraphicFramePr>
+              <a:graphicFrameLocks xmlns:a="http://schemas.openxmlformats.org/drawingml/2006/main" noChangeAspect="1"/>
+            </wp:cNvGraphicFramePr>
+            <a:graphic xmlns:a="http://schemas.openxmlformats.org/drawingml/2006/main">
+              <a:graphicData uri="http://schemas.openxmlformats.org/drawingml/2006/picture">
+                <pic:pic xmlns:pic="http://schemas.openxmlformats.org/drawingml/2006/picture">
+                  <pic:nvPicPr>
+                    <pic:cNvPr id="0" name="Picture 5"/>
+                    <pic:cNvPicPr>
+                      <a:picLocks noChangeAspect="1" noChangeArrowheads="1"/>
+                    </pic:cNvPicPr>
+                  </pic:nvPicPr>
+                  <pic:blipFill>
+                    <a:blip r:embed="rId31">
+                      <a:extLst>
+                        <a:ext uri="{28A0092B-C50C-407E-A947-70E740481C1C}">
+                          <a14:useLocalDpi xmlns:a14="http://schemas.microsoft.com/office/drawing/2010/main" val="0"/>
+                        </a:ext>
+                      </a:extLst>
+                    </a:blip>
+                    <a:srcRect/>
+                    <a:stretch>
+                      <a:fillRect/>
+                    </a:stretch>
+                  </pic:blipFill>
+                  <pic:spPr bwMode="auto">
+                    <a:xfrm>
+                      <a:off x="0" y="0"/>
+                      <a:ext cx="5391785" cy="526415"/>
+                    </a:xfrm>
+                    <a:prstGeom prst="rect">
+                      <a:avLst/>
+                    </a:prstGeom>
+                    <a:noFill/>
+                    <a:ln>
+                      <a:noFill/>
+                    </a:ln>
+                  </pic:spPr>
+                </pic:pic>
+              </a:graphicData>
+            </a:graphic>
+          </wp:inline>
+        </w:drawing>
+      </w:r>
+    </w:p>
+    <w:p>
+      <w:pPr>
+        <w:spacing w:after="160" w:line="259" w:lineRule="auto"/>
+        <w:ind w:left="0"/>
         <w:jc w:val="left"/>
         <w:rPr>
-          <w:lang w:val="es-ES"/>
-        </w:rPr>
-      </w:pPr>
+          <w:rFonts w:ascii="Montserrat Medium" w:eastAsiaTheme="majorEastAsia" w:hAnsi="Montserrat Medium" w:cstheme="majorBidi"/>
+          <w:kern w:val="2"/>
+          <w:sz w:val="24"/>
+          <w:szCs w:val="32"/>
+          <w:lang w:val="es-ES" w:eastAsia="en-US"/>
+          <w14:ligatures w14:val="standardContextual"/>
+        </w:rPr>
+      </w:pPr>
+      <w:r>
+        <w:br w:type="page"/>
+      </w:r>
+    </w:p>
+    <w:p>
+      <w:pPr>
+        <w:pStyle w:val="Ttulo2"/>
+        <w:ind w:left="0"/>
+      </w:pPr>
+      <w:bookmarkStart w:id="15" w:name="_Toc242351563"/>
+      <w:r>
+        <w:lastRenderedPageBreak/>
+        <w:t>Paso</w:t>
+      </w:r>
+      <w:r>
+        <w:t xml:space="preserve"> </w:t>
+      </w:r>
+      <w:r>
+        <w:t>3</w:t>
+      </w:r>
+      <w:r>
+        <w:t xml:space="preserve">: </w:t>
+      </w:r>
+      <w:r>
+        <w:rPr>
+          <w:lang w:val="es"/>
+        </w:rPr>
+        <w:t>Creación del usuario administrador</w:t>
+      </w:r>
+      <w:bookmarkEnd w:id="15"/>
+    </w:p>
+    <w:p>
+      <w:pPr>
+        <w:spacing w:after="160" w:line="259" w:lineRule="auto"/>
+        <w:ind w:left="0"/>
+      </w:pPr>
+      <w:r>
+        <w:t xml:space="preserve">Antes de activar la seguridad, se accede a la consola de MongoDB y se crea un usuario administrador global en la base de datos </w:t>
+      </w:r>
+      <w:proofErr w:type="spellStart"/>
+      <w:r>
+        <w:t>admin</w:t>
+      </w:r>
+      <w:proofErr w:type="spellEnd"/>
+      <w:r>
+        <w:t>. Si se omitiera este paso, el servidor quedaría inaccesible al requerir autenticación sin existir usuarios.</w:t>
+      </w:r>
+    </w:p>
+    <w:p>
+      <w:pPr>
+        <w:spacing w:after="160" w:line="259" w:lineRule="auto"/>
+        <w:ind w:left="0"/>
+        <w:jc w:val="center"/>
+        <w:rPr>
+          <w:lang w:val="es-ES"/>
+        </w:rPr>
+      </w:pPr>
+      <w:r>
+        <w:rPr>
+          <w:noProof/>
+        </w:rPr>
+        <w:drawing>
+          <wp:inline distT="0" distB="0" distL="0" distR="0" wp14:anchorId="4CB758E8" wp14:editId="47239E96">
+            <wp:extent cx="5391785" cy="1647825"/>
+            <wp:effectExtent l="0" t="0" r="0" b="9525"/>
+            <wp:docPr id="27" name="Imagen 27"/>
+            <wp:cNvGraphicFramePr>
+              <a:graphicFrameLocks xmlns:a="http://schemas.openxmlformats.org/drawingml/2006/main" noChangeAspect="1"/>
+            </wp:cNvGraphicFramePr>
+            <a:graphic xmlns:a="http://schemas.openxmlformats.org/drawingml/2006/main">
+              <a:graphicData uri="http://schemas.openxmlformats.org/drawingml/2006/picture">
+                <pic:pic xmlns:pic="http://schemas.openxmlformats.org/drawingml/2006/picture">
+                  <pic:nvPicPr>
+                    <pic:cNvPr id="0" name="Picture 6"/>
+                    <pic:cNvPicPr>
+                      <a:picLocks noChangeAspect="1" noChangeArrowheads="1"/>
+                    </pic:cNvPicPr>
+                  </pic:nvPicPr>
+                  <pic:blipFill>
+                    <a:blip r:embed="rId32">
+                      <a:extLst>
+                        <a:ext uri="{28A0092B-C50C-407E-A947-70E740481C1C}">
+                          <a14:useLocalDpi xmlns:a14="http://schemas.microsoft.com/office/drawing/2010/main" val="0"/>
+                        </a:ext>
+                      </a:extLst>
+                    </a:blip>
+                    <a:srcRect/>
+                    <a:stretch>
+                      <a:fillRect/>
+                    </a:stretch>
+                  </pic:blipFill>
+                  <pic:spPr bwMode="auto">
+                    <a:xfrm>
+                      <a:off x="0" y="0"/>
+                      <a:ext cx="5391785" cy="1647825"/>
+                    </a:xfrm>
+                    <a:prstGeom prst="rect">
+                      <a:avLst/>
+                    </a:prstGeom>
+                    <a:noFill/>
+                    <a:ln>
+                      <a:noFill/>
+                    </a:ln>
+                  </pic:spPr>
+                </pic:pic>
+              </a:graphicData>
+            </a:graphic>
+          </wp:inline>
+        </w:drawing>
+      </w:r>
+    </w:p>
+    <w:p>
+      <w:pPr>
+        <w:pStyle w:val="Ttulo2"/>
+        <w:ind w:left="0"/>
+      </w:pPr>
+      <w:bookmarkStart w:id="16" w:name="_Toc242351564"/>
+      <w:r>
+        <w:t>Paso</w:t>
+      </w:r>
+      <w:r>
+        <w:t xml:space="preserve"> </w:t>
+      </w:r>
+      <w:r>
+        <w:t>4</w:t>
+      </w:r>
+      <w:r>
+        <w:t xml:space="preserve">: </w:t>
+      </w:r>
+      <w:r>
+        <w:rPr>
+          <w:lang w:val="es"/>
+        </w:rPr>
+        <w:t>Habilitación de la autenticación y configuración de red</w:t>
+      </w:r>
+      <w:bookmarkEnd w:id="16"/>
+    </w:p>
+    <w:p>
+      <w:pPr>
+        <w:spacing w:after="160" w:line="259" w:lineRule="auto"/>
+        <w:ind w:left="0"/>
+      </w:pPr>
+      <w:r>
+        <w:t>Se edita el archivo de configuración /</w:t>
+      </w:r>
+      <w:proofErr w:type="spellStart"/>
+      <w:r>
+        <w:t>etc</w:t>
+      </w:r>
+      <w:proofErr w:type="spellEnd"/>
+      <w:r>
+        <w:t>/</w:t>
+      </w:r>
+      <w:proofErr w:type="spellStart"/>
+      <w:r>
+        <w:t>mongod.conf</w:t>
+      </w:r>
+      <w:proofErr w:type="spellEnd"/>
+      <w:r>
+        <w:t xml:space="preserve">. </w:t>
+      </w:r>
+    </w:p>
+    <w:p>
+      <w:pPr>
+        <w:spacing w:after="160" w:line="259" w:lineRule="auto"/>
+        <w:ind w:left="0"/>
+        <w:jc w:val="center"/>
+        <w:rPr>
+          <w:lang w:val="es-ES"/>
+        </w:rPr>
+      </w:pPr>
+      <w:r>
+        <w:rPr>
+          <w:noProof/>
+        </w:rPr>
+        <w:drawing>
+          <wp:inline distT="0" distB="0" distL="0" distR="0" wp14:anchorId="5D059DDA" wp14:editId="7AC822F9">
+            <wp:extent cx="3398520" cy="180975"/>
+            <wp:effectExtent l="0" t="0" r="0" b="9525"/>
+            <wp:docPr id="28" name="Imagen 28"/>
+            <wp:cNvGraphicFramePr>
+              <a:graphicFrameLocks xmlns:a="http://schemas.openxmlformats.org/drawingml/2006/main" noChangeAspect="1"/>
+            </wp:cNvGraphicFramePr>
+            <a:graphic xmlns:a="http://schemas.openxmlformats.org/drawingml/2006/main">
+              <a:graphicData uri="http://schemas.openxmlformats.org/drawingml/2006/picture">
+                <pic:pic xmlns:pic="http://schemas.openxmlformats.org/drawingml/2006/picture">
+                  <pic:nvPicPr>
+                    <pic:cNvPr id="0" name="Picture 7"/>
+                    <pic:cNvPicPr>
+                      <a:picLocks noChangeAspect="1" noChangeArrowheads="1"/>
+                    </pic:cNvPicPr>
+                  </pic:nvPicPr>
+                  <pic:blipFill>
+                    <a:blip r:embed="rId33">
+                      <a:extLst>
+                        <a:ext uri="{28A0092B-C50C-407E-A947-70E740481C1C}">
+                          <a14:useLocalDpi xmlns:a14="http://schemas.microsoft.com/office/drawing/2010/main" val="0"/>
+                        </a:ext>
+                      </a:extLst>
+                    </a:blip>
+                    <a:srcRect/>
+                    <a:stretch>
+                      <a:fillRect/>
+                    </a:stretch>
+                  </pic:blipFill>
+                  <pic:spPr bwMode="auto">
+                    <a:xfrm>
+                      <a:off x="0" y="0"/>
+                      <a:ext cx="3398520" cy="180975"/>
+                    </a:xfrm>
+                    <a:prstGeom prst="rect">
+                      <a:avLst/>
+                    </a:prstGeom>
+                    <a:noFill/>
+                    <a:ln>
+                      <a:noFill/>
+                    </a:ln>
+                  </pic:spPr>
+                </pic:pic>
+              </a:graphicData>
+            </a:graphic>
+          </wp:inline>
+        </w:drawing>
+      </w:r>
+    </w:p>
+    <w:p>
+      <w:pPr>
+        <w:spacing w:after="160" w:line="259" w:lineRule="auto"/>
+        <w:ind w:left="0"/>
+      </w:pPr>
+      <w:r>
+        <w:t xml:space="preserve">En el bloque net, se modifica la directiva </w:t>
+      </w:r>
+      <w:proofErr w:type="spellStart"/>
+      <w:r>
+        <w:t>bindIp</w:t>
+      </w:r>
+      <w:proofErr w:type="spellEnd"/>
+      <w:r>
+        <w:t xml:space="preserve"> para que el servicio escuche tanto localmente como en la IP de la red interna de la base de datos (172.16.157.2). En el bloque </w:t>
+      </w:r>
+      <w:proofErr w:type="spellStart"/>
+      <w:r>
+        <w:t>security</w:t>
+      </w:r>
+      <w:proofErr w:type="spellEnd"/>
+      <w:r>
+        <w:t xml:space="preserve">, se activa la autenticación definiendo </w:t>
+      </w:r>
+      <w:proofErr w:type="spellStart"/>
+      <w:r>
+        <w:t>authorization</w:t>
+      </w:r>
+      <w:proofErr w:type="spellEnd"/>
+      <w:r>
+        <w:t xml:space="preserve">: </w:t>
+      </w:r>
+      <w:proofErr w:type="spellStart"/>
+      <w:r>
+        <w:t>enabled</w:t>
+      </w:r>
+      <w:proofErr w:type="spellEnd"/>
+      <w:r>
+        <w:t xml:space="preserve">. </w:t>
+      </w:r>
+    </w:p>
+    <w:p>
+      <w:pPr>
+        <w:spacing w:after="160" w:line="259" w:lineRule="auto"/>
+        <w:ind w:left="0"/>
+        <w:jc w:val="center"/>
+        <w:rPr>
+          <w:lang w:val="es-ES"/>
+        </w:rPr>
+      </w:pPr>
+      <w:r>
+        <w:rPr>
+          <w:noProof/>
+        </w:rPr>
+        <w:drawing>
+          <wp:inline distT="0" distB="0" distL="0" distR="0" wp14:anchorId="722268ED" wp14:editId="0F54ADD6">
+            <wp:extent cx="2665730" cy="767715"/>
+            <wp:effectExtent l="0" t="0" r="1270" b="0"/>
+            <wp:docPr id="29" name="Imagen 29"/>
+            <wp:cNvGraphicFramePr>
+              <a:graphicFrameLocks xmlns:a="http://schemas.openxmlformats.org/drawingml/2006/main" noChangeAspect="1"/>
+            </wp:cNvGraphicFramePr>
+            <a:graphic xmlns:a="http://schemas.openxmlformats.org/drawingml/2006/main">
+              <a:graphicData uri="http://schemas.openxmlformats.org/drawingml/2006/picture">
+                <pic:pic xmlns:pic="http://schemas.openxmlformats.org/drawingml/2006/picture">
+                  <pic:nvPicPr>
+                    <pic:cNvPr id="0" name="Picture 8"/>
+                    <pic:cNvPicPr>
+                      <a:picLocks noChangeAspect="1" noChangeArrowheads="1"/>
+                    </pic:cNvPicPr>
+                  </pic:nvPicPr>
+                  <pic:blipFill>
+                    <a:blip r:embed="rId34">
+                      <a:extLst>
+                        <a:ext uri="{28A0092B-C50C-407E-A947-70E740481C1C}">
+                          <a14:useLocalDpi xmlns:a14="http://schemas.microsoft.com/office/drawing/2010/main" val="0"/>
+                        </a:ext>
+                      </a:extLst>
+                    </a:blip>
+                    <a:srcRect/>
+                    <a:stretch>
+                      <a:fillRect/>
+                    </a:stretch>
+                  </pic:blipFill>
+                  <pic:spPr bwMode="auto">
+                    <a:xfrm>
+                      <a:off x="0" y="0"/>
+                      <a:ext cx="2665730" cy="767715"/>
+                    </a:xfrm>
+                    <a:prstGeom prst="rect">
+                      <a:avLst/>
+                    </a:prstGeom>
+                    <a:noFill/>
+                    <a:ln>
+                      <a:noFill/>
+                    </a:ln>
+                  </pic:spPr>
+                </pic:pic>
+              </a:graphicData>
+            </a:graphic>
+          </wp:inline>
+        </w:drawing>
+      </w:r>
+    </w:p>
+    <w:p>
+      <w:pPr>
+        <w:spacing w:after="160" w:line="259" w:lineRule="auto"/>
+        <w:ind w:left="0"/>
+        <w:jc w:val="center"/>
+        <w:rPr>
+          <w:lang w:val="es-ES"/>
+        </w:rPr>
+      </w:pPr>
+      <w:r>
+        <w:rPr>
+          <w:noProof/>
+          <w:lang w:val="es-ES"/>
+        </w:rPr>
+        <w:drawing>
+          <wp:inline distT="0" distB="0" distL="0" distR="0" wp14:anchorId="089FE99B" wp14:editId="7D6F9495">
+            <wp:extent cx="2173605" cy="491490"/>
+            <wp:effectExtent l="0" t="0" r="0" b="3810"/>
+            <wp:docPr id="30" name="Imagen 30"/>
+            <wp:cNvGraphicFramePr>
+              <a:graphicFrameLocks xmlns:a="http://schemas.openxmlformats.org/drawingml/2006/main" noChangeAspect="1"/>
+            </wp:cNvGraphicFramePr>
+            <a:graphic xmlns:a="http://schemas.openxmlformats.org/drawingml/2006/main">
+              <a:graphicData uri="http://schemas.openxmlformats.org/drawingml/2006/picture">
+                <pic:pic xmlns:pic="http://schemas.openxmlformats.org/drawingml/2006/picture">
+                  <pic:nvPicPr>
+                    <pic:cNvPr id="0" name="Picture 9"/>
+                    <pic:cNvPicPr>
+                      <a:picLocks noChangeAspect="1" noChangeArrowheads="1"/>
+                    </pic:cNvPicPr>
+                  </pic:nvPicPr>
+                  <pic:blipFill>
+                    <a:blip r:embed="rId35">
+                      <a:extLst>
+                        <a:ext uri="{28A0092B-C50C-407E-A947-70E740481C1C}">
+                          <a14:useLocalDpi xmlns:a14="http://schemas.microsoft.com/office/drawing/2010/main" val="0"/>
+                        </a:ext>
+                      </a:extLst>
+                    </a:blip>
+                    <a:srcRect/>
+                    <a:stretch>
+                      <a:fillRect/>
+                    </a:stretch>
+                  </pic:blipFill>
+                  <pic:spPr bwMode="auto">
+                    <a:xfrm>
+                      <a:off x="0" y="0"/>
+                      <a:ext cx="2173605" cy="491490"/>
+                    </a:xfrm>
+                    <a:prstGeom prst="rect">
+                      <a:avLst/>
+                    </a:prstGeom>
+                    <a:noFill/>
+                    <a:ln>
+                      <a:noFill/>
+                    </a:ln>
+                  </pic:spPr>
+                </pic:pic>
+              </a:graphicData>
+            </a:graphic>
+          </wp:inline>
+        </w:drawing>
+      </w:r>
+    </w:p>
+    <w:p>
+      <w:pPr>
+        <w:spacing w:after="160" w:line="259" w:lineRule="auto"/>
+        <w:ind w:left="0"/>
+      </w:pPr>
+      <w:r>
+        <w:t xml:space="preserve">Se reinicia el servicio </w:t>
+      </w:r>
+      <w:proofErr w:type="spellStart"/>
+      <w:r>
+        <w:t>mongod</w:t>
+      </w:r>
+      <w:proofErr w:type="spellEnd"/>
+      <w:r>
+        <w:t xml:space="preserve"> para aplicar los cambios y se verifica mediante </w:t>
+      </w:r>
+      <w:proofErr w:type="spellStart"/>
+      <w:r>
+        <w:t>systemctl</w:t>
+      </w:r>
+      <w:proofErr w:type="spellEnd"/>
+      <w:r>
+        <w:t xml:space="preserve"> status que se encuentra active (running) tras las modificaciones.</w:t>
+      </w:r>
+    </w:p>
+    <w:p>
+      <w:pPr>
+        <w:spacing w:after="160" w:line="259" w:lineRule="auto"/>
+        <w:ind w:left="0"/>
+        <w:rPr>
+          <w:lang w:val="es-ES"/>
+        </w:rPr>
+      </w:pPr>
+      <w:r>
+        <w:rPr>
+          <w:noProof/>
+        </w:rPr>
+        <w:drawing>
+          <wp:inline distT="0" distB="0" distL="0" distR="0" wp14:anchorId="201CD85F" wp14:editId="03F5F198">
+            <wp:extent cx="5391785" cy="1578610"/>
+            <wp:effectExtent l="0" t="0" r="0" b="2540"/>
+            <wp:docPr id="31" name="Imagen 31"/>
+            <wp:cNvGraphicFramePr>
+              <a:graphicFrameLocks xmlns:a="http://schemas.openxmlformats.org/drawingml/2006/main" noChangeAspect="1"/>
+            </wp:cNvGraphicFramePr>
+            <a:graphic xmlns:a="http://schemas.openxmlformats.org/drawingml/2006/main">
+              <a:graphicData uri="http://schemas.openxmlformats.org/drawingml/2006/picture">
+                <pic:pic xmlns:pic="http://schemas.openxmlformats.org/drawingml/2006/picture">
+                  <pic:nvPicPr>
+                    <pic:cNvPr id="0" name="Picture 10"/>
+                    <pic:cNvPicPr>
+                      <a:picLocks noChangeAspect="1" noChangeArrowheads="1"/>
+                    </pic:cNvPicPr>
+                  </pic:nvPicPr>
+                  <pic:blipFill>
+                    <a:blip r:embed="rId36">
+                      <a:extLst>
+                        <a:ext uri="{28A0092B-C50C-407E-A947-70E740481C1C}">
+                          <a14:useLocalDpi xmlns:a14="http://schemas.microsoft.com/office/drawing/2010/main" val="0"/>
+                        </a:ext>
+                      </a:extLst>
+                    </a:blip>
+                    <a:srcRect/>
+                    <a:stretch>
+                      <a:fillRect/>
+                    </a:stretch>
+                  </pic:blipFill>
+                  <pic:spPr bwMode="auto">
+                    <a:xfrm>
+                      <a:off x="0" y="0"/>
+                      <a:ext cx="5391785" cy="1578610"/>
+                    </a:xfrm>
+                    <a:prstGeom prst="rect">
+                      <a:avLst/>
+                    </a:prstGeom>
+                    <a:noFill/>
+                    <a:ln>
+                      <a:noFill/>
+                    </a:ln>
+                  </pic:spPr>
+                </pic:pic>
+              </a:graphicData>
+            </a:graphic>
+          </wp:inline>
+        </w:drawing>
+      </w:r>
+    </w:p>
+    <w:p>
+      <w:pPr>
+        <w:spacing w:after="160" w:line="259" w:lineRule="auto"/>
+        <w:ind w:left="0"/>
+        <w:jc w:val="left"/>
+        <w:rPr>
+          <w:rFonts w:ascii="Montserrat Medium" w:eastAsiaTheme="majorEastAsia" w:hAnsi="Montserrat Medium" w:cstheme="majorBidi"/>
+          <w:kern w:val="2"/>
+          <w:sz w:val="24"/>
+          <w:szCs w:val="32"/>
+          <w:lang w:val="es-ES" w:eastAsia="en-US"/>
+          <w14:ligatures w14:val="standardContextual"/>
+        </w:rPr>
+      </w:pPr>
+      <w:r>
+        <w:br w:type="page"/>
+      </w:r>
+    </w:p>
+    <w:p>
+      <w:pPr>
+        <w:pStyle w:val="Ttulo2"/>
+        <w:ind w:left="0"/>
+        <w:rPr>
+          <w:lang w:val="es"/>
+        </w:rPr>
+      </w:pPr>
+      <w:bookmarkStart w:id="17" w:name="_Toc242351565"/>
+      <w:r>
+        <w:lastRenderedPageBreak/>
+        <w:t>Paso</w:t>
+      </w:r>
+      <w:r>
+        <w:t xml:space="preserve"> </w:t>
+      </w:r>
+      <w:r>
+        <w:t>5</w:t>
+      </w:r>
+      <w:r>
+        <w:t xml:space="preserve">: </w:t>
+      </w:r>
+      <w:r>
+        <w:rPr>
+          <w:lang w:val="es"/>
+        </w:rPr>
+        <w:t>Base de datos y usuario de la aplicación</w:t>
+      </w:r>
+      <w:bookmarkEnd w:id="17"/>
+    </w:p>
+    <w:p>
+      <w:pPr>
+        <w:spacing w:after="160" w:line="259" w:lineRule="auto"/>
+        <w:ind w:left="0"/>
+      </w:pPr>
+      <w:r>
+        <w:t xml:space="preserve">Se accede de nuevo a la consola de Mongo, esta vez forzando la autenticación como el administrador previamente creado. Se cambia a la base de datos </w:t>
+      </w:r>
+      <w:proofErr w:type="spellStart"/>
+      <w:r>
+        <w:t>expressdb</w:t>
+      </w:r>
+      <w:proofErr w:type="spellEnd"/>
+      <w:r>
+        <w:t xml:space="preserve">, se crea el usuario </w:t>
+      </w:r>
+      <w:proofErr w:type="spellStart"/>
+      <w:r>
+        <w:t>expressuser</w:t>
+      </w:r>
+      <w:proofErr w:type="spellEnd"/>
+      <w:r>
+        <w:t xml:space="preserve"> con permisos de lectura y escritura (</w:t>
+      </w:r>
+      <w:proofErr w:type="spellStart"/>
+      <w:r>
+        <w:t>readWrite</w:t>
+      </w:r>
+      <w:proofErr w:type="spellEnd"/>
+      <w:r>
+        <w:t xml:space="preserve">), y se inserta un documento de prueba para que la base de datos se genere físicamente en el almacenamiento. </w:t>
+      </w:r>
+    </w:p>
+    <w:p>
+      <w:pPr>
+        <w:spacing w:after="160" w:line="259" w:lineRule="auto"/>
+        <w:ind w:left="0"/>
+        <w:rPr>
+          <w:lang w:val="es-ES"/>
+        </w:rPr>
+      </w:pPr>
+      <w:r>
+        <w:rPr>
+          <w:noProof/>
+        </w:rPr>
+        <w:drawing>
+          <wp:inline distT="0" distB="0" distL="0" distR="0" wp14:anchorId="368D443E" wp14:editId="647FC627">
+            <wp:extent cx="5391785" cy="1397635"/>
+            <wp:effectExtent l="0" t="0" r="0" b="0"/>
+            <wp:docPr id="32" name="Imagen 32"/>
+            <wp:cNvGraphicFramePr>
+              <a:graphicFrameLocks xmlns:a="http://schemas.openxmlformats.org/drawingml/2006/main" noChangeAspect="1"/>
+            </wp:cNvGraphicFramePr>
+            <a:graphic xmlns:a="http://schemas.openxmlformats.org/drawingml/2006/main">
+              <a:graphicData uri="http://schemas.openxmlformats.org/drawingml/2006/picture">
+                <pic:pic xmlns:pic="http://schemas.openxmlformats.org/drawingml/2006/picture">
+                  <pic:nvPicPr>
+                    <pic:cNvPr id="0" name="Picture 11"/>
+                    <pic:cNvPicPr>
+                      <a:picLocks noChangeAspect="1" noChangeArrowheads="1"/>
+                    </pic:cNvPicPr>
+                  </pic:nvPicPr>
+                  <pic:blipFill>
+                    <a:blip r:embed="rId37">
+                      <a:extLst>
+                        <a:ext uri="{28A0092B-C50C-407E-A947-70E740481C1C}">
+                          <a14:useLocalDpi xmlns:a14="http://schemas.microsoft.com/office/drawing/2010/main" val="0"/>
+                        </a:ext>
+                      </a:extLst>
+                    </a:blip>
+                    <a:srcRect/>
+                    <a:stretch>
+                      <a:fillRect/>
+                    </a:stretch>
+                  </pic:blipFill>
+                  <pic:spPr bwMode="auto">
+                    <a:xfrm>
+                      <a:off x="0" y="0"/>
+                      <a:ext cx="5391785" cy="1397635"/>
+                    </a:xfrm>
+                    <a:prstGeom prst="rect">
+                      <a:avLst/>
+                    </a:prstGeom>
+                    <a:noFill/>
+                    <a:ln>
+                      <a:noFill/>
+                    </a:ln>
+                  </pic:spPr>
+                </pic:pic>
+              </a:graphicData>
+            </a:graphic>
+          </wp:inline>
+        </w:drawing>
+      </w:r>
       <w:r>
         <w:rPr>
           <w:lang w:val="es-ES"/>
@@ -4042,48 +5856,1417 @@
           <w:numId w:val="11"/>
         </w:numPr>
       </w:pPr>
-      <w:bookmarkStart w:id="14" w:name="_Toc242293219"/>
+      <w:bookmarkStart w:id="18" w:name="_Toc242351566"/>
       <w:r>
         <w:lastRenderedPageBreak/>
         <w:t>Configuración del servidor de base de datos como sistema de ficheros compartido</w:t>
       </w:r>
-      <w:bookmarkEnd w:id="14"/>
+      <w:bookmarkEnd w:id="18"/>
+    </w:p>
+    <w:p>
+      <w:pPr>
+        <w:spacing w:before="100" w:beforeAutospacing="1" w:after="100" w:afterAutospacing="1" w:line="240" w:lineRule="auto"/>
+        <w:ind w:left="0"/>
+        <w:jc w:val="left"/>
+        <w:rPr>
+          <w:lang w:val="es-ES"/>
+        </w:rPr>
+      </w:pPr>
+      <w:r>
+        <w:rPr>
+          <w:lang w:val="es-ES"/>
+        </w:rPr>
+        <w:t xml:space="preserve">En esta última fase, se configura la máquina virtual de Base de Datos para que actúe como servidor NFS exportando un directorio específico. Este directorio será montado automáticamente por la máquina virtual </w:t>
+      </w:r>
+      <w:proofErr w:type="spellStart"/>
+      <w:r>
+        <w:rPr>
+          <w:lang w:val="es-ES"/>
+        </w:rPr>
+        <w:t>Backend</w:t>
+      </w:r>
+      <w:proofErr w:type="spellEnd"/>
+      <w:r>
+        <w:rPr>
+          <w:lang w:val="es-ES"/>
+        </w:rPr>
+        <w:t xml:space="preserve"> (cliente NFS) al arrancar, restringiendo las comunicaciones estrictamente a la versión NFSv4.</w:t>
+      </w:r>
     </w:p>
     <w:p>
       <w:pPr>
         <w:pStyle w:val="Ttulo2"/>
         <w:ind w:left="0"/>
-      </w:pPr>
-      <w:bookmarkStart w:id="15" w:name="_Toc242293220"/>
+        <w:rPr>
+          <w:lang w:val="es"/>
+        </w:rPr>
+      </w:pPr>
+      <w:bookmarkStart w:id="19" w:name="_Toc242351567"/>
       <w:r>
         <w:t>Paso</w:t>
       </w:r>
       <w:r>
-        <w:t xml:space="preserve"> 1: Creación y configuración de la máquina Proxy</w:t>
-      </w:r>
-      <w:bookmarkEnd w:id="15"/>
-    </w:p>
-    <w:p>
-      <w:pPr>
-        <w:spacing w:before="240" w:after="160" w:line="259" w:lineRule="auto"/>
+        <w:t xml:space="preserve"> </w:t>
+      </w:r>
+      <w:r>
+        <w:t>1</w:t>
+      </w:r>
+      <w:r>
+        <w:t xml:space="preserve">: </w:t>
+      </w:r>
+      <w:r>
+        <w:rPr>
+          <w:lang w:val="es"/>
+        </w:rPr>
+        <w:t>Servidor NFS en la máquina de Base de Datos</w:t>
+      </w:r>
+      <w:bookmarkEnd w:id="19"/>
+    </w:p>
+    <w:p>
+      <w:pPr>
+        <w:ind w:left="0"/>
+      </w:pPr>
+      <w:r>
+        <w:t xml:space="preserve">Se instala el paquete </w:t>
+      </w:r>
+      <w:proofErr w:type="spellStart"/>
+      <w:r>
+        <w:t>nfs</w:t>
+      </w:r>
+      <w:proofErr w:type="spellEnd"/>
+      <w:r>
+        <w:t>-</w:t>
+      </w:r>
+      <w:proofErr w:type="spellStart"/>
+      <w:r>
+        <w:t>kernel</w:t>
+      </w:r>
+      <w:proofErr w:type="spellEnd"/>
+      <w:r>
+        <w:t>-server, se crea el directorio compartido /</w:t>
+      </w:r>
+      <w:proofErr w:type="spellStart"/>
+      <w:r>
+        <w:t>srv</w:t>
+      </w:r>
+      <w:proofErr w:type="spellEnd"/>
+      <w:r>
+        <w:t>/</w:t>
+      </w:r>
+      <w:proofErr w:type="spellStart"/>
+      <w:r>
+        <w:t>nfs</w:t>
+      </w:r>
+      <w:proofErr w:type="spellEnd"/>
+      <w:r>
+        <w:t>/compartido y se le asigna la propiedad al usuario del sistema</w:t>
+      </w:r>
+      <w:r>
+        <w:t>.</w:t>
+      </w:r>
+    </w:p>
+    <w:p>
+      <w:pPr>
+        <w:ind w:left="0"/>
+        <w:jc w:val="center"/>
+        <w:rPr>
+          <w:lang w:val="es-ES"/>
+        </w:rPr>
+      </w:pPr>
+      <w:r>
+        <w:rPr>
+          <w:i/>
+          <w:iCs/>
+          <w:noProof/>
+          <w:lang w:val="es-ES"/>
+        </w:rPr>
+        <w:drawing>
+          <wp:inline distT="0" distB="0" distL="0" distR="0" wp14:anchorId="3A46A971" wp14:editId="3ABE9D54">
+            <wp:extent cx="4270375" cy="198120"/>
+            <wp:effectExtent l="0" t="0" r="0" b="0"/>
+            <wp:docPr id="41" name="Imagen 41"/>
+            <wp:cNvGraphicFramePr>
+              <a:graphicFrameLocks xmlns:a="http://schemas.openxmlformats.org/drawingml/2006/main" noChangeAspect="1"/>
+            </wp:cNvGraphicFramePr>
+            <a:graphic xmlns:a="http://schemas.openxmlformats.org/drawingml/2006/main">
+              <a:graphicData uri="http://schemas.openxmlformats.org/drawingml/2006/picture">
+                <pic:pic xmlns:pic="http://schemas.openxmlformats.org/drawingml/2006/picture">
+                  <pic:nvPicPr>
+                    <pic:cNvPr id="0" name="Picture 20"/>
+                    <pic:cNvPicPr>
+                      <a:picLocks noChangeAspect="1" noChangeArrowheads="1"/>
+                    </pic:cNvPicPr>
+                  </pic:nvPicPr>
+                  <pic:blipFill>
+                    <a:blip r:embed="rId38">
+                      <a:extLst>
+                        <a:ext uri="{28A0092B-C50C-407E-A947-70E740481C1C}">
+                          <a14:useLocalDpi xmlns:a14="http://schemas.microsoft.com/office/drawing/2010/main" val="0"/>
+                        </a:ext>
+                      </a:extLst>
+                    </a:blip>
+                    <a:srcRect/>
+                    <a:stretch>
+                      <a:fillRect/>
+                    </a:stretch>
+                  </pic:blipFill>
+                  <pic:spPr bwMode="auto">
+                    <a:xfrm>
+                      <a:off x="0" y="0"/>
+                      <a:ext cx="4270375" cy="198120"/>
+                    </a:xfrm>
+                    <a:prstGeom prst="rect">
+                      <a:avLst/>
+                    </a:prstGeom>
+                    <a:noFill/>
+                    <a:ln>
+                      <a:noFill/>
+                    </a:ln>
+                  </pic:spPr>
+                </pic:pic>
+              </a:graphicData>
+            </a:graphic>
+          </wp:inline>
+        </w:drawing>
+      </w:r>
+    </w:p>
+    <w:p>
+      <w:pPr>
+        <w:ind w:left="0"/>
+        <w:jc w:val="center"/>
+      </w:pPr>
+      <w:r>
+        <w:rPr>
+          <w:noProof/>
+        </w:rPr>
+        <w:drawing>
+          <wp:inline distT="0" distB="0" distL="0" distR="0" wp14:anchorId="221E694E" wp14:editId="3E3A9915">
+            <wp:extent cx="4916805" cy="344805"/>
+            <wp:effectExtent l="0" t="0" r="0" b="0"/>
+            <wp:docPr id="42" name="Imagen 42"/>
+            <wp:cNvGraphicFramePr>
+              <a:graphicFrameLocks xmlns:a="http://schemas.openxmlformats.org/drawingml/2006/main" noChangeAspect="1"/>
+            </wp:cNvGraphicFramePr>
+            <a:graphic xmlns:a="http://schemas.openxmlformats.org/drawingml/2006/main">
+              <a:graphicData uri="http://schemas.openxmlformats.org/drawingml/2006/picture">
+                <pic:pic xmlns:pic="http://schemas.openxmlformats.org/drawingml/2006/picture">
+                  <pic:nvPicPr>
+                    <pic:cNvPr id="0" name="Picture 21"/>
+                    <pic:cNvPicPr>
+                      <a:picLocks noChangeAspect="1" noChangeArrowheads="1"/>
+                    </pic:cNvPicPr>
+                  </pic:nvPicPr>
+                  <pic:blipFill>
+                    <a:blip r:embed="rId39">
+                      <a:extLst>
+                        <a:ext uri="{28A0092B-C50C-407E-A947-70E740481C1C}">
+                          <a14:useLocalDpi xmlns:a14="http://schemas.microsoft.com/office/drawing/2010/main" val="0"/>
+                        </a:ext>
+                      </a:extLst>
+                    </a:blip>
+                    <a:srcRect/>
+                    <a:stretch>
+                      <a:fillRect/>
+                    </a:stretch>
+                  </pic:blipFill>
+                  <pic:spPr bwMode="auto">
+                    <a:xfrm>
+                      <a:off x="0" y="0"/>
+                      <a:ext cx="4916805" cy="344805"/>
+                    </a:xfrm>
+                    <a:prstGeom prst="rect">
+                      <a:avLst/>
+                    </a:prstGeom>
+                    <a:noFill/>
+                    <a:ln>
+                      <a:noFill/>
+                    </a:ln>
+                  </pic:spPr>
+                </pic:pic>
+              </a:graphicData>
+            </a:graphic>
+          </wp:inline>
+        </w:drawing>
+      </w:r>
+    </w:p>
+    <w:p>
+      <w:pPr>
+        <w:ind w:left="0"/>
+      </w:pPr>
+      <w:r>
+        <w:t xml:space="preserve">Para permitir el acceso exclusivo al </w:t>
+      </w:r>
+      <w:proofErr w:type="spellStart"/>
+      <w:r>
+        <w:t>Backend</w:t>
+      </w:r>
+      <w:proofErr w:type="spellEnd"/>
+      <w:r>
+        <w:t>, se modifica el fichero /</w:t>
+      </w:r>
+      <w:proofErr w:type="spellStart"/>
+      <w:r>
+        <w:t>etc</w:t>
+      </w:r>
+      <w:proofErr w:type="spellEnd"/>
+      <w:r>
+        <w:t>/</w:t>
+      </w:r>
+      <w:proofErr w:type="spellStart"/>
+      <w:r>
+        <w:t>exports</w:t>
+      </w:r>
+      <w:proofErr w:type="spellEnd"/>
+      <w:r>
+        <w:t xml:space="preserve">, añadiendo la IP interna de conexión con los permisos </w:t>
+      </w:r>
+      <w:proofErr w:type="spellStart"/>
+      <w:r>
+        <w:t>rw</w:t>
+      </w:r>
+      <w:proofErr w:type="spellEnd"/>
+      <w:r>
+        <w:t xml:space="preserve"> (lectura y escritura), </w:t>
+      </w:r>
+      <w:proofErr w:type="spellStart"/>
+      <w:r>
+        <w:t>sync</w:t>
+      </w:r>
+      <w:proofErr w:type="spellEnd"/>
+      <w:r>
+        <w:t xml:space="preserve"> (escritura síncrona en disco), </w:t>
+      </w:r>
+      <w:proofErr w:type="spellStart"/>
+      <w:r>
+        <w:t>no_subtree_check</w:t>
+      </w:r>
+      <w:proofErr w:type="spellEnd"/>
+      <w:r>
+        <w:t xml:space="preserve"> y </w:t>
+      </w:r>
+      <w:proofErr w:type="spellStart"/>
+      <w:r>
+        <w:t>root_squash</w:t>
+      </w:r>
+      <w:proofErr w:type="spellEnd"/>
+      <w:r>
+        <w:t>.</w:t>
+      </w:r>
+    </w:p>
+    <w:p>
+      <w:pPr>
+        <w:ind w:left="0"/>
+        <w:rPr>
+          <w:i/>
+          <w:iCs/>
+          <w:lang w:val="es-ES"/>
+        </w:rPr>
+      </w:pPr>
+      <w:r>
+        <w:rPr>
+          <w:i/>
+          <w:iCs/>
+          <w:noProof/>
+          <w:lang w:val="es-ES"/>
+        </w:rPr>
+        <w:drawing>
+          <wp:inline distT="0" distB="0" distL="0" distR="0" wp14:anchorId="2046D66B" wp14:editId="47120F1F">
+            <wp:extent cx="5400040" cy="319405"/>
+            <wp:effectExtent l="0" t="0" r="0" b="4445"/>
+            <wp:docPr id="43" name="Imagen 43"/>
+            <wp:cNvGraphicFramePr>
+              <a:graphicFrameLocks xmlns:a="http://schemas.openxmlformats.org/drawingml/2006/main" noChangeAspect="1"/>
+            </wp:cNvGraphicFramePr>
+            <a:graphic xmlns:a="http://schemas.openxmlformats.org/drawingml/2006/main">
+              <a:graphicData uri="http://schemas.openxmlformats.org/drawingml/2006/picture">
+                <pic:pic xmlns:pic="http://schemas.openxmlformats.org/drawingml/2006/picture">
+                  <pic:nvPicPr>
+                    <pic:cNvPr id="0" name="Picture 22"/>
+                    <pic:cNvPicPr>
+                      <a:picLocks noChangeAspect="1" noChangeArrowheads="1"/>
+                    </pic:cNvPicPr>
+                  </pic:nvPicPr>
+                  <pic:blipFill>
+                    <a:blip r:embed="rId40">
+                      <a:extLst>
+                        <a:ext uri="{28A0092B-C50C-407E-A947-70E740481C1C}">
+                          <a14:useLocalDpi xmlns:a14="http://schemas.microsoft.com/office/drawing/2010/main" val="0"/>
+                        </a:ext>
+                      </a:extLst>
+                    </a:blip>
+                    <a:srcRect/>
+                    <a:stretch>
+                      <a:fillRect/>
+                    </a:stretch>
+                  </pic:blipFill>
+                  <pic:spPr bwMode="auto">
+                    <a:xfrm>
+                      <a:off x="0" y="0"/>
+                      <a:ext cx="5400040" cy="319405"/>
+                    </a:xfrm>
+                    <a:prstGeom prst="rect">
+                      <a:avLst/>
+                    </a:prstGeom>
+                    <a:noFill/>
+                    <a:ln>
+                      <a:noFill/>
+                    </a:ln>
+                  </pic:spPr>
+                </pic:pic>
+              </a:graphicData>
+            </a:graphic>
+          </wp:inline>
+        </w:drawing>
+      </w:r>
+    </w:p>
+    <w:p>
+      <w:pPr>
+        <w:pStyle w:val="Ttulo2"/>
+        <w:ind w:left="0"/>
+        <w:rPr>
+          <w:lang w:val="es"/>
+        </w:rPr>
+      </w:pPr>
+      <w:bookmarkStart w:id="20" w:name="_Toc242351568"/>
+      <w:r>
+        <w:t>Paso</w:t>
+      </w:r>
+      <w:r>
+        <w:t xml:space="preserve"> </w:t>
+      </w:r>
+      <w:r>
+        <w:t>2</w:t>
+      </w:r>
+      <w:r>
+        <w:t xml:space="preserve">: </w:t>
+      </w:r>
+      <w:r>
+        <w:rPr>
+          <w:lang w:val="es"/>
+        </w:rPr>
+        <w:t xml:space="preserve">Configuración del modo "NFSv4 </w:t>
+      </w:r>
+      <w:proofErr w:type="spellStart"/>
+      <w:r>
+        <w:rPr>
+          <w:lang w:val="es"/>
+        </w:rPr>
+        <w:t>only</w:t>
+      </w:r>
+      <w:proofErr w:type="spellEnd"/>
+      <w:r>
+        <w:rPr>
+          <w:lang w:val="es"/>
+        </w:rPr>
+        <w:t>"</w:t>
+      </w:r>
+      <w:bookmarkEnd w:id="20"/>
+    </w:p>
+    <w:p>
+      <w:pPr>
+        <w:spacing w:after="160" w:line="259" w:lineRule="auto"/>
+        <w:ind w:left="0"/>
+      </w:pPr>
+      <w:r>
+        <w:t>Se edita el archivo de configuración global /</w:t>
+      </w:r>
+      <w:proofErr w:type="spellStart"/>
+      <w:r>
+        <w:t>etc</w:t>
+      </w:r>
+      <w:proofErr w:type="spellEnd"/>
+      <w:r>
+        <w:t>/</w:t>
+      </w:r>
+      <w:proofErr w:type="spellStart"/>
+      <w:r>
+        <w:t>nfs.conf</w:t>
+      </w:r>
+      <w:proofErr w:type="spellEnd"/>
+      <w:r>
+        <w:t>. En la sección [</w:t>
+      </w:r>
+      <w:proofErr w:type="spellStart"/>
+      <w:r>
+        <w:t>nfsd</w:t>
+      </w:r>
+      <w:proofErr w:type="spellEnd"/>
+      <w:r>
+        <w:t>], se desactiva explícitamente la versión 3 (vers3=n) y se habilitan las versiones 4.</w:t>
+      </w:r>
+    </w:p>
+    <w:p>
+      <w:pPr>
+        <w:spacing w:after="160" w:line="259" w:lineRule="auto"/>
+        <w:ind w:left="0"/>
+        <w:jc w:val="center"/>
+      </w:pPr>
+      <w:r>
+        <w:rPr>
+          <w:noProof/>
+        </w:rPr>
+        <w:drawing>
+          <wp:inline distT="0" distB="0" distL="0" distR="0" wp14:anchorId="070B2F2B" wp14:editId="7CC8A0EF">
+            <wp:extent cx="1431925" cy="2493010"/>
+            <wp:effectExtent l="0" t="0" r="0" b="2540"/>
+            <wp:docPr id="44" name="Imagen 44"/>
+            <wp:cNvGraphicFramePr>
+              <a:graphicFrameLocks xmlns:a="http://schemas.openxmlformats.org/drawingml/2006/main" noChangeAspect="1"/>
+            </wp:cNvGraphicFramePr>
+            <a:graphic xmlns:a="http://schemas.openxmlformats.org/drawingml/2006/main">
+              <a:graphicData uri="http://schemas.openxmlformats.org/drawingml/2006/picture">
+                <pic:pic xmlns:pic="http://schemas.openxmlformats.org/drawingml/2006/picture">
+                  <pic:nvPicPr>
+                    <pic:cNvPr id="0" name="Picture 23"/>
+                    <pic:cNvPicPr>
+                      <a:picLocks noChangeAspect="1" noChangeArrowheads="1"/>
+                    </pic:cNvPicPr>
+                  </pic:nvPicPr>
+                  <pic:blipFill>
+                    <a:blip r:embed="rId41">
+                      <a:extLst>
+                        <a:ext uri="{28A0092B-C50C-407E-A947-70E740481C1C}">
+                          <a14:useLocalDpi xmlns:a14="http://schemas.microsoft.com/office/drawing/2010/main" val="0"/>
+                        </a:ext>
+                      </a:extLst>
+                    </a:blip>
+                    <a:srcRect/>
+                    <a:stretch>
+                      <a:fillRect/>
+                    </a:stretch>
+                  </pic:blipFill>
+                  <pic:spPr bwMode="auto">
+                    <a:xfrm>
+                      <a:off x="0" y="0"/>
+                      <a:ext cx="1431925" cy="2493010"/>
+                    </a:xfrm>
+                    <a:prstGeom prst="rect">
+                      <a:avLst/>
+                    </a:prstGeom>
+                    <a:noFill/>
+                    <a:ln>
+                      <a:noFill/>
+                    </a:ln>
+                  </pic:spPr>
+                </pic:pic>
+              </a:graphicData>
+            </a:graphic>
+          </wp:inline>
+        </w:drawing>
+      </w:r>
+    </w:p>
+    <w:p>
+      <w:pPr>
+        <w:spacing w:after="160" w:line="259" w:lineRule="auto"/>
         <w:ind w:left="0"/>
         <w:jc w:val="left"/>
-        <w:rPr>
-          <w:lang w:val="es-ES"/>
-        </w:rPr>
-      </w:pPr>
-      <w:proofErr w:type="spellStart"/>
-      <w:r>
-        <w:rPr>
-          <w:lang w:val="es-ES"/>
-        </w:rPr>
-        <w:t>aaa</w:t>
-      </w:r>
-      <w:proofErr w:type="spellEnd"/>
+      </w:pPr>
+      <w:r>
+        <w:br w:type="page"/>
+      </w:r>
+    </w:p>
+    <w:p>
+      <w:pPr>
+        <w:spacing w:after="160" w:line="259" w:lineRule="auto"/>
+        <w:ind w:left="0"/>
+      </w:pPr>
+      <w:r>
+        <w:lastRenderedPageBreak/>
+        <w:t xml:space="preserve">Dado que NFSv4 no requiere de los servicios antiguos </w:t>
+      </w:r>
+      <w:proofErr w:type="spellStart"/>
+      <w:r>
+        <w:t>rpcbind</w:t>
+      </w:r>
+      <w:proofErr w:type="spellEnd"/>
+      <w:r>
+        <w:t xml:space="preserve"> y </w:t>
+      </w:r>
+      <w:proofErr w:type="spellStart"/>
+      <w:r>
+        <w:t>rpc-statd</w:t>
+      </w:r>
+      <w:proofErr w:type="spellEnd"/>
+      <w:r>
+        <w:t xml:space="preserve">, estos se desactivan y enmascaran mediante </w:t>
+      </w:r>
+      <w:proofErr w:type="spellStart"/>
+      <w:r>
+        <w:t>systemctl</w:t>
+      </w:r>
+      <w:proofErr w:type="spellEnd"/>
+      <w:r>
+        <w:t xml:space="preserve">. Finalmente, se reinicia y habilita el servicio </w:t>
+      </w:r>
+      <w:proofErr w:type="spellStart"/>
+      <w:r>
+        <w:t>nfs</w:t>
+      </w:r>
+      <w:proofErr w:type="spellEnd"/>
+      <w:r>
+        <w:t>-server, verificando en /</w:t>
+      </w:r>
+      <w:proofErr w:type="spellStart"/>
+      <w:r>
+        <w:t>proc</w:t>
+      </w:r>
+      <w:proofErr w:type="spellEnd"/>
+      <w:r>
+        <w:t>/</w:t>
+      </w:r>
+      <w:proofErr w:type="spellStart"/>
+      <w:r>
+        <w:t>fs</w:t>
+      </w:r>
+      <w:proofErr w:type="spellEnd"/>
+      <w:r>
+        <w:t>/</w:t>
+      </w:r>
+      <w:proofErr w:type="spellStart"/>
+      <w:r>
+        <w:t>nfsd</w:t>
+      </w:r>
+      <w:proofErr w:type="spellEnd"/>
+      <w:r>
+        <w:t>/</w:t>
+      </w:r>
+      <w:proofErr w:type="spellStart"/>
+      <w:r>
+        <w:t>versions</w:t>
+      </w:r>
+      <w:proofErr w:type="spellEnd"/>
+      <w:r>
+        <w:t xml:space="preserve"> que solo las versiones 4 se encuentran activas (-2 -3 +4 +4.1 +4.2)</w:t>
+      </w:r>
+      <w:r>
+        <w:t>.</w:t>
+      </w:r>
+    </w:p>
+    <w:p>
+      <w:pPr>
+        <w:spacing w:after="160" w:line="259" w:lineRule="auto"/>
+        <w:ind w:left="0"/>
+      </w:pPr>
+      <w:r>
+        <w:rPr>
+          <w:noProof/>
+        </w:rPr>
+        <w:drawing>
+          <wp:inline distT="0" distB="0" distL="0" distR="0" wp14:anchorId="70A1BEB6" wp14:editId="0E8F09D7">
+            <wp:extent cx="5391785" cy="733425"/>
+            <wp:effectExtent l="0" t="0" r="0" b="9525"/>
+            <wp:docPr id="45" name="Imagen 45"/>
+            <wp:cNvGraphicFramePr>
+              <a:graphicFrameLocks xmlns:a="http://schemas.openxmlformats.org/drawingml/2006/main" noChangeAspect="1"/>
+            </wp:cNvGraphicFramePr>
+            <a:graphic xmlns:a="http://schemas.openxmlformats.org/drawingml/2006/main">
+              <a:graphicData uri="http://schemas.openxmlformats.org/drawingml/2006/picture">
+                <pic:pic xmlns:pic="http://schemas.openxmlformats.org/drawingml/2006/picture">
+                  <pic:nvPicPr>
+                    <pic:cNvPr id="0" name="Picture 24"/>
+                    <pic:cNvPicPr>
+                      <a:picLocks noChangeAspect="1" noChangeArrowheads="1"/>
+                    </pic:cNvPicPr>
+                  </pic:nvPicPr>
+                  <pic:blipFill>
+                    <a:blip r:embed="rId42">
+                      <a:extLst>
+                        <a:ext uri="{28A0092B-C50C-407E-A947-70E740481C1C}">
+                          <a14:useLocalDpi xmlns:a14="http://schemas.microsoft.com/office/drawing/2010/main" val="0"/>
+                        </a:ext>
+                      </a:extLst>
+                    </a:blip>
+                    <a:srcRect/>
+                    <a:stretch>
+                      <a:fillRect/>
+                    </a:stretch>
+                  </pic:blipFill>
+                  <pic:spPr bwMode="auto">
+                    <a:xfrm>
+                      <a:off x="0" y="0"/>
+                      <a:ext cx="5391785" cy="733425"/>
+                    </a:xfrm>
+                    <a:prstGeom prst="rect">
+                      <a:avLst/>
+                    </a:prstGeom>
+                    <a:noFill/>
+                    <a:ln>
+                      <a:noFill/>
+                    </a:ln>
+                  </pic:spPr>
+                </pic:pic>
+              </a:graphicData>
+            </a:graphic>
+          </wp:inline>
+        </w:drawing>
+      </w:r>
+    </w:p>
+    <w:p>
+      <w:pPr>
+        <w:pStyle w:val="Ttulo2"/>
+        <w:ind w:left="0"/>
+        <w:rPr>
+          <w:lang w:val="es"/>
+        </w:rPr>
+      </w:pPr>
+      <w:bookmarkStart w:id="21" w:name="_Toc242351569"/>
+      <w:r>
+        <w:t>Paso</w:t>
+      </w:r>
+      <w:r>
+        <w:t xml:space="preserve"> </w:t>
+      </w:r>
+      <w:r>
+        <w:t>3</w:t>
+      </w:r>
+      <w:r>
+        <w:t xml:space="preserve">: </w:t>
+      </w:r>
+      <w:r>
+        <w:rPr>
+          <w:lang w:val="es"/>
+        </w:rPr>
+        <w:t xml:space="preserve">Cliente NFS en la máquina </w:t>
+      </w:r>
+      <w:proofErr w:type="spellStart"/>
+      <w:r>
+        <w:rPr>
+          <w:lang w:val="es"/>
+        </w:rPr>
+        <w:t>Backend</w:t>
+      </w:r>
+      <w:bookmarkEnd w:id="21"/>
+      <w:proofErr w:type="spellEnd"/>
+    </w:p>
+    <w:p>
+      <w:pPr>
+        <w:spacing w:after="160" w:line="259" w:lineRule="auto"/>
+        <w:ind w:left="0"/>
+      </w:pPr>
+      <w:r>
+        <w:t>En la máquina virtual Server (</w:t>
+      </w:r>
+      <w:proofErr w:type="spellStart"/>
+      <w:r>
+        <w:t>Backend</w:t>
+      </w:r>
+      <w:proofErr w:type="spellEnd"/>
+      <w:r>
+        <w:t xml:space="preserve">), se instalan las utilidades de cliente mediante el paquete </w:t>
+      </w:r>
+      <w:proofErr w:type="spellStart"/>
+      <w:r>
+        <w:t>nfs-common</w:t>
+      </w:r>
+      <w:proofErr w:type="spellEnd"/>
+      <w:r>
+        <w:t xml:space="preserve"> y se preparan los directorios necesarios para el montaje de red.</w:t>
+      </w:r>
+    </w:p>
+    <w:p>
+      <w:pPr>
+        <w:ind w:left="0"/>
+        <w:jc w:val="center"/>
+      </w:pPr>
+      <w:r>
+        <w:rPr>
+          <w:noProof/>
+        </w:rPr>
+        <w:drawing>
+          <wp:inline distT="0" distB="0" distL="0" distR="0" wp14:anchorId="4C435052" wp14:editId="3947DC79">
+            <wp:extent cx="3709670" cy="241300"/>
+            <wp:effectExtent l="0" t="0" r="5080" b="6350"/>
+            <wp:docPr id="46" name="Imagen 46"/>
+            <wp:cNvGraphicFramePr>
+              <a:graphicFrameLocks xmlns:a="http://schemas.openxmlformats.org/drawingml/2006/main" noChangeAspect="1"/>
+            </wp:cNvGraphicFramePr>
+            <a:graphic xmlns:a="http://schemas.openxmlformats.org/drawingml/2006/main">
+              <a:graphicData uri="http://schemas.openxmlformats.org/drawingml/2006/picture">
+                <pic:pic xmlns:pic="http://schemas.openxmlformats.org/drawingml/2006/picture">
+                  <pic:nvPicPr>
+                    <pic:cNvPr id="0" name="Picture 25"/>
+                    <pic:cNvPicPr>
+                      <a:picLocks noChangeAspect="1" noChangeArrowheads="1"/>
+                    </pic:cNvPicPr>
+                  </pic:nvPicPr>
+                  <pic:blipFill>
+                    <a:blip r:embed="rId43">
+                      <a:extLst>
+                        <a:ext uri="{28A0092B-C50C-407E-A947-70E740481C1C}">
+                          <a14:useLocalDpi xmlns:a14="http://schemas.microsoft.com/office/drawing/2010/main" val="0"/>
+                        </a:ext>
+                      </a:extLst>
+                    </a:blip>
+                    <a:srcRect/>
+                    <a:stretch>
+                      <a:fillRect/>
+                    </a:stretch>
+                  </pic:blipFill>
+                  <pic:spPr bwMode="auto">
+                    <a:xfrm>
+                      <a:off x="0" y="0"/>
+                      <a:ext cx="3709670" cy="241300"/>
+                    </a:xfrm>
+                    <a:prstGeom prst="rect">
+                      <a:avLst/>
+                    </a:prstGeom>
+                    <a:noFill/>
+                    <a:ln>
+                      <a:noFill/>
+                    </a:ln>
+                  </pic:spPr>
+                </pic:pic>
+              </a:graphicData>
+            </a:graphic>
+          </wp:inline>
+        </w:drawing>
+      </w:r>
+    </w:p>
+    <w:p>
+      <w:pPr>
+        <w:ind w:left="0"/>
+        <w:jc w:val="center"/>
+      </w:pPr>
+      <w:r>
+        <w:rPr>
+          <w:noProof/>
+        </w:rPr>
+        <w:drawing>
+          <wp:inline distT="0" distB="0" distL="0" distR="0" wp14:anchorId="5D49EFAB" wp14:editId="6AA6726B">
+            <wp:extent cx="5400040" cy="1155700"/>
+            <wp:effectExtent l="0" t="0" r="0" b="6350"/>
+            <wp:docPr id="47" name="Imagen 47"/>
+            <wp:cNvGraphicFramePr>
+              <a:graphicFrameLocks xmlns:a="http://schemas.openxmlformats.org/drawingml/2006/main" noChangeAspect="1"/>
+            </wp:cNvGraphicFramePr>
+            <a:graphic xmlns:a="http://schemas.openxmlformats.org/drawingml/2006/main">
+              <a:graphicData uri="http://schemas.openxmlformats.org/drawingml/2006/picture">
+                <pic:pic xmlns:pic="http://schemas.openxmlformats.org/drawingml/2006/picture">
+                  <pic:nvPicPr>
+                    <pic:cNvPr id="0" name="Picture 26"/>
+                    <pic:cNvPicPr>
+                      <a:picLocks noChangeAspect="1" noChangeArrowheads="1"/>
+                    </pic:cNvPicPr>
+                  </pic:nvPicPr>
+                  <pic:blipFill>
+                    <a:blip r:embed="rId44">
+                      <a:extLst>
+                        <a:ext uri="{28A0092B-C50C-407E-A947-70E740481C1C}">
+                          <a14:useLocalDpi xmlns:a14="http://schemas.microsoft.com/office/drawing/2010/main" val="0"/>
+                        </a:ext>
+                      </a:extLst>
+                    </a:blip>
+                    <a:srcRect/>
+                    <a:stretch>
+                      <a:fillRect/>
+                    </a:stretch>
+                  </pic:blipFill>
+                  <pic:spPr bwMode="auto">
+                    <a:xfrm>
+                      <a:off x="0" y="0"/>
+                      <a:ext cx="5400040" cy="1155700"/>
+                    </a:xfrm>
+                    <a:prstGeom prst="rect">
+                      <a:avLst/>
+                    </a:prstGeom>
+                    <a:noFill/>
+                    <a:ln>
+                      <a:noFill/>
+                    </a:ln>
+                  </pic:spPr>
+                </pic:pic>
+              </a:graphicData>
+            </a:graphic>
+          </wp:inline>
+        </w:drawing>
+      </w:r>
+    </w:p>
+    <w:p>
+      <w:pPr>
+        <w:pStyle w:val="Ttulo2"/>
+        <w:ind w:left="0"/>
+        <w:rPr>
+          <w:lang w:val="es"/>
+        </w:rPr>
+      </w:pPr>
+      <w:bookmarkStart w:id="22" w:name="_Toc242351570"/>
+      <w:r>
+        <w:t>Paso</w:t>
+      </w:r>
+      <w:r>
+        <w:t xml:space="preserve"> </w:t>
+      </w:r>
+      <w:r>
+        <w:t>4</w:t>
+      </w:r>
+      <w:r>
+        <w:t xml:space="preserve">: </w:t>
+      </w:r>
+      <w:r>
+        <w:rPr>
+          <w:lang w:val="es"/>
+        </w:rPr>
+        <w:t>Montaje automático al arrancar</w:t>
+      </w:r>
+      <w:bookmarkEnd w:id="22"/>
+    </w:p>
+    <w:p>
+      <w:pPr>
+        <w:spacing w:after="160" w:line="259" w:lineRule="auto"/>
+        <w:ind w:left="0"/>
+      </w:pPr>
+      <w:r>
+        <w:t>Para garantizar la persistencia tras un reinicio, se configura el montaje automático añadiendo la entrada correspondiente en /</w:t>
+      </w:r>
+      <w:proofErr w:type="spellStart"/>
+      <w:r>
+        <w:t>etc</w:t>
+      </w:r>
+      <w:proofErr w:type="spellEnd"/>
+      <w:r>
+        <w:t>/</w:t>
+      </w:r>
+      <w:proofErr w:type="spellStart"/>
+      <w:r>
+        <w:t>fstab</w:t>
+      </w:r>
+      <w:proofErr w:type="spellEnd"/>
+      <w:r>
+        <w:t>. Se incluye la directiva _</w:t>
+      </w:r>
+      <w:proofErr w:type="spellStart"/>
+      <w:r>
+        <w:t>netdev</w:t>
+      </w:r>
+      <w:proofErr w:type="spellEnd"/>
+      <w:r>
+        <w:t xml:space="preserve"> para indicar al sistema que espere a que la red esté operativa antes de intentar montar el recurso remoto.</w:t>
+      </w:r>
+    </w:p>
+    <w:p>
+      <w:pPr>
+        <w:spacing w:after="160" w:line="259" w:lineRule="auto"/>
+        <w:ind w:left="0"/>
+        <w:jc w:val="center"/>
+      </w:pPr>
+      <w:r>
+        <w:rPr>
+          <w:noProof/>
+        </w:rPr>
+        <w:drawing>
+          <wp:inline distT="0" distB="0" distL="0" distR="0" wp14:anchorId="22584254" wp14:editId="612A90D6">
+            <wp:extent cx="5400040" cy="241300"/>
+            <wp:effectExtent l="0" t="0" r="0" b="6350"/>
+            <wp:docPr id="48" name="Imagen 48"/>
+            <wp:cNvGraphicFramePr>
+              <a:graphicFrameLocks xmlns:a="http://schemas.openxmlformats.org/drawingml/2006/main" noChangeAspect="1"/>
+            </wp:cNvGraphicFramePr>
+            <a:graphic xmlns:a="http://schemas.openxmlformats.org/drawingml/2006/main">
+              <a:graphicData uri="http://schemas.openxmlformats.org/drawingml/2006/picture">
+                <pic:pic xmlns:pic="http://schemas.openxmlformats.org/drawingml/2006/picture">
+                  <pic:nvPicPr>
+                    <pic:cNvPr id="0" name="Picture 27"/>
+                    <pic:cNvPicPr>
+                      <a:picLocks noChangeAspect="1" noChangeArrowheads="1"/>
+                    </pic:cNvPicPr>
+                  </pic:nvPicPr>
+                  <pic:blipFill>
+                    <a:blip r:embed="rId45">
+                      <a:extLst>
+                        <a:ext uri="{28A0092B-C50C-407E-A947-70E740481C1C}">
+                          <a14:useLocalDpi xmlns:a14="http://schemas.microsoft.com/office/drawing/2010/main" val="0"/>
+                        </a:ext>
+                      </a:extLst>
+                    </a:blip>
+                    <a:srcRect/>
+                    <a:stretch>
+                      <a:fillRect/>
+                    </a:stretch>
+                  </pic:blipFill>
+                  <pic:spPr bwMode="auto">
+                    <a:xfrm>
+                      <a:off x="0" y="0"/>
+                      <a:ext cx="5400040" cy="241300"/>
+                    </a:xfrm>
+                    <a:prstGeom prst="rect">
+                      <a:avLst/>
+                    </a:prstGeom>
+                    <a:noFill/>
+                    <a:ln>
+                      <a:noFill/>
+                    </a:ln>
+                  </pic:spPr>
+                </pic:pic>
+              </a:graphicData>
+            </a:graphic>
+          </wp:inline>
+        </w:drawing>
+      </w:r>
+    </w:p>
+    <w:p>
+      <w:pPr>
+        <w:spacing w:after="160" w:line="259" w:lineRule="auto"/>
+        <w:ind w:left="0"/>
+      </w:pPr>
+      <w:r>
+        <w:t>T</w:t>
+      </w:r>
+      <w:r>
+        <w:t xml:space="preserve">ras aplicar los cambios con </w:t>
+      </w:r>
+      <w:proofErr w:type="spellStart"/>
+      <w:r>
+        <w:t>mount</w:t>
+      </w:r>
+      <w:proofErr w:type="spellEnd"/>
+      <w:r>
+        <w:t xml:space="preserve"> -a, se verifica mediante </w:t>
+      </w:r>
+      <w:proofErr w:type="spellStart"/>
+      <w:r>
+        <w:t>df</w:t>
+      </w:r>
+      <w:proofErr w:type="spellEnd"/>
+      <w:r>
+        <w:t xml:space="preserve"> -h que el sistema de ficheros de red se encuentra correctamente montado en /</w:t>
+      </w:r>
+      <w:proofErr w:type="spellStart"/>
+      <w:r>
+        <w:t>mnt</w:t>
+      </w:r>
+      <w:proofErr w:type="spellEnd"/>
+      <w:r>
+        <w:t>/compartido y plenamente accesible.</w:t>
+      </w:r>
+    </w:p>
+    <w:p>
+      <w:pPr>
+        <w:spacing w:after="160" w:line="259" w:lineRule="auto"/>
+        <w:ind w:left="0"/>
+      </w:pPr>
+      <w:r>
+        <w:rPr>
+          <w:noProof/>
+        </w:rPr>
+        <w:drawing>
+          <wp:inline distT="0" distB="0" distL="0" distR="0" wp14:anchorId="45727247" wp14:editId="6115CD2A">
+            <wp:extent cx="5391785" cy="440055"/>
+            <wp:effectExtent l="0" t="0" r="0" b="0"/>
+            <wp:docPr id="49" name="Imagen 49"/>
+            <wp:cNvGraphicFramePr>
+              <a:graphicFrameLocks xmlns:a="http://schemas.openxmlformats.org/drawingml/2006/main" noChangeAspect="1"/>
+            </wp:cNvGraphicFramePr>
+            <a:graphic xmlns:a="http://schemas.openxmlformats.org/drawingml/2006/main">
+              <a:graphicData uri="http://schemas.openxmlformats.org/drawingml/2006/picture">
+                <pic:pic xmlns:pic="http://schemas.openxmlformats.org/drawingml/2006/picture">
+                  <pic:nvPicPr>
+                    <pic:cNvPr id="0" name="Picture 28"/>
+                    <pic:cNvPicPr>
+                      <a:picLocks noChangeAspect="1" noChangeArrowheads="1"/>
+                    </pic:cNvPicPr>
+                  </pic:nvPicPr>
+                  <pic:blipFill>
+                    <a:blip r:embed="rId46">
+                      <a:extLst>
+                        <a:ext uri="{28A0092B-C50C-407E-A947-70E740481C1C}">
+                          <a14:useLocalDpi xmlns:a14="http://schemas.microsoft.com/office/drawing/2010/main" val="0"/>
+                        </a:ext>
+                      </a:extLst>
+                    </a:blip>
+                    <a:srcRect/>
+                    <a:stretch>
+                      <a:fillRect/>
+                    </a:stretch>
+                  </pic:blipFill>
+                  <pic:spPr bwMode="auto">
+                    <a:xfrm>
+                      <a:off x="0" y="0"/>
+                      <a:ext cx="5391785" cy="440055"/>
+                    </a:xfrm>
+                    <a:prstGeom prst="rect">
+                      <a:avLst/>
+                    </a:prstGeom>
+                    <a:noFill/>
+                    <a:ln>
+                      <a:noFill/>
+                    </a:ln>
+                  </pic:spPr>
+                </pic:pic>
+              </a:graphicData>
+            </a:graphic>
+          </wp:inline>
+        </w:drawing>
+      </w:r>
+    </w:p>
+    <w:p>
+      <w:pPr>
+        <w:spacing w:after="160" w:line="259" w:lineRule="auto"/>
+        <w:ind w:left="0"/>
+        <w:jc w:val="left"/>
+      </w:pPr>
+      <w:r>
+        <w:br w:type="page"/>
+      </w:r>
+    </w:p>
+    <w:p>
+      <w:pPr>
+        <w:pStyle w:val="Ttulo1"/>
+        <w:numPr>
+          <w:ilvl w:val="0"/>
+          <w:numId w:val="11"/>
+        </w:numPr>
+      </w:pPr>
+      <w:bookmarkStart w:id="23" w:name="_Toc242351571"/>
+      <w:r>
+        <w:lastRenderedPageBreak/>
+        <w:t>Limpieza de interfaces temporales y aislamiento de red</w:t>
+      </w:r>
+      <w:bookmarkEnd w:id="23"/>
+    </w:p>
+    <w:p>
+      <w:pPr>
+        <w:ind w:left="0"/>
+      </w:pPr>
+      <w:r>
+        <w:t>Para garantizar la máxima seguridad de la arquitectura de tres capas y cumplir con el diseño de red aislado, una vez finalizadas todas las instalaciones de software y configuraciones, se procede a eliminar las interfaces de red temporales que proveían acceso a internet desde el panel de virtualización.</w:t>
+      </w:r>
+    </w:p>
+    <w:p>
+      <w:pPr>
+        <w:pStyle w:val="Ttulo2"/>
+        <w:ind w:left="0"/>
+        <w:rPr>
+          <w:lang w:val="es"/>
+        </w:rPr>
+      </w:pPr>
+      <w:bookmarkStart w:id="24" w:name="_Toc242351572"/>
+      <w:r>
+        <w:t>Paso</w:t>
+      </w:r>
+      <w:r>
+        <w:t xml:space="preserve"> 1: </w:t>
+      </w:r>
+      <w:r>
+        <w:rPr>
+          <w:lang w:val="es"/>
+        </w:rPr>
+        <w:t>En la máquina virtual Server (</w:t>
+      </w:r>
+      <w:proofErr w:type="spellStart"/>
+      <w:r>
+        <w:rPr>
+          <w:lang w:val="es"/>
+        </w:rPr>
+        <w:t>Backend</w:t>
+      </w:r>
+      <w:proofErr w:type="spellEnd"/>
+      <w:r>
+        <w:rPr>
+          <w:lang w:val="es"/>
+        </w:rPr>
+        <w:t>)</w:t>
+      </w:r>
+      <w:bookmarkEnd w:id="24"/>
+    </w:p>
+    <w:p>
+      <w:pPr>
+        <w:spacing w:after="160" w:line="259" w:lineRule="auto"/>
+        <w:ind w:left="0"/>
+      </w:pPr>
+      <w:r>
+        <w:t>Se elimina la interfaz nic3 conectada a la red externa (DOC1), la cual había obtenido dinámicamente la IP 10.6.129.92. De esta manera, el servidor de aplicaciones queda comunicado exclusivamente a través de sus dos redes internas: DOCINT1 (hacia el Proxy Inverso) y DOCINT2 (hacia la Base de Datos).</w:t>
+      </w:r>
+    </w:p>
+    <w:p>
+      <w:pPr>
+        <w:spacing w:after="160" w:line="259" w:lineRule="auto"/>
+        <w:ind w:left="0"/>
+        <w:jc w:val="center"/>
+      </w:pPr>
+      <w:r>
+        <w:rPr>
+          <w:noProof/>
+        </w:rPr>
+        <w:drawing>
+          <wp:inline distT="0" distB="0" distL="0" distR="0" wp14:anchorId="7A69D0F9" wp14:editId="1085DCB2">
+            <wp:extent cx="2760345" cy="2673985"/>
+            <wp:effectExtent l="0" t="0" r="1905" b="0"/>
+            <wp:docPr id="50" name="Imagen 50"/>
+            <wp:cNvGraphicFramePr>
+              <a:graphicFrameLocks xmlns:a="http://schemas.openxmlformats.org/drawingml/2006/main" noChangeAspect="1"/>
+            </wp:cNvGraphicFramePr>
+            <a:graphic xmlns:a="http://schemas.openxmlformats.org/drawingml/2006/main">
+              <a:graphicData uri="http://schemas.openxmlformats.org/drawingml/2006/picture">
+                <pic:pic xmlns:pic="http://schemas.openxmlformats.org/drawingml/2006/picture">
+                  <pic:nvPicPr>
+                    <pic:cNvPr id="0" name="Picture 29"/>
+                    <pic:cNvPicPr>
+                      <a:picLocks noChangeAspect="1" noChangeArrowheads="1"/>
+                    </pic:cNvPicPr>
+                  </pic:nvPicPr>
+                  <pic:blipFill>
+                    <a:blip r:embed="rId47">
+                      <a:extLst>
+                        <a:ext uri="{28A0092B-C50C-407E-A947-70E740481C1C}">
+                          <a14:useLocalDpi xmlns:a14="http://schemas.microsoft.com/office/drawing/2010/main" val="0"/>
+                        </a:ext>
+                      </a:extLst>
+                    </a:blip>
+                    <a:srcRect/>
+                    <a:stretch>
+                      <a:fillRect/>
+                    </a:stretch>
+                  </pic:blipFill>
+                  <pic:spPr bwMode="auto">
+                    <a:xfrm>
+                      <a:off x="0" y="0"/>
+                      <a:ext cx="2760345" cy="2673985"/>
+                    </a:xfrm>
+                    <a:prstGeom prst="rect">
+                      <a:avLst/>
+                    </a:prstGeom>
+                    <a:noFill/>
+                    <a:ln>
+                      <a:noFill/>
+                    </a:ln>
+                  </pic:spPr>
+                </pic:pic>
+              </a:graphicData>
+            </a:graphic>
+          </wp:inline>
+        </w:drawing>
+      </w:r>
+    </w:p>
+    <w:p>
+      <w:pPr>
+        <w:spacing w:after="160" w:line="259" w:lineRule="auto"/>
+        <w:ind w:left="0"/>
+        <w:jc w:val="center"/>
+      </w:pPr>
+      <w:r>
+        <w:drawing>
+          <wp:inline distT="0" distB="0" distL="0" distR="0" wp14:anchorId="584BC4E2" wp14:editId="6DCD044A">
+            <wp:extent cx="2724530" cy="2095792"/>
+            <wp:effectExtent l="0" t="0" r="0" b="0"/>
+            <wp:docPr id="54" name="Imagen 54"/>
+            <wp:cNvGraphicFramePr>
+              <a:graphicFrameLocks xmlns:a="http://schemas.openxmlformats.org/drawingml/2006/main" noChangeAspect="1"/>
+            </wp:cNvGraphicFramePr>
+            <a:graphic xmlns:a="http://schemas.openxmlformats.org/drawingml/2006/main">
+              <a:graphicData uri="http://schemas.openxmlformats.org/drawingml/2006/picture">
+                <pic:pic xmlns:pic="http://schemas.openxmlformats.org/drawingml/2006/picture">
+                  <pic:nvPicPr>
+                    <pic:cNvPr id="1" name=""/>
+                    <pic:cNvPicPr/>
+                  </pic:nvPicPr>
+                  <pic:blipFill>
+                    <a:blip r:embed="rId48"/>
+                    <a:stretch>
+                      <a:fillRect/>
+                    </a:stretch>
+                  </pic:blipFill>
+                  <pic:spPr>
+                    <a:xfrm>
+                      <a:off x="0" y="0"/>
+                      <a:ext cx="2724530" cy="2095792"/>
+                    </a:xfrm>
+                    <a:prstGeom prst="rect">
+                      <a:avLst/>
+                    </a:prstGeom>
+                  </pic:spPr>
+                </pic:pic>
+              </a:graphicData>
+            </a:graphic>
+          </wp:inline>
+        </w:drawing>
+      </w:r>
+    </w:p>
+    <w:p>
+      <w:pPr>
+        <w:spacing w:after="160" w:line="259" w:lineRule="auto"/>
+        <w:ind w:left="0"/>
+        <w:jc w:val="center"/>
+      </w:pPr>
+    </w:p>
+    <w:p>
+      <w:pPr>
+        <w:spacing w:after="160" w:line="259" w:lineRule="auto"/>
+        <w:ind w:left="0"/>
+        <w:jc w:val="left"/>
+        <w:rPr>
+          <w:rFonts w:ascii="Montserrat Medium" w:eastAsiaTheme="majorEastAsia" w:hAnsi="Montserrat Medium" w:cstheme="majorBidi"/>
+          <w:kern w:val="2"/>
+          <w:sz w:val="24"/>
+          <w:szCs w:val="32"/>
+          <w:lang w:val="es-ES" w:eastAsia="en-US"/>
+          <w14:ligatures w14:val="standardContextual"/>
+        </w:rPr>
+      </w:pPr>
+      <w:r>
+        <w:br w:type="page"/>
+      </w:r>
+    </w:p>
+    <w:p>
+      <w:pPr>
+        <w:pStyle w:val="Ttulo2"/>
+        <w:ind w:left="0"/>
+        <w:rPr>
+          <w:lang w:val="es"/>
+        </w:rPr>
+      </w:pPr>
+      <w:bookmarkStart w:id="25" w:name="_Toc242351573"/>
+      <w:r>
+        <w:lastRenderedPageBreak/>
+        <w:t>Paso</w:t>
+      </w:r>
+      <w:r>
+        <w:t xml:space="preserve"> </w:t>
+      </w:r>
+      <w:r>
+        <w:t>2</w:t>
+      </w:r>
+      <w:r>
+        <w:t xml:space="preserve">: </w:t>
+      </w:r>
+      <w:r>
+        <w:rPr>
+          <w:lang w:val="es"/>
+        </w:rPr>
+        <w:t>En la máquina virtual de Base de Datos</w:t>
+      </w:r>
+      <w:bookmarkEnd w:id="25"/>
+    </w:p>
+    <w:p>
+      <w:pPr>
+        <w:spacing w:after="160" w:line="259" w:lineRule="auto"/>
+        <w:ind w:left="0"/>
+      </w:pPr>
+      <w:r>
+        <w:t xml:space="preserve">Se elimina la interfaz nic2 conectada a la red externa (DOC1), que contaba con la IP 10.6.129.90. El servidor de base de datos queda así totalmente aislado del exterior y protegido, siendo accesible de forma exclusiva desde el </w:t>
+      </w:r>
+      <w:proofErr w:type="spellStart"/>
+      <w:r>
+        <w:t>Backend</w:t>
+      </w:r>
+      <w:proofErr w:type="spellEnd"/>
+      <w:r>
+        <w:t xml:space="preserve"> a través de la red interna DOCINT2 mediante su IP estática 172.16.157.2.</w:t>
+      </w:r>
+    </w:p>
+    <w:p>
+      <w:pPr>
+        <w:spacing w:after="160" w:line="259" w:lineRule="auto"/>
+        <w:ind w:left="0"/>
+        <w:jc w:val="center"/>
+      </w:pPr>
+      <w:r>
+        <w:rPr>
+          <w:noProof/>
+        </w:rPr>
+        <w:drawing>
+          <wp:inline distT="0" distB="0" distL="0" distR="0" wp14:anchorId="5F2603FA" wp14:editId="466B4E0D">
+            <wp:extent cx="2820670" cy="2199640"/>
+            <wp:effectExtent l="0" t="0" r="0" b="0"/>
+            <wp:docPr id="51" name="Imagen 51"/>
+            <wp:cNvGraphicFramePr>
+              <a:graphicFrameLocks xmlns:a="http://schemas.openxmlformats.org/drawingml/2006/main" noChangeAspect="1"/>
+            </wp:cNvGraphicFramePr>
+            <a:graphic xmlns:a="http://schemas.openxmlformats.org/drawingml/2006/main">
+              <a:graphicData uri="http://schemas.openxmlformats.org/drawingml/2006/picture">
+                <pic:pic xmlns:pic="http://schemas.openxmlformats.org/drawingml/2006/picture">
+                  <pic:nvPicPr>
+                    <pic:cNvPr id="0" name="Picture 30"/>
+                    <pic:cNvPicPr>
+                      <a:picLocks noChangeAspect="1" noChangeArrowheads="1"/>
+                    </pic:cNvPicPr>
+                  </pic:nvPicPr>
+                  <pic:blipFill>
+                    <a:blip r:embed="rId49">
+                      <a:extLst>
+                        <a:ext uri="{28A0092B-C50C-407E-A947-70E740481C1C}">
+                          <a14:useLocalDpi xmlns:a14="http://schemas.microsoft.com/office/drawing/2010/main" val="0"/>
+                        </a:ext>
+                      </a:extLst>
+                    </a:blip>
+                    <a:srcRect/>
+                    <a:stretch>
+                      <a:fillRect/>
+                    </a:stretch>
+                  </pic:blipFill>
+                  <pic:spPr bwMode="auto">
+                    <a:xfrm>
+                      <a:off x="0" y="0"/>
+                      <a:ext cx="2820670" cy="2199640"/>
+                    </a:xfrm>
+                    <a:prstGeom prst="rect">
+                      <a:avLst/>
+                    </a:prstGeom>
+                    <a:noFill/>
+                    <a:ln>
+                      <a:noFill/>
+                    </a:ln>
+                  </pic:spPr>
+                </pic:pic>
+              </a:graphicData>
+            </a:graphic>
+          </wp:inline>
+        </w:drawing>
+      </w:r>
+    </w:p>
+    <w:p>
+      <w:pPr>
+        <w:spacing w:after="160" w:line="259" w:lineRule="auto"/>
+        <w:ind w:left="0"/>
+        <w:jc w:val="center"/>
+      </w:pPr>
+      <w:r>
+        <w:rPr>
+          <w:noProof/>
+          <w14:ligatures w14:val="standardContextual"/>
+        </w:rPr>
+        <w:t xml:space="preserve"> </w:t>
+      </w:r>
+      <w:r>
+        <w:drawing>
+          <wp:inline distT="0" distB="0" distL="0" distR="0" wp14:anchorId="79822424" wp14:editId="10B183B3">
+            <wp:extent cx="2762636" cy="1952898"/>
+            <wp:effectExtent l="0" t="0" r="0" b="9525"/>
+            <wp:docPr id="53" name="Imagen 53"/>
+            <wp:cNvGraphicFramePr>
+              <a:graphicFrameLocks xmlns:a="http://schemas.openxmlformats.org/drawingml/2006/main" noChangeAspect="1"/>
+            </wp:cNvGraphicFramePr>
+            <a:graphic xmlns:a="http://schemas.openxmlformats.org/drawingml/2006/main">
+              <a:graphicData uri="http://schemas.openxmlformats.org/drawingml/2006/picture">
+                <pic:pic xmlns:pic="http://schemas.openxmlformats.org/drawingml/2006/picture">
+                  <pic:nvPicPr>
+                    <pic:cNvPr id="1" name=""/>
+                    <pic:cNvPicPr/>
+                  </pic:nvPicPr>
+                  <pic:blipFill>
+                    <a:blip r:embed="rId50"/>
+                    <a:stretch>
+                      <a:fillRect/>
+                    </a:stretch>
+                  </pic:blipFill>
+                  <pic:spPr>
+                    <a:xfrm>
+                      <a:off x="0" y="0"/>
+                      <a:ext cx="2762636" cy="1952898"/>
+                    </a:xfrm>
+                    <a:prstGeom prst="rect">
+                      <a:avLst/>
+                    </a:prstGeom>
+                  </pic:spPr>
+                </pic:pic>
+              </a:graphicData>
+            </a:graphic>
+          </wp:inline>
+        </w:drawing>
+      </w:r>
     </w:p>
     <w:sectPr>
-      <w:headerReference w:type="default" r:id="rId27"/>
-      <w:headerReference w:type="first" r:id="rId28"/>
+      <w:headerReference w:type="default" r:id="rId51"/>
+      <w:headerReference w:type="first" r:id="rId52"/>
       <w:pgSz w:w="11906" w:h="16838"/>
       <w:pgMar w:top="1417" w:right="1701" w:bottom="1417" w:left="1701" w:header="708" w:footer="708" w:gutter="0"/>
       <w:cols w:space="708"/>
@@ -4370,6 +7553,95 @@
     </w:lvl>
   </w:abstractNum>
   <w:abstractNum w:abstractNumId="1" w15:restartNumberingAfterBreak="0">
+    <w:nsid w:val="13317E7B"/>
+    <w:multiLevelType w:val="hybridMultilevel"/>
+    <w:tmpl w:val="F8A8D2E8"/>
+    <w:lvl w:ilvl="0" w:tplc="FFFFFFFF">
+      <w:start w:val="1"/>
+      <w:numFmt w:val="decimal"/>
+      <w:lvlText w:val="%1."/>
+      <w:lvlJc w:val="left"/>
+      <w:pPr>
+        <w:ind w:left="720" w:hanging="360"/>
+      </w:pPr>
+      <w:rPr>
+        <w:rFonts w:hint="default"/>
+      </w:rPr>
+    </w:lvl>
+    <w:lvl w:ilvl="1" w:tplc="FFFFFFFF" w:tentative="1">
+      <w:start w:val="1"/>
+      <w:numFmt w:val="lowerLetter"/>
+      <w:lvlText w:val="%2."/>
+      <w:lvlJc w:val="left"/>
+      <w:pPr>
+        <w:ind w:left="1440" w:hanging="360"/>
+      </w:pPr>
+    </w:lvl>
+    <w:lvl w:ilvl="2" w:tplc="FFFFFFFF" w:tentative="1">
+      <w:start w:val="1"/>
+      <w:numFmt w:val="lowerRoman"/>
+      <w:lvlText w:val="%3."/>
+      <w:lvlJc w:val="right"/>
+      <w:pPr>
+        <w:ind w:left="2160" w:hanging="180"/>
+      </w:pPr>
+    </w:lvl>
+    <w:lvl w:ilvl="3" w:tplc="FFFFFFFF" w:tentative="1">
+      <w:start w:val="1"/>
+      <w:numFmt w:val="decimal"/>
+      <w:lvlText w:val="%4."/>
+      <w:lvlJc w:val="left"/>
+      <w:pPr>
+        <w:ind w:left="2880" w:hanging="360"/>
+      </w:pPr>
+    </w:lvl>
+    <w:lvl w:ilvl="4" w:tplc="FFFFFFFF" w:tentative="1">
+      <w:start w:val="1"/>
+      <w:numFmt w:val="lowerLetter"/>
+      <w:lvlText w:val="%5."/>
+      <w:lvlJc w:val="left"/>
+      <w:pPr>
+        <w:ind w:left="3600" w:hanging="360"/>
+      </w:pPr>
+    </w:lvl>
+    <w:lvl w:ilvl="5" w:tplc="FFFFFFFF" w:tentative="1">
+      <w:start w:val="1"/>
+      <w:numFmt w:val="lowerRoman"/>
+      <w:lvlText w:val="%6."/>
+      <w:lvlJc w:val="right"/>
+      <w:pPr>
+        <w:ind w:left="4320" w:hanging="180"/>
+      </w:pPr>
+    </w:lvl>
+    <w:lvl w:ilvl="6" w:tplc="FFFFFFFF" w:tentative="1">
+      <w:start w:val="1"/>
+      <w:numFmt w:val="decimal"/>
+      <w:lvlText w:val="%7."/>
+      <w:lvlJc w:val="left"/>
+      <w:pPr>
+        <w:ind w:left="5040" w:hanging="360"/>
+      </w:pPr>
+    </w:lvl>
+    <w:lvl w:ilvl="7" w:tplc="FFFFFFFF" w:tentative="1">
+      <w:start w:val="1"/>
+      <w:numFmt w:val="lowerLetter"/>
+      <w:lvlText w:val="%8."/>
+      <w:lvlJc w:val="left"/>
+      <w:pPr>
+        <w:ind w:left="5760" w:hanging="360"/>
+      </w:pPr>
+    </w:lvl>
+    <w:lvl w:ilvl="8" w:tplc="FFFFFFFF" w:tentative="1">
+      <w:start w:val="1"/>
+      <w:numFmt w:val="lowerRoman"/>
+      <w:lvlText w:val="%9."/>
+      <w:lvlJc w:val="right"/>
+      <w:pPr>
+        <w:ind w:left="6480" w:hanging="180"/>
+      </w:pPr>
+    </w:lvl>
+  </w:abstractNum>
+  <w:abstractNum w:abstractNumId="2" w15:restartNumberingAfterBreak="0">
     <w:nsid w:val="17CF1D92"/>
     <w:multiLevelType w:val="multilevel"/>
     <w:tmpl w:val="4A040E26"/>
@@ -4518,7 +7790,7 @@
       </w:rPr>
     </w:lvl>
   </w:abstractNum>
-  <w:abstractNum w:abstractNumId="2" w15:restartNumberingAfterBreak="0">
+  <w:abstractNum w:abstractNumId="3" w15:restartNumberingAfterBreak="0">
     <w:nsid w:val="196B64B8"/>
     <w:multiLevelType w:val="hybridMultilevel"/>
     <w:tmpl w:val="F8A8D2E8"/>
@@ -4607,7 +7879,7 @@
       </w:pPr>
     </w:lvl>
   </w:abstractNum>
-  <w:abstractNum w:abstractNumId="3" w15:restartNumberingAfterBreak="0">
+  <w:abstractNum w:abstractNumId="4" w15:restartNumberingAfterBreak="0">
     <w:nsid w:val="1B76315A"/>
     <w:multiLevelType w:val="multilevel"/>
     <w:tmpl w:val="310C03D4"/>
@@ -4756,7 +8028,7 @@
       </w:rPr>
     </w:lvl>
   </w:abstractNum>
-  <w:abstractNum w:abstractNumId="4" w15:restartNumberingAfterBreak="0">
+  <w:abstractNum w:abstractNumId="5" w15:restartNumberingAfterBreak="0">
     <w:nsid w:val="250B5AFF"/>
     <w:multiLevelType w:val="multilevel"/>
     <w:tmpl w:val="3FCE56A4"/>
@@ -4905,7 +8177,7 @@
       </w:rPr>
     </w:lvl>
   </w:abstractNum>
-  <w:abstractNum w:abstractNumId="5" w15:restartNumberingAfterBreak="0">
+  <w:abstractNum w:abstractNumId="6" w15:restartNumberingAfterBreak="0">
     <w:nsid w:val="25A97CAB"/>
     <w:multiLevelType w:val="hybridMultilevel"/>
     <w:tmpl w:val="756C3D04"/>
@@ -4994,7 +8266,7 @@
       </w:pPr>
     </w:lvl>
   </w:abstractNum>
-  <w:abstractNum w:abstractNumId="6" w15:restartNumberingAfterBreak="0">
+  <w:abstractNum w:abstractNumId="7" w15:restartNumberingAfterBreak="0">
     <w:nsid w:val="2A4847F5"/>
     <w:multiLevelType w:val="multilevel"/>
     <w:tmpl w:val="74125E48"/>
@@ -5143,7 +8415,7 @@
       </w:rPr>
     </w:lvl>
   </w:abstractNum>
-  <w:abstractNum w:abstractNumId="7" w15:restartNumberingAfterBreak="0">
+  <w:abstractNum w:abstractNumId="8" w15:restartNumberingAfterBreak="0">
     <w:nsid w:val="2C8529BC"/>
     <w:multiLevelType w:val="hybridMultilevel"/>
     <w:tmpl w:val="756C3D04"/>
@@ -5232,7 +8504,7 @@
       </w:pPr>
     </w:lvl>
   </w:abstractNum>
-  <w:abstractNum w:abstractNumId="8" w15:restartNumberingAfterBreak="0">
+  <w:abstractNum w:abstractNumId="9" w15:restartNumberingAfterBreak="0">
     <w:nsid w:val="41AC14B4"/>
     <w:multiLevelType w:val="hybridMultilevel"/>
     <w:tmpl w:val="756C3D04"/>
@@ -5321,7 +8593,7 @@
       </w:pPr>
     </w:lvl>
   </w:abstractNum>
-  <w:abstractNum w:abstractNumId="9" w15:restartNumberingAfterBreak="0">
+  <w:abstractNum w:abstractNumId="10" w15:restartNumberingAfterBreak="0">
     <w:nsid w:val="42737BC9"/>
     <w:multiLevelType w:val="hybridMultilevel"/>
     <w:tmpl w:val="756C3D04"/>
@@ -5410,7 +8682,7 @@
       </w:pPr>
     </w:lvl>
   </w:abstractNum>
-  <w:abstractNum w:abstractNumId="10" w15:restartNumberingAfterBreak="0">
+  <w:abstractNum w:abstractNumId="11" w15:restartNumberingAfterBreak="0">
     <w:nsid w:val="4A277EBF"/>
     <w:multiLevelType w:val="multilevel"/>
     <w:tmpl w:val="651A13A8"/>
@@ -5559,7 +8831,7 @@
       </w:rPr>
     </w:lvl>
   </w:abstractNum>
-  <w:abstractNum w:abstractNumId="11" w15:restartNumberingAfterBreak="0">
+  <w:abstractNum w:abstractNumId="12" w15:restartNumberingAfterBreak="0">
     <w:nsid w:val="4E2E76A6"/>
     <w:multiLevelType w:val="multilevel"/>
     <w:tmpl w:val="756C3D04"/>
@@ -5649,7 +8921,7 @@
       </w:pPr>
     </w:lvl>
   </w:abstractNum>
-  <w:abstractNum w:abstractNumId="12" w15:restartNumberingAfterBreak="0">
+  <w:abstractNum w:abstractNumId="13" w15:restartNumberingAfterBreak="0">
     <w:nsid w:val="50674A31"/>
     <w:multiLevelType w:val="multilevel"/>
     <w:tmpl w:val="E5A80976"/>
@@ -5798,7 +9070,7 @@
       </w:rPr>
     </w:lvl>
   </w:abstractNum>
-  <w:abstractNum w:abstractNumId="13" w15:restartNumberingAfterBreak="0">
+  <w:abstractNum w:abstractNumId="14" w15:restartNumberingAfterBreak="0">
     <w:nsid w:val="518E6B5F"/>
     <w:multiLevelType w:val="hybridMultilevel"/>
     <w:tmpl w:val="F8A8D2E8"/>
@@ -5887,7 +9159,7 @@
       </w:pPr>
     </w:lvl>
   </w:abstractNum>
-  <w:abstractNum w:abstractNumId="14" w15:restartNumberingAfterBreak="0">
+  <w:abstractNum w:abstractNumId="15" w15:restartNumberingAfterBreak="0">
     <w:nsid w:val="519C1E37"/>
     <w:multiLevelType w:val="multilevel"/>
     <w:tmpl w:val="A4388C64"/>
@@ -6036,7 +9308,7 @@
       </w:rPr>
     </w:lvl>
   </w:abstractNum>
-  <w:abstractNum w:abstractNumId="15" w15:restartNumberingAfterBreak="0">
+  <w:abstractNum w:abstractNumId="16" w15:restartNumberingAfterBreak="0">
     <w:nsid w:val="62646A90"/>
     <w:multiLevelType w:val="multilevel"/>
     <w:tmpl w:val="AE903512"/>
@@ -6185,7 +9457,7 @@
       </w:rPr>
     </w:lvl>
   </w:abstractNum>
-  <w:abstractNum w:abstractNumId="16" w15:restartNumberingAfterBreak="0">
+  <w:abstractNum w:abstractNumId="17" w15:restartNumberingAfterBreak="0">
     <w:nsid w:val="64416E88"/>
     <w:multiLevelType w:val="hybridMultilevel"/>
     <w:tmpl w:val="756C3D04"/>
@@ -6274,7 +9546,7 @@
       </w:pPr>
     </w:lvl>
   </w:abstractNum>
-  <w:abstractNum w:abstractNumId="17" w15:restartNumberingAfterBreak="0">
+  <w:abstractNum w:abstractNumId="18" w15:restartNumberingAfterBreak="0">
     <w:nsid w:val="73F24A1A"/>
     <w:multiLevelType w:val="hybridMultilevel"/>
     <w:tmpl w:val="F8A8D2E8"/>
@@ -6364,58 +9636,61 @@
     </w:lvl>
   </w:abstractNum>
   <w:num w:numId="1" w16cid:durableId="515771326">
-    <w:abstractNumId w:val="14"/>
+    <w:abstractNumId w:val="15"/>
   </w:num>
   <w:num w:numId="2" w16cid:durableId="542718523">
-    <w:abstractNumId w:val="4"/>
+    <w:abstractNumId w:val="5"/>
   </w:num>
   <w:num w:numId="3" w16cid:durableId="846941253">
-    <w:abstractNumId w:val="16"/>
+    <w:abstractNumId w:val="17"/>
   </w:num>
   <w:num w:numId="4" w16cid:durableId="447313891">
+    <w:abstractNumId w:val="10"/>
+  </w:num>
+  <w:num w:numId="5" w16cid:durableId="146213896">
+    <w:abstractNumId w:val="6"/>
+  </w:num>
+  <w:num w:numId="6" w16cid:durableId="2124952983">
+    <w:abstractNumId w:val="12"/>
+  </w:num>
+  <w:num w:numId="7" w16cid:durableId="997616244">
+    <w:abstractNumId w:val="8"/>
+  </w:num>
+  <w:num w:numId="8" w16cid:durableId="2107383776">
     <w:abstractNumId w:val="9"/>
   </w:num>
-  <w:num w:numId="5" w16cid:durableId="146213896">
-    <w:abstractNumId w:val="5"/>
-  </w:num>
-  <w:num w:numId="6" w16cid:durableId="2124952983">
-    <w:abstractNumId w:val="11"/>
-  </w:num>
-  <w:num w:numId="7" w16cid:durableId="997616244">
+  <w:num w:numId="9" w16cid:durableId="798454432">
     <w:abstractNumId w:val="7"/>
-  </w:num>
-  <w:num w:numId="8" w16cid:durableId="2107383776">
-    <w:abstractNumId w:val="8"/>
-  </w:num>
-  <w:num w:numId="9" w16cid:durableId="798454432">
-    <w:abstractNumId w:val="6"/>
   </w:num>
   <w:num w:numId="10" w16cid:durableId="700669975">
     <w:abstractNumId w:val="0"/>
   </w:num>
   <w:num w:numId="11" w16cid:durableId="1822034867">
+    <w:abstractNumId w:val="14"/>
+  </w:num>
+  <w:num w:numId="12" w16cid:durableId="390932176">
     <w:abstractNumId w:val="13"/>
   </w:num>
-  <w:num w:numId="12" w16cid:durableId="390932176">
-    <w:abstractNumId w:val="12"/>
-  </w:num>
   <w:num w:numId="13" w16cid:durableId="2117867398">
-    <w:abstractNumId w:val="17"/>
+    <w:abstractNumId w:val="18"/>
   </w:num>
   <w:num w:numId="14" w16cid:durableId="955333856">
-    <w:abstractNumId w:val="15"/>
+    <w:abstractNumId w:val="16"/>
   </w:num>
   <w:num w:numId="15" w16cid:durableId="966204407">
+    <w:abstractNumId w:val="3"/>
+  </w:num>
+  <w:num w:numId="16" w16cid:durableId="93282674">
     <w:abstractNumId w:val="2"/>
   </w:num>
-  <w:num w:numId="16" w16cid:durableId="93282674">
-    <w:abstractNumId w:val="1"/>
-  </w:num>
   <w:num w:numId="17" w16cid:durableId="1245800432">
-    <w:abstractNumId w:val="10"/>
+    <w:abstractNumId w:val="11"/>
   </w:num>
   <w:num w:numId="18" w16cid:durableId="468518847">
-    <w:abstractNumId w:val="3"/>
+    <w:abstractNumId w:val="4"/>
+  </w:num>
+  <w:num w:numId="19" w16cid:durableId="322466215">
+    <w:abstractNumId w:val="1"/>
   </w:num>
 </w:numbering>
 </file>

</xml_diff>